<commit_message>
Added .gitignore file and updated wbs.draw.io, folder structure managed, file remaned
</commit_message>
<xml_diff>
--- a/Report/zerowaste_business_plan.docx
+++ b/Report/zerowaste_business_plan.docx
@@ -8,7 +8,7 @@
         <w:ind w:left="720" w:hanging="360"/>
         <w:jc w:val="center"/>
         <w:rPr>
-          <w:rFonts w:ascii="Times New Roman" w:hAnsi="Times New Roman" w:cs="Times New Roman"/>
+          <w:rFonts w:cs="Times New Roman"/>
           <w:b/>
           <w:bCs/>
           <w:sz w:val="32"/>
@@ -22,7 +22,7 @@
         <w:ind w:left="720" w:hanging="360"/>
         <w:jc w:val="center"/>
         <w:rPr>
-          <w:rFonts w:ascii="Times New Roman" w:hAnsi="Times New Roman" w:cs="Times New Roman"/>
+          <w:rFonts w:cs="Times New Roman"/>
           <w:b/>
           <w:bCs/>
           <w:sz w:val="32"/>
@@ -36,7 +36,7 @@
         <w:ind w:left="720" w:hanging="360"/>
         <w:jc w:val="center"/>
         <w:rPr>
-          <w:rFonts w:ascii="Times New Roman" w:hAnsi="Times New Roman" w:cs="Times New Roman"/>
+          <w:rFonts w:cs="Times New Roman"/>
           <w:b/>
           <w:bCs/>
           <w:sz w:val="32"/>
@@ -50,7 +50,7 @@
         <w:ind w:left="720" w:hanging="360"/>
         <w:jc w:val="center"/>
         <w:rPr>
-          <w:rFonts w:ascii="Times New Roman" w:hAnsi="Times New Roman" w:cs="Times New Roman"/>
+          <w:rFonts w:cs="Times New Roman"/>
           <w:b/>
           <w:bCs/>
           <w:sz w:val="32"/>
@@ -64,7 +64,7 @@
         <w:ind w:left="720" w:hanging="360"/>
         <w:jc w:val="center"/>
         <w:rPr>
-          <w:rFonts w:ascii="Times New Roman" w:hAnsi="Times New Roman" w:cs="Times New Roman"/>
+          <w:rFonts w:cs="Times New Roman"/>
           <w:b/>
           <w:bCs/>
           <w:sz w:val="32"/>
@@ -73,7 +73,7 @@
       </w:pPr>
       <w:r>
         <w:rPr>
-          <w:rFonts w:ascii="Times New Roman" w:hAnsi="Times New Roman" w:cs="Times New Roman"/>
+          <w:rFonts w:cs="Times New Roman"/>
           <w:b/>
           <w:bCs/>
           <w:sz w:val="32"/>
@@ -83,7 +83,7 @@
       </w:r>
       <w:r>
         <w:rPr>
-          <w:rFonts w:ascii="Times New Roman" w:hAnsi="Times New Roman" w:cs="Times New Roman"/>
+          <w:rFonts w:cs="Times New Roman"/>
           <w:b/>
           <w:bCs/>
           <w:sz w:val="32"/>
@@ -93,7 +93,7 @@
       </w:r>
       <w:r>
         <w:rPr>
-          <w:rFonts w:ascii="Times New Roman" w:hAnsi="Times New Roman" w:cs="Times New Roman"/>
+          <w:rFonts w:cs="Times New Roman"/>
           <w:b/>
           <w:bCs/>
           <w:sz w:val="32"/>
@@ -106,7 +106,7 @@
       <w:pPr>
         <w:spacing w:before="240" w:line="360" w:lineRule="auto"/>
         <w:rPr>
-          <w:rFonts w:ascii="Times New Roman" w:hAnsi="Times New Roman" w:cs="Times New Roman"/>
+          <w:rFonts w:cs="Times New Roman"/>
           <w:b/>
           <w:bCs/>
           <w:sz w:val="32"/>
@@ -115,7 +115,7 @@
       </w:pPr>
       <w:r>
         <w:rPr>
-          <w:rFonts w:ascii="Times New Roman" w:hAnsi="Times New Roman" w:cs="Times New Roman"/>
+          <w:rFonts w:cs="Times New Roman"/>
           <w:b/>
           <w:bCs/>
           <w:sz w:val="32"/>
@@ -139,16 +139,14 @@
         <w:spacing w:before="240" w:line="360" w:lineRule="auto"/>
         <w:jc w:val="both"/>
         <w:rPr>
-          <w:rFonts w:ascii="Times New Roman" w:hAnsi="Times New Roman" w:cs="Times New Roman"/>
-          <w:sz w:val="24"/>
+          <w:rFonts w:cs="Times New Roman"/>
           <w:szCs w:val="24"/>
           <w:shd w:val="clear" w:color="auto" w:fill="FFFFFF"/>
         </w:rPr>
       </w:pPr>
       <w:r>
         <w:rPr>
-          <w:rFonts w:ascii="Times New Roman" w:hAnsi="Times New Roman" w:cs="Times New Roman"/>
-          <w:sz w:val="24"/>
+          <w:rFonts w:cs="Times New Roman"/>
           <w:szCs w:val="24"/>
           <w:shd w:val="clear" w:color="auto" w:fill="FFFFFF"/>
         </w:rPr>
@@ -157,10 +155,9 @@
       <w:r>
         <w:rPr>
           <w:rStyle w:val="Strong"/>
-          <w:rFonts w:ascii="Times New Roman" w:hAnsi="Times New Roman" w:cs="Times New Roman"/>
+          <w:rFonts w:cs="Times New Roman"/>
           <w:b w:val="0"/>
           <w:bCs w:val="0"/>
-          <w:sz w:val="24"/>
           <w:szCs w:val="24"/>
           <w:shd w:val="clear" w:color="auto" w:fill="FFFFFF"/>
         </w:rPr>
@@ -168,8 +165,7 @@
       </w:r>
       <w:r>
         <w:rPr>
-          <w:rFonts w:ascii="Times New Roman" w:hAnsi="Times New Roman" w:cs="Times New Roman"/>
-          <w:sz w:val="24"/>
+          <w:rFonts w:cs="Times New Roman"/>
           <w:szCs w:val="24"/>
           <w:shd w:val="clear" w:color="auto" w:fill="FFFFFF"/>
         </w:rPr>
@@ -177,8 +173,7 @@
       </w:r>
       <w:r>
         <w:rPr>
-          <w:rFonts w:ascii="Times New Roman" w:hAnsi="Times New Roman" w:cs="Times New Roman"/>
-          <w:sz w:val="24"/>
+          <w:rFonts w:cs="Times New Roman"/>
           <w:szCs w:val="24"/>
           <w:shd w:val="clear" w:color="auto" w:fill="FFFFFF"/>
         </w:rPr>
@@ -186,8 +181,7 @@
       </w:r>
       <w:r>
         <w:rPr>
-          <w:rFonts w:ascii="Times New Roman" w:hAnsi="Times New Roman" w:cs="Times New Roman"/>
-          <w:sz w:val="24"/>
+          <w:rFonts w:cs="Times New Roman"/>
           <w:szCs w:val="24"/>
           <w:shd w:val="clear" w:color="auto" w:fill="FFFFFF"/>
         </w:rPr>
@@ -195,8 +189,7 @@
       </w:r>
       <w:r>
         <w:rPr>
-          <w:rFonts w:ascii="Times New Roman" w:hAnsi="Times New Roman" w:cs="Times New Roman"/>
-          <w:sz w:val="24"/>
+          <w:rFonts w:cs="Times New Roman"/>
           <w:szCs w:val="24"/>
           <w:shd w:val="clear" w:color="auto" w:fill="FFFFFF"/>
         </w:rPr>
@@ -204,8 +197,7 @@
       </w:r>
       <w:r>
         <w:rPr>
-          <w:rFonts w:ascii="Times New Roman" w:hAnsi="Times New Roman" w:cs="Times New Roman"/>
-          <w:sz w:val="24"/>
+          <w:rFonts w:cs="Times New Roman"/>
           <w:szCs w:val="24"/>
           <w:shd w:val="clear" w:color="auto" w:fill="FFFFFF"/>
         </w:rPr>
@@ -213,8 +205,7 @@
       </w:r>
       <w:r>
         <w:rPr>
-          <w:rFonts w:ascii="Times New Roman" w:hAnsi="Times New Roman" w:cs="Times New Roman"/>
-          <w:sz w:val="24"/>
+          <w:rFonts w:cs="Times New Roman"/>
           <w:szCs w:val="24"/>
           <w:shd w:val="clear" w:color="auto" w:fill="FFFFFF"/>
         </w:rPr>
@@ -222,8 +213,7 @@
       </w:r>
       <w:r>
         <w:rPr>
-          <w:rFonts w:ascii="Times New Roman" w:hAnsi="Times New Roman" w:cs="Times New Roman"/>
-          <w:sz w:val="24"/>
+          <w:rFonts w:cs="Times New Roman"/>
           <w:szCs w:val="24"/>
           <w:shd w:val="clear" w:color="auto" w:fill="FFFFFF"/>
         </w:rPr>
@@ -232,8 +222,7 @@
       <w:sdt>
         <w:sdtPr>
           <w:rPr>
-            <w:rFonts w:ascii="Times New Roman" w:hAnsi="Times New Roman" w:cs="Times New Roman"/>
-            <w:sz w:val="24"/>
+            <w:rFonts w:cs="Times New Roman"/>
             <w:szCs w:val="24"/>
             <w:shd w:val="clear" w:color="auto" w:fill="FFFFFF"/>
           </w:rPr>
@@ -243,8 +232,7 @@
         <w:sdtContent>
           <w:r>
             <w:rPr>
-              <w:rFonts w:ascii="Times New Roman" w:hAnsi="Times New Roman" w:cs="Times New Roman"/>
-              <w:sz w:val="24"/>
+              <w:rFonts w:cs="Times New Roman"/>
               <w:szCs w:val="24"/>
               <w:shd w:val="clear" w:color="auto" w:fill="FFFFFF"/>
             </w:rPr>
@@ -252,8 +240,7 @@
           </w:r>
           <w:r>
             <w:rPr>
-              <w:rFonts w:ascii="Times New Roman" w:hAnsi="Times New Roman" w:cs="Times New Roman"/>
-              <w:sz w:val="24"/>
+              <w:rFonts w:cs="Times New Roman"/>
               <w:szCs w:val="24"/>
               <w:shd w:val="clear" w:color="auto" w:fill="FFFFFF"/>
               <w:lang w:val="en-US"/>
@@ -262,8 +249,7 @@
           </w:r>
           <w:r>
             <w:rPr>
-              <w:rFonts w:ascii="Times New Roman" w:hAnsi="Times New Roman" w:cs="Times New Roman"/>
-              <w:sz w:val="24"/>
+              <w:rFonts w:cs="Times New Roman"/>
               <w:szCs w:val="24"/>
               <w:shd w:val="clear" w:color="auto" w:fill="FFFFFF"/>
             </w:rPr>
@@ -271,9 +257,8 @@
           </w:r>
           <w:r>
             <w:rPr>
-              <w:rFonts w:ascii="Times New Roman" w:hAnsi="Times New Roman" w:cs="Times New Roman"/>
+              <w:rFonts w:cs="Times New Roman"/>
               <w:noProof/>
-              <w:sz w:val="24"/>
               <w:szCs w:val="24"/>
               <w:shd w:val="clear" w:color="auto" w:fill="FFFFFF"/>
             </w:rPr>
@@ -281,9 +266,8 @@
           </w:r>
           <w:r>
             <w:rPr>
-              <w:rFonts w:ascii="Times New Roman" w:hAnsi="Times New Roman" w:cs="Times New Roman"/>
+              <w:rFonts w:cs="Times New Roman"/>
               <w:noProof/>
-              <w:sz w:val="24"/>
               <w:szCs w:val="24"/>
               <w:shd w:val="clear" w:color="auto" w:fill="FFFFFF"/>
             </w:rPr>
@@ -291,8 +275,7 @@
           </w:r>
           <w:r>
             <w:rPr>
-              <w:rFonts w:ascii="Times New Roman" w:hAnsi="Times New Roman" w:cs="Times New Roman"/>
-              <w:sz w:val="24"/>
+              <w:rFonts w:cs="Times New Roman"/>
               <w:szCs w:val="24"/>
               <w:shd w:val="clear" w:color="auto" w:fill="FFFFFF"/>
             </w:rPr>
@@ -302,8 +285,7 @@
       </w:sdt>
       <w:r>
         <w:rPr>
-          <w:rFonts w:ascii="Times New Roman" w:hAnsi="Times New Roman" w:cs="Times New Roman"/>
-          <w:sz w:val="24"/>
+          <w:rFonts w:cs="Times New Roman"/>
           <w:szCs w:val="24"/>
           <w:shd w:val="clear" w:color="auto" w:fill="FFFFFF"/>
         </w:rPr>
@@ -315,87 +297,76 @@
         <w:spacing w:before="240" w:line="360" w:lineRule="auto"/>
         <w:jc w:val="both"/>
         <w:rPr>
-          <w:rFonts w:ascii="Times New Roman" w:hAnsi="Times New Roman" w:cs="Times New Roman"/>
-          <w:sz w:val="24"/>
-          <w:szCs w:val="24"/>
-        </w:rPr>
-      </w:pPr>
-      <w:r>
-        <w:rPr>
-          <w:rFonts w:ascii="Times New Roman" w:hAnsi="Times New Roman" w:cs="Times New Roman"/>
-          <w:sz w:val="24"/>
+          <w:rFonts w:cs="Times New Roman"/>
+          <w:szCs w:val="24"/>
+        </w:rPr>
+      </w:pPr>
+      <w:r>
+        <w:rPr>
+          <w:rFonts w:cs="Times New Roman"/>
           <w:szCs w:val="24"/>
         </w:rPr>
         <w:t>To reduce the major problem of food waste, household food waste, Saveplate is a smart web application (an intelligent inventory management system), we have designed to help users/customers manage their food inventory, track the expiration dates, receive timely alerts</w:t>
       </w:r>
       <w:r>
         <w:rPr>
-          <w:rFonts w:ascii="Times New Roman" w:hAnsi="Times New Roman" w:cs="Times New Roman"/>
-          <w:sz w:val="24"/>
+          <w:rFonts w:cs="Times New Roman"/>
           <w:szCs w:val="24"/>
         </w:rPr>
         <w:t xml:space="preserve"> and notifications</w:t>
       </w:r>
       <w:r>
         <w:rPr>
-          <w:rFonts w:ascii="Times New Roman" w:hAnsi="Times New Roman" w:cs="Times New Roman"/>
-          <w:sz w:val="24"/>
+          <w:rFonts w:cs="Times New Roman"/>
           <w:szCs w:val="24"/>
         </w:rPr>
         <w:t>,</w:t>
       </w:r>
       <w:r>
         <w:rPr>
-          <w:rFonts w:ascii="Times New Roman" w:hAnsi="Times New Roman" w:cs="Times New Roman"/>
-          <w:sz w:val="24"/>
+          <w:rFonts w:cs="Times New Roman"/>
           <w:szCs w:val="24"/>
         </w:rPr>
         <w:t xml:space="preserve"> search for food items, food analytics,</w:t>
       </w:r>
       <w:r>
         <w:rPr>
-          <w:rFonts w:ascii="Times New Roman" w:hAnsi="Times New Roman" w:cs="Times New Roman"/>
-          <w:sz w:val="24"/>
+          <w:rFonts w:cs="Times New Roman"/>
           <w:szCs w:val="24"/>
         </w:rPr>
         <w:t xml:space="preserve"> facilities for donation and with added functionality for meal planning.</w:t>
       </w:r>
       <w:r>
         <w:rPr>
-          <w:rFonts w:ascii="Times New Roman" w:hAnsi="Times New Roman" w:cs="Times New Roman"/>
-          <w:sz w:val="24"/>
+          <w:rFonts w:cs="Times New Roman"/>
           <w:szCs w:val="24"/>
         </w:rPr>
         <w:t xml:space="preserve"> </w:t>
       </w:r>
       <w:r>
         <w:rPr>
-          <w:rFonts w:ascii="Times New Roman" w:hAnsi="Times New Roman" w:cs="Times New Roman"/>
-          <w:sz w:val="24"/>
+          <w:rFonts w:cs="Times New Roman"/>
           <w:szCs w:val="24"/>
         </w:rPr>
         <w:t>While doing we have g</w:t>
       </w:r>
       <w:r>
         <w:rPr>
-          <w:rFonts w:ascii="Times New Roman" w:hAnsi="Times New Roman" w:cs="Times New Roman"/>
-          <w:sz w:val="24"/>
+          <w:rFonts w:cs="Times New Roman"/>
           <w:szCs w:val="24"/>
         </w:rPr>
         <w:t>iven</w:t>
       </w:r>
       <w:r>
         <w:rPr>
-          <w:rFonts w:ascii="Times New Roman" w:hAnsi="Times New Roman" w:cs="Times New Roman"/>
-          <w:sz w:val="24"/>
+          <w:rFonts w:cs="Times New Roman"/>
           <w:szCs w:val="24"/>
         </w:rPr>
         <w:t xml:space="preserve"> our attention towards protecting user data and account privacy.</w:t>
       </w:r>
       <w:r>
         <w:rPr>
-          <w:rFonts w:ascii="Times New Roman" w:hAnsi="Times New Roman" w:cs="Times New Roman"/>
-          <w:sz w:val="24"/>
+          <w:rFonts w:cs="Times New Roman"/>
           <w:szCs w:val="24"/>
         </w:rPr>
         <w:t xml:space="preserve"> </w:t>
@@ -414,72 +385,63 @@
         <w:spacing w:before="240" w:line="360" w:lineRule="auto"/>
         <w:jc w:val="both"/>
         <w:rPr>
-          <w:rFonts w:ascii="Times New Roman" w:hAnsi="Times New Roman" w:cs="Times New Roman"/>
-          <w:sz w:val="24"/>
+          <w:rFonts w:cs="Times New Roman"/>
           <w:szCs w:val="24"/>
           <w:shd w:val="clear" w:color="auto" w:fill="FFFFFF"/>
         </w:rPr>
       </w:pPr>
       <w:r>
         <w:rPr>
-          <w:rFonts w:ascii="Times New Roman" w:hAnsi="Times New Roman" w:cs="Times New Roman"/>
-          <w:sz w:val="24"/>
+          <w:rFonts w:cs="Times New Roman"/>
           <w:szCs w:val="24"/>
         </w:rPr>
         <w:t>The main motivation for this project comes from the increasing concern of food</w:t>
       </w:r>
       <w:r>
         <w:rPr>
-          <w:rFonts w:ascii="Times New Roman" w:hAnsi="Times New Roman" w:cs="Times New Roman"/>
-          <w:sz w:val="24"/>
+          <w:rFonts w:cs="Times New Roman"/>
           <w:szCs w:val="24"/>
         </w:rPr>
         <w:t xml:space="preserve"> waste</w:t>
       </w:r>
       <w:r>
         <w:rPr>
-          <w:rFonts w:ascii="Times New Roman" w:hAnsi="Times New Roman" w:cs="Times New Roman"/>
-          <w:sz w:val="24"/>
+          <w:rFonts w:cs="Times New Roman"/>
           <w:szCs w:val="24"/>
         </w:rPr>
         <w:t xml:space="preserve"> and its impact on environment</w:t>
       </w:r>
       <w:r>
         <w:rPr>
-          <w:rFonts w:ascii="Times New Roman" w:hAnsi="Times New Roman" w:cs="Times New Roman"/>
-          <w:sz w:val="24"/>
+          <w:rFonts w:cs="Times New Roman"/>
           <w:szCs w:val="24"/>
         </w:rPr>
         <w:t>al</w:t>
       </w:r>
       <w:r>
         <w:rPr>
-          <w:rFonts w:ascii="Times New Roman" w:hAnsi="Times New Roman" w:cs="Times New Roman"/>
-          <w:sz w:val="24"/>
+          <w:rFonts w:cs="Times New Roman"/>
           <w:szCs w:val="24"/>
         </w:rPr>
         <w:t xml:space="preserve"> and economic factors.</w:t>
       </w:r>
       <w:r>
         <w:rPr>
-          <w:rFonts w:ascii="Times New Roman" w:hAnsi="Times New Roman" w:cs="Times New Roman"/>
-          <w:sz w:val="24"/>
+          <w:rFonts w:cs="Times New Roman"/>
           <w:szCs w:val="24"/>
         </w:rPr>
         <w:t xml:space="preserve"> </w:t>
       </w:r>
       <w:r>
         <w:rPr>
-          <w:rFonts w:ascii="Times New Roman" w:hAnsi="Times New Roman" w:cs="Times New Roman"/>
-          <w:sz w:val="24"/>
+          <w:rFonts w:cs="Times New Roman"/>
           <w:szCs w:val="24"/>
         </w:rPr>
         <w:t>As in Malaysia and everywhere, food is central to our daily needs and our culture, and still the gap between food consumption and food management is huge</w:t>
       </w:r>
       <w:r>
         <w:rPr>
-          <w:rFonts w:ascii="Times New Roman" w:hAnsi="Times New Roman" w:cs="Times New Roman"/>
-          <w:sz w:val="24"/>
+          <w:rFonts w:cs="Times New Roman"/>
           <w:szCs w:val="24"/>
         </w:rPr>
         <w:t>. Here is a number to get a better picture,</w:t>
@@ -495,8 +457,7 @@
       </w:r>
       <w:r>
         <w:rPr>
-          <w:rFonts w:ascii="Times New Roman" w:hAnsi="Times New Roman" w:cs="Times New Roman"/>
-          <w:sz w:val="24"/>
+          <w:rFonts w:cs="Times New Roman"/>
           <w:szCs w:val="24"/>
           <w:shd w:val="clear" w:color="auto" w:fill="FFFFFF"/>
         </w:rPr>
@@ -505,10 +466,9 @@
       <w:r>
         <w:rPr>
           <w:rStyle w:val="Strong"/>
-          <w:rFonts w:ascii="Times New Roman" w:hAnsi="Times New Roman" w:cs="Times New Roman"/>
+          <w:rFonts w:cs="Times New Roman"/>
           <w:b w:val="0"/>
           <w:bCs w:val="0"/>
-          <w:sz w:val="24"/>
           <w:szCs w:val="24"/>
           <w:shd w:val="clear" w:color="auto" w:fill="FFFFFF"/>
         </w:rPr>
@@ -516,8 +476,7 @@
       </w:r>
       <w:r>
         <w:rPr>
-          <w:rFonts w:ascii="Times New Roman" w:hAnsi="Times New Roman" w:cs="Times New Roman"/>
-          <w:sz w:val="24"/>
+          <w:rFonts w:cs="Times New Roman"/>
           <w:szCs w:val="24"/>
           <w:shd w:val="clear" w:color="auto" w:fill="FFFFFF"/>
         </w:rPr>
@@ -526,8 +485,7 @@
       <w:sdt>
         <w:sdtPr>
           <w:rPr>
-            <w:rFonts w:ascii="Times New Roman" w:hAnsi="Times New Roman" w:cs="Times New Roman"/>
-            <w:sz w:val="24"/>
+            <w:rFonts w:cs="Times New Roman"/>
             <w:szCs w:val="24"/>
             <w:shd w:val="clear" w:color="auto" w:fill="FFFFFF"/>
           </w:rPr>
@@ -537,8 +495,7 @@
         <w:sdtContent>
           <w:r>
             <w:rPr>
-              <w:rFonts w:ascii="Times New Roman" w:hAnsi="Times New Roman" w:cs="Times New Roman"/>
-              <w:sz w:val="24"/>
+              <w:rFonts w:cs="Times New Roman"/>
               <w:szCs w:val="24"/>
               <w:shd w:val="clear" w:color="auto" w:fill="FFFFFF"/>
             </w:rPr>
@@ -546,8 +503,7 @@
           </w:r>
           <w:r>
             <w:rPr>
-              <w:rFonts w:ascii="Times New Roman" w:hAnsi="Times New Roman" w:cs="Times New Roman"/>
-              <w:sz w:val="24"/>
+              <w:rFonts w:cs="Times New Roman"/>
               <w:szCs w:val="24"/>
               <w:shd w:val="clear" w:color="auto" w:fill="FFFFFF"/>
               <w:lang w:val="en-US"/>
@@ -556,8 +512,7 @@
           </w:r>
           <w:r>
             <w:rPr>
-              <w:rFonts w:ascii="Times New Roman" w:hAnsi="Times New Roman" w:cs="Times New Roman"/>
-              <w:sz w:val="24"/>
+              <w:rFonts w:cs="Times New Roman"/>
               <w:szCs w:val="24"/>
               <w:shd w:val="clear" w:color="auto" w:fill="FFFFFF"/>
             </w:rPr>
@@ -565,9 +520,8 @@
           </w:r>
           <w:r>
             <w:rPr>
-              <w:rFonts w:ascii="Times New Roman" w:hAnsi="Times New Roman" w:cs="Times New Roman"/>
+              <w:rFonts w:cs="Times New Roman"/>
               <w:noProof/>
-              <w:sz w:val="24"/>
               <w:szCs w:val="24"/>
               <w:shd w:val="clear" w:color="auto" w:fill="FFFFFF"/>
             </w:rPr>
@@ -575,9 +529,8 @@
           </w:r>
           <w:r>
             <w:rPr>
-              <w:rFonts w:ascii="Times New Roman" w:hAnsi="Times New Roman" w:cs="Times New Roman"/>
+              <w:rFonts w:cs="Times New Roman"/>
               <w:noProof/>
-              <w:sz w:val="24"/>
               <w:szCs w:val="24"/>
               <w:shd w:val="clear" w:color="auto" w:fill="FFFFFF"/>
             </w:rPr>
@@ -585,8 +538,7 @@
           </w:r>
           <w:r>
             <w:rPr>
-              <w:rFonts w:ascii="Times New Roman" w:hAnsi="Times New Roman" w:cs="Times New Roman"/>
-              <w:sz w:val="24"/>
+              <w:rFonts w:cs="Times New Roman"/>
               <w:szCs w:val="24"/>
               <w:shd w:val="clear" w:color="auto" w:fill="FFFFFF"/>
             </w:rPr>
@@ -600,16 +552,14 @@
         <w:spacing w:before="240" w:line="360" w:lineRule="auto"/>
         <w:jc w:val="both"/>
         <w:rPr>
-          <w:rFonts w:ascii="Times New Roman" w:hAnsi="Times New Roman" w:cs="Times New Roman"/>
-          <w:sz w:val="24"/>
+          <w:rFonts w:cs="Times New Roman"/>
           <w:szCs w:val="24"/>
           <w:shd w:val="clear" w:color="auto" w:fill="FFFFFF"/>
         </w:rPr>
       </w:pPr>
       <w:r>
         <w:rPr>
-          <w:rFonts w:ascii="Times New Roman" w:hAnsi="Times New Roman" w:cs="Times New Roman"/>
-          <w:sz w:val="24"/>
+          <w:rFonts w:cs="Times New Roman"/>
           <w:szCs w:val="24"/>
           <w:shd w:val="clear" w:color="auto" w:fill="FFFFFF"/>
         </w:rPr>
@@ -627,15 +577,13 @@
     <w:p>
       <w:pPr>
         <w:rPr>
-          <w:rFonts w:ascii="Times New Roman" w:hAnsi="Times New Roman" w:cs="Times New Roman"/>
-          <w:sz w:val="24"/>
-          <w:szCs w:val="24"/>
-        </w:rPr>
-      </w:pPr>
-      <w:r>
-        <w:rPr>
-          <w:rFonts w:ascii="Times New Roman" w:hAnsi="Times New Roman" w:cs="Times New Roman"/>
-          <w:sz w:val="24"/>
+          <w:rFonts w:cs="Times New Roman"/>
+          <w:szCs w:val="24"/>
+        </w:rPr>
+      </w:pPr>
+      <w:r>
+        <w:rPr>
+          <w:rFonts w:cs="Times New Roman"/>
           <w:szCs w:val="24"/>
         </w:rPr>
         <w:t>The primary users for the SavePlate are:</w:t>
@@ -649,23 +597,20 @@
           <w:numId w:val="7"/>
         </w:numPr>
         <w:rPr>
-          <w:rFonts w:ascii="Times New Roman" w:hAnsi="Times New Roman" w:cs="Times New Roman"/>
-          <w:sz w:val="24"/>
-          <w:szCs w:val="24"/>
-        </w:rPr>
-      </w:pPr>
-      <w:r>
-        <w:rPr>
-          <w:rFonts w:ascii="Times New Roman" w:hAnsi="Times New Roman" w:cs="Times New Roman"/>
-          <w:sz w:val="24"/>
+          <w:rFonts w:cs="Times New Roman"/>
+          <w:szCs w:val="24"/>
+        </w:rPr>
+      </w:pPr>
+      <w:r>
+        <w:rPr>
+          <w:rFonts w:cs="Times New Roman"/>
           <w:szCs w:val="24"/>
         </w:rPr>
         <w:t>Families and household individuals</w:t>
       </w:r>
       <w:r>
         <w:rPr>
-          <w:rFonts w:ascii="Times New Roman" w:hAnsi="Times New Roman" w:cs="Times New Roman"/>
-          <w:sz w:val="24"/>
+          <w:rFonts w:cs="Times New Roman"/>
           <w:szCs w:val="24"/>
         </w:rPr>
         <w:t>, who in regular basis purchase and consume food items,</w:t>
@@ -679,15 +624,13 @@
           <w:numId w:val="7"/>
         </w:numPr>
         <w:rPr>
-          <w:rFonts w:ascii="Times New Roman" w:hAnsi="Times New Roman" w:cs="Times New Roman"/>
-          <w:sz w:val="24"/>
-          <w:szCs w:val="24"/>
-        </w:rPr>
-      </w:pPr>
-      <w:r>
-        <w:rPr>
-          <w:rFonts w:ascii="Times New Roman" w:hAnsi="Times New Roman" w:cs="Times New Roman"/>
-          <w:sz w:val="24"/>
+          <w:rFonts w:cs="Times New Roman"/>
+          <w:szCs w:val="24"/>
+        </w:rPr>
+      </w:pPr>
+      <w:r>
+        <w:rPr>
+          <w:rFonts w:cs="Times New Roman"/>
           <w:szCs w:val="24"/>
         </w:rPr>
         <w:t>Donors who are willing to share the food with others, before it goes to waste,</w:t>
@@ -701,15 +644,13 @@
           <w:numId w:val="7"/>
         </w:numPr>
         <w:rPr>
-          <w:rFonts w:ascii="Times New Roman" w:hAnsi="Times New Roman" w:cs="Times New Roman"/>
-          <w:sz w:val="24"/>
-          <w:szCs w:val="24"/>
-        </w:rPr>
-      </w:pPr>
-      <w:r>
-        <w:rPr>
-          <w:rFonts w:ascii="Times New Roman" w:hAnsi="Times New Roman" w:cs="Times New Roman"/>
-          <w:sz w:val="24"/>
+          <w:rFonts w:cs="Times New Roman"/>
+          <w:szCs w:val="24"/>
+        </w:rPr>
+      </w:pPr>
+      <w:r>
+        <w:rPr>
+          <w:rFonts w:cs="Times New Roman"/>
           <w:szCs w:val="24"/>
         </w:rPr>
         <w:t>Community members and individuals who can browse and claim the donated food items,</w:t>
@@ -723,15 +664,13 @@
           <w:numId w:val="7"/>
         </w:numPr>
         <w:rPr>
-          <w:rFonts w:ascii="Times New Roman" w:hAnsi="Times New Roman" w:cs="Times New Roman"/>
-          <w:sz w:val="24"/>
-          <w:szCs w:val="24"/>
-        </w:rPr>
-      </w:pPr>
-      <w:r>
-        <w:rPr>
-          <w:rFonts w:ascii="Times New Roman" w:hAnsi="Times New Roman" w:cs="Times New Roman"/>
-          <w:sz w:val="24"/>
+          <w:rFonts w:cs="Times New Roman"/>
+          <w:szCs w:val="24"/>
+        </w:rPr>
+      </w:pPr>
+      <w:r>
+        <w:rPr>
+          <w:rFonts w:cs="Times New Roman"/>
           <w:szCs w:val="24"/>
         </w:rPr>
         <w:t>Everyday individuals, who wants to track the expiry dates of the food items,</w:t>
@@ -750,15 +689,13 @@
       <w:pPr>
         <w:spacing w:before="240" w:line="360" w:lineRule="auto"/>
         <w:rPr>
-          <w:rFonts w:ascii="Times New Roman" w:hAnsi="Times New Roman" w:cs="Times New Roman"/>
-          <w:sz w:val="24"/>
-          <w:szCs w:val="24"/>
-        </w:rPr>
-      </w:pPr>
-      <w:r>
-        <w:rPr>
-          <w:rFonts w:ascii="Times New Roman" w:hAnsi="Times New Roman" w:cs="Times New Roman"/>
-          <w:sz w:val="24"/>
+          <w:rFonts w:cs="Times New Roman"/>
+          <w:szCs w:val="24"/>
+        </w:rPr>
+      </w:pPr>
+      <w:r>
+        <w:rPr>
+          <w:rFonts w:cs="Times New Roman"/>
           <w:szCs w:val="24"/>
         </w:rPr>
         <w:t>Our product is a new product, and not an extension of any existing project. Built to address food waste management for Malaysian households. SavePlate will be delivered as a fully functional, web-based application accessible via web browser.</w:t>
@@ -768,15 +705,13 @@
       <w:pPr>
         <w:spacing w:before="240" w:line="360" w:lineRule="auto"/>
         <w:rPr>
-          <w:rFonts w:ascii="Times New Roman" w:hAnsi="Times New Roman" w:cs="Times New Roman"/>
-          <w:sz w:val="24"/>
-          <w:szCs w:val="24"/>
-        </w:rPr>
-      </w:pPr>
-      <w:r>
-        <w:rPr>
-          <w:rFonts w:ascii="Times New Roman" w:hAnsi="Times New Roman" w:cs="Times New Roman"/>
-          <w:sz w:val="24"/>
+          <w:rFonts w:cs="Times New Roman"/>
+          <w:szCs w:val="24"/>
+        </w:rPr>
+      </w:pPr>
+      <w:r>
+        <w:rPr>
+          <w:rFonts w:cs="Times New Roman"/>
           <w:szCs w:val="24"/>
         </w:rPr>
         <w:t>The core features to be delivered include:</w:t>
@@ -791,15 +726,13 @@
         </w:numPr>
         <w:spacing w:before="240" w:line="360" w:lineRule="auto"/>
         <w:rPr>
-          <w:rFonts w:ascii="Times New Roman" w:hAnsi="Times New Roman" w:cs="Times New Roman"/>
-          <w:sz w:val="24"/>
-          <w:szCs w:val="24"/>
-        </w:rPr>
-      </w:pPr>
-      <w:r>
-        <w:rPr>
-          <w:rFonts w:ascii="Times New Roman" w:hAnsi="Times New Roman" w:cs="Times New Roman"/>
-          <w:sz w:val="24"/>
+          <w:rFonts w:cs="Times New Roman"/>
+          <w:szCs w:val="24"/>
+        </w:rPr>
+      </w:pPr>
+      <w:r>
+        <w:rPr>
+          <w:rFonts w:cs="Times New Roman"/>
           <w:szCs w:val="24"/>
         </w:rPr>
         <w:t>User registration and account privacy,</w:t>
@@ -814,23 +747,20 @@
         </w:numPr>
         <w:spacing w:before="240" w:line="360" w:lineRule="auto"/>
         <w:rPr>
-          <w:rFonts w:ascii="Times New Roman" w:hAnsi="Times New Roman" w:cs="Times New Roman"/>
-          <w:sz w:val="24"/>
-          <w:szCs w:val="24"/>
-        </w:rPr>
-      </w:pPr>
-      <w:r>
-        <w:rPr>
-          <w:rFonts w:ascii="Times New Roman" w:hAnsi="Times New Roman" w:cs="Times New Roman"/>
-          <w:sz w:val="24"/>
+          <w:rFonts w:cs="Times New Roman"/>
+          <w:szCs w:val="24"/>
+        </w:rPr>
+      </w:pPr>
+      <w:r>
+        <w:rPr>
+          <w:rFonts w:cs="Times New Roman"/>
           <w:szCs w:val="24"/>
         </w:rPr>
         <w:t>Two-Factor authentication and privacy management</w:t>
       </w:r>
       <w:r>
         <w:rPr>
-          <w:rFonts w:ascii="Times New Roman" w:hAnsi="Times New Roman" w:cs="Times New Roman"/>
-          <w:sz w:val="24"/>
+          <w:rFonts w:cs="Times New Roman"/>
           <w:szCs w:val="24"/>
         </w:rPr>
         <w:t>,</w:t>
@@ -845,15 +775,13 @@
         </w:numPr>
         <w:spacing w:before="240" w:line="360" w:lineRule="auto"/>
         <w:rPr>
-          <w:rFonts w:ascii="Times New Roman" w:hAnsi="Times New Roman" w:cs="Times New Roman"/>
-          <w:sz w:val="24"/>
-          <w:szCs w:val="24"/>
-        </w:rPr>
-      </w:pPr>
-      <w:r>
-        <w:rPr>
-          <w:rFonts w:ascii="Times New Roman" w:hAnsi="Times New Roman" w:cs="Times New Roman"/>
-          <w:sz w:val="24"/>
+          <w:rFonts w:cs="Times New Roman"/>
+          <w:szCs w:val="24"/>
+        </w:rPr>
+      </w:pPr>
+      <w:r>
+        <w:rPr>
+          <w:rFonts w:cs="Times New Roman"/>
           <w:szCs w:val="24"/>
         </w:rPr>
         <w:t>Food inventory management with tracking expiry dates,</w:t>
@@ -868,15 +796,13 @@
         </w:numPr>
         <w:spacing w:before="240" w:line="360" w:lineRule="auto"/>
         <w:rPr>
-          <w:rFonts w:ascii="Times New Roman" w:hAnsi="Times New Roman" w:cs="Times New Roman"/>
-          <w:sz w:val="24"/>
-          <w:szCs w:val="24"/>
-        </w:rPr>
-      </w:pPr>
-      <w:r>
-        <w:rPr>
-          <w:rFonts w:ascii="Times New Roman" w:hAnsi="Times New Roman" w:cs="Times New Roman"/>
-          <w:sz w:val="24"/>
+          <w:rFonts w:cs="Times New Roman"/>
+          <w:szCs w:val="24"/>
+        </w:rPr>
+      </w:pPr>
+      <w:r>
+        <w:rPr>
+          <w:rFonts w:cs="Times New Roman"/>
           <w:szCs w:val="24"/>
         </w:rPr>
         <w:t>Food donation – donating and cleaning food items,</w:t>
@@ -891,15 +817,13 @@
         </w:numPr>
         <w:spacing w:before="240" w:line="360" w:lineRule="auto"/>
         <w:rPr>
-          <w:rFonts w:ascii="Times New Roman" w:hAnsi="Times New Roman" w:cs="Times New Roman"/>
-          <w:sz w:val="24"/>
-          <w:szCs w:val="24"/>
-        </w:rPr>
-      </w:pPr>
-      <w:r>
-        <w:rPr>
-          <w:rFonts w:ascii="Times New Roman" w:hAnsi="Times New Roman" w:cs="Times New Roman"/>
-          <w:sz w:val="24"/>
+          <w:rFonts w:cs="Times New Roman"/>
+          <w:szCs w:val="24"/>
+        </w:rPr>
+      </w:pPr>
+      <w:r>
+        <w:rPr>
+          <w:rFonts w:cs="Times New Roman"/>
           <w:szCs w:val="24"/>
         </w:rPr>
         <w:t>Real time notification system for expiry and donations,</w:t>
@@ -914,15 +838,13 @@
         </w:numPr>
         <w:spacing w:before="240" w:line="360" w:lineRule="auto"/>
         <w:rPr>
-          <w:rFonts w:ascii="Times New Roman" w:hAnsi="Times New Roman" w:cs="Times New Roman"/>
-          <w:sz w:val="24"/>
-          <w:szCs w:val="24"/>
-        </w:rPr>
-      </w:pPr>
-      <w:r>
-        <w:rPr>
-          <w:rFonts w:ascii="Times New Roman" w:hAnsi="Times New Roman" w:cs="Times New Roman"/>
-          <w:sz w:val="24"/>
+          <w:rFonts w:cs="Times New Roman"/>
+          <w:szCs w:val="24"/>
+        </w:rPr>
+      </w:pPr>
+      <w:r>
+        <w:rPr>
+          <w:rFonts w:cs="Times New Roman"/>
           <w:szCs w:val="24"/>
         </w:rPr>
         <w:t>Food analytics,</w:t>
@@ -937,15 +859,13 @@
         </w:numPr>
         <w:spacing w:before="240" w:line="360" w:lineRule="auto"/>
         <w:rPr>
-          <w:rFonts w:ascii="Times New Roman" w:hAnsi="Times New Roman" w:cs="Times New Roman"/>
-          <w:sz w:val="24"/>
-          <w:szCs w:val="24"/>
-        </w:rPr>
-      </w:pPr>
-      <w:r>
-        <w:rPr>
-          <w:rFonts w:ascii="Times New Roman" w:hAnsi="Times New Roman" w:cs="Times New Roman"/>
-          <w:sz w:val="24"/>
+          <w:rFonts w:cs="Times New Roman"/>
+          <w:szCs w:val="24"/>
+        </w:rPr>
+      </w:pPr>
+      <w:r>
+        <w:rPr>
+          <w:rFonts w:cs="Times New Roman"/>
           <w:szCs w:val="24"/>
         </w:rPr>
         <w:t>Weekly meal planning based on the current food inventory</w:t>
@@ -960,9 +880,6 @@
       </w:r>
     </w:p>
     <w:p>
-      <w:pPr>
-        <w:pStyle w:val="Normal0"/>
-      </w:pPr>
       <w:r>
         <w:t>The project will be developed by our team of three members, contributing our own computing hardware, development will be done all using open-source tools and free available platforms, keeping the development cost minimal.</w:t>
       </w:r>
@@ -983,23 +900,20 @@
       <w:pPr>
         <w:spacing w:before="240" w:line="360" w:lineRule="auto"/>
         <w:rPr>
-          <w:rFonts w:ascii="Times New Roman" w:hAnsi="Times New Roman" w:cs="Times New Roman"/>
-          <w:sz w:val="24"/>
-          <w:szCs w:val="24"/>
-        </w:rPr>
-      </w:pPr>
-      <w:r>
-        <w:rPr>
-          <w:rFonts w:ascii="Times New Roman" w:hAnsi="Times New Roman" w:cs="Times New Roman"/>
-          <w:sz w:val="24"/>
+          <w:rFonts w:cs="Times New Roman"/>
+          <w:szCs w:val="24"/>
+        </w:rPr>
+      </w:pPr>
+      <w:r>
+        <w:rPr>
+          <w:rFonts w:cs="Times New Roman"/>
           <w:szCs w:val="24"/>
         </w:rPr>
         <w:t xml:space="preserve">The development timeline for the SavePlate is estimated at approximately 6 to 8 weeks, divided into two phases, which is aligned with the assignment submission deadlines, Phase 1 and Phase 2 for coding and testing </w:t>
       </w:r>
       <w:r>
         <w:rPr>
-          <w:rFonts w:ascii="Times New Roman" w:hAnsi="Times New Roman" w:cs="Times New Roman"/>
-          <w:sz w:val="24"/>
+          <w:rFonts w:cs="Times New Roman"/>
           <w:szCs w:val="24"/>
         </w:rPr>
         <w:tab/>
@@ -1008,15 +922,13 @@
     <w:p>
       <w:pPr>
         <w:rPr>
-          <w:rFonts w:ascii="Times New Roman" w:hAnsi="Times New Roman" w:cs="Times New Roman"/>
-          <w:sz w:val="24"/>
-          <w:szCs w:val="24"/>
-        </w:rPr>
-      </w:pPr>
-      <w:r>
-        <w:rPr>
-          <w:rFonts w:ascii="Times New Roman" w:hAnsi="Times New Roman" w:cs="Times New Roman"/>
-          <w:sz w:val="24"/>
+          <w:rFonts w:cs="Times New Roman"/>
+          <w:szCs w:val="24"/>
+        </w:rPr>
+      </w:pPr>
+      <w:r>
+        <w:rPr>
+          <w:rFonts w:cs="Times New Roman"/>
           <w:szCs w:val="24"/>
         </w:rPr>
         <w:br w:type="page"/>
@@ -1033,7 +945,6 @@
     </w:p>
     <w:p>
       <w:pPr>
-        <w:pStyle w:val="Normal0"/>
         <w:spacing w:before="240" w:line="360" w:lineRule="auto"/>
       </w:pPr>
       <w:r>
@@ -1052,15 +963,13 @@
         </w:numPr>
         <w:spacing w:before="240" w:line="360" w:lineRule="auto"/>
         <w:rPr>
-          <w:rFonts w:ascii="Times New Roman" w:hAnsi="Times New Roman" w:cs="Times New Roman"/>
-          <w:sz w:val="24"/>
-          <w:szCs w:val="24"/>
-        </w:rPr>
-      </w:pPr>
-      <w:r>
-        <w:rPr>
-          <w:rFonts w:ascii="Times New Roman" w:hAnsi="Times New Roman" w:cs="Times New Roman"/>
-          <w:sz w:val="24"/>
+          <w:rFonts w:cs="Times New Roman"/>
+          <w:szCs w:val="24"/>
+        </w:rPr>
+      </w:pPr>
+      <w:r>
+        <w:rPr>
+          <w:rFonts w:cs="Times New Roman"/>
           <w:szCs w:val="24"/>
         </w:rPr>
         <w:t>To develop a user friendly, web application that helps Malaysian households to effectively reduce food waste,</w:t>
@@ -1075,15 +984,13 @@
         </w:numPr>
         <w:spacing w:before="240" w:line="360" w:lineRule="auto"/>
         <w:rPr>
-          <w:rFonts w:ascii="Times New Roman" w:hAnsi="Times New Roman" w:cs="Times New Roman"/>
-          <w:sz w:val="24"/>
-          <w:szCs w:val="24"/>
-        </w:rPr>
-      </w:pPr>
-      <w:r>
-        <w:rPr>
-          <w:rFonts w:ascii="Times New Roman" w:hAnsi="Times New Roman" w:cs="Times New Roman"/>
-          <w:sz w:val="24"/>
+          <w:rFonts w:cs="Times New Roman"/>
+          <w:szCs w:val="24"/>
+        </w:rPr>
+      </w:pPr>
+      <w:r>
+        <w:rPr>
+          <w:rFonts w:cs="Times New Roman"/>
           <w:szCs w:val="24"/>
         </w:rPr>
         <w:t>To help user adapt to sustainable consumption practice by providing appropriate tools to manage food inventory responsibly and efficiently,</w:t>
@@ -1098,31 +1005,27 @@
         </w:numPr>
         <w:spacing w:before="240" w:line="360" w:lineRule="auto"/>
         <w:rPr>
-          <w:rFonts w:ascii="Times New Roman" w:hAnsi="Times New Roman" w:cs="Times New Roman"/>
-          <w:sz w:val="24"/>
-          <w:szCs w:val="24"/>
-        </w:rPr>
-      </w:pPr>
-      <w:r>
-        <w:rPr>
-          <w:rFonts w:ascii="Times New Roman" w:hAnsi="Times New Roman" w:cs="Times New Roman"/>
-          <w:sz w:val="24"/>
+          <w:rFonts w:cs="Times New Roman"/>
+          <w:szCs w:val="24"/>
+        </w:rPr>
+      </w:pPr>
+      <w:r>
+        <w:rPr>
+          <w:rFonts w:cs="Times New Roman"/>
           <w:szCs w:val="24"/>
         </w:rPr>
         <w:t>To facilitate a community-driven food donation environment where surplus household can donate to the one</w:t>
       </w:r>
       <w:r>
         <w:rPr>
-          <w:rFonts w:ascii="Times New Roman" w:hAnsi="Times New Roman" w:cs="Times New Roman"/>
-          <w:sz w:val="24"/>
+          <w:rFonts w:cs="Times New Roman"/>
           <w:szCs w:val="24"/>
         </w:rPr>
         <w:t>s</w:t>
       </w:r>
       <w:r>
         <w:rPr>
-          <w:rFonts w:ascii="Times New Roman" w:hAnsi="Times New Roman" w:cs="Times New Roman"/>
-          <w:sz w:val="24"/>
+          <w:rFonts w:cs="Times New Roman"/>
           <w:szCs w:val="24"/>
         </w:rPr>
         <w:t xml:space="preserve"> in need,</w:t>
@@ -1137,23 +1040,20 @@
         </w:numPr>
         <w:spacing w:before="240" w:line="360" w:lineRule="auto"/>
         <w:rPr>
-          <w:rFonts w:ascii="Times New Roman" w:hAnsi="Times New Roman" w:cs="Times New Roman"/>
-          <w:sz w:val="24"/>
-          <w:szCs w:val="24"/>
-        </w:rPr>
-      </w:pPr>
-      <w:r>
-        <w:rPr>
-          <w:rFonts w:ascii="Times New Roman" w:hAnsi="Times New Roman" w:cs="Times New Roman"/>
-          <w:sz w:val="24"/>
+          <w:rFonts w:cs="Times New Roman"/>
+          <w:szCs w:val="24"/>
+        </w:rPr>
+      </w:pPr>
+      <w:r>
+        <w:rPr>
+          <w:rFonts w:cs="Times New Roman"/>
           <w:szCs w:val="24"/>
         </w:rPr>
         <w:t>To facilitate the optimal utilization of every food item available through expiry date tracking and weekly meal planning</w:t>
       </w:r>
       <w:r>
         <w:rPr>
-          <w:rFonts w:ascii="Times New Roman" w:hAnsi="Times New Roman" w:cs="Times New Roman"/>
-          <w:sz w:val="24"/>
+          <w:rFonts w:cs="Times New Roman"/>
           <w:szCs w:val="24"/>
         </w:rPr>
         <w:t>,</w:t>
@@ -1168,39 +1068,34 @@
         </w:numPr>
         <w:spacing w:before="240" w:line="360" w:lineRule="auto"/>
         <w:rPr>
-          <w:rFonts w:ascii="Times New Roman" w:hAnsi="Times New Roman" w:cs="Times New Roman"/>
-          <w:sz w:val="24"/>
-          <w:szCs w:val="24"/>
-        </w:rPr>
-      </w:pPr>
-      <w:r>
-        <w:rPr>
-          <w:rFonts w:ascii="Times New Roman" w:hAnsi="Times New Roman" w:cs="Times New Roman"/>
-          <w:sz w:val="24"/>
+          <w:rFonts w:cs="Times New Roman"/>
+          <w:szCs w:val="24"/>
+        </w:rPr>
+      </w:pPr>
+      <w:r>
+        <w:rPr>
+          <w:rFonts w:cs="Times New Roman"/>
           <w:szCs w:val="24"/>
         </w:rPr>
         <w:t>To help user remember the inventory and supplies</w:t>
       </w:r>
       <w:r>
         <w:rPr>
-          <w:rFonts w:ascii="Times New Roman" w:hAnsi="Times New Roman" w:cs="Times New Roman"/>
-          <w:sz w:val="24"/>
+          <w:rFonts w:cs="Times New Roman"/>
           <w:szCs w:val="24"/>
         </w:rPr>
         <w:t xml:space="preserve"> by timely notifications</w:t>
       </w:r>
       <w:r>
         <w:rPr>
-          <w:rFonts w:ascii="Times New Roman" w:hAnsi="Times New Roman" w:cs="Times New Roman"/>
-          <w:sz w:val="24"/>
+          <w:rFonts w:cs="Times New Roman"/>
           <w:szCs w:val="24"/>
         </w:rPr>
         <w:t>, and result in less food waste.</w:t>
       </w:r>
       <w:r>
         <w:rPr>
-          <w:rFonts w:ascii="Times New Roman" w:hAnsi="Times New Roman" w:cs="Times New Roman"/>
-          <w:sz w:val="24"/>
+          <w:rFonts w:cs="Times New Roman"/>
           <w:szCs w:val="24"/>
         </w:rPr>
         <w:t xml:space="preserve"> </w:t>
@@ -1209,15 +1104,13 @@
     <w:p>
       <w:pPr>
         <w:rPr>
-          <w:rFonts w:ascii="Times New Roman" w:hAnsi="Times New Roman" w:cs="Times New Roman"/>
-          <w:sz w:val="24"/>
-          <w:szCs w:val="24"/>
-        </w:rPr>
-      </w:pPr>
-      <w:r>
-        <w:rPr>
-          <w:rFonts w:ascii="Times New Roman" w:hAnsi="Times New Roman" w:cs="Times New Roman"/>
-          <w:sz w:val="24"/>
+          <w:rFonts w:cs="Times New Roman"/>
+          <w:szCs w:val="24"/>
+        </w:rPr>
+      </w:pPr>
+      <w:r>
+        <w:rPr>
+          <w:rFonts w:cs="Times New Roman"/>
           <w:szCs w:val="24"/>
         </w:rPr>
         <w:br w:type="page"/>
@@ -1233,9 +1126,6 @@
       </w:r>
     </w:p>
     <w:p>
-      <w:pPr>
-        <w:pStyle w:val="Normal0"/>
-      </w:pPr>
       <w:r>
         <w:t xml:space="preserve">Upon the completion of </w:t>
       </w:r>
@@ -1256,7 +1146,6 @@
     </w:p>
     <w:p>
       <w:pPr>
-        <w:pStyle w:val="Normal0"/>
         <w:numPr>
           <w:ilvl w:val="0"/>
           <w:numId w:val="11"/>
@@ -1272,7 +1161,6 @@
     </w:p>
     <w:p>
       <w:pPr>
-        <w:pStyle w:val="Normal0"/>
         <w:numPr>
           <w:ilvl w:val="0"/>
           <w:numId w:val="11"/>
@@ -1337,10 +1225,7 @@
       </w:r>
       <w:proofErr w:type="gramEnd"/>
       <w:r>
-        <w:t xml:space="preserve"> real-time notification features that alerts users days prior to the food expiry date of the stored items,</w:t>
-      </w:r>
-      <w:r>
-        <w:t xml:space="preserve"> notify </w:t>
+        <w:t xml:space="preserve"> real-time notification features that alerts users days prior to the food expiry date of the stored items, notify </w:t>
       </w:r>
       <w:r>
         <w:t>when a donation is made,</w:t>
@@ -1365,605 +1250,127 @@
       </w:pPr>
     </w:p>
     <w:p>
-      <w:pPr>
-        <w:pStyle w:val="ListParagraph"/>
-        <w:numPr>
-          <w:ilvl w:val="0"/>
-          <w:numId w:val="7"/>
-        </w:numPr>
-        <w:spacing w:before="240" w:line="360" w:lineRule="auto"/>
-        <w:jc w:val="both"/>
-        <w:rPr>
-          <w:rFonts w:ascii="Times New Roman" w:hAnsi="Times New Roman" w:cs="Times New Roman"/>
-          <w:b/>
-          <w:bCs/>
-          <w:sz w:val="24"/>
-          <w:szCs w:val="24"/>
-        </w:rPr>
-      </w:pPr>
-      <w:r>
-        <w:rPr>
-          <w:rFonts w:ascii="Times New Roman" w:hAnsi="Times New Roman" w:cs="Times New Roman"/>
-          <w:b/>
-          <w:bCs/>
-          <w:sz w:val="24"/>
-          <w:szCs w:val="24"/>
-        </w:rPr>
+      <w:r>
         <w:t>Project Objectives</w:t>
       </w:r>
     </w:p>
     <w:p>
-      <w:pPr>
-        <w:pStyle w:val="ListParagraph"/>
-        <w:numPr>
-          <w:ilvl w:val="1"/>
-          <w:numId w:val="7"/>
-        </w:numPr>
-        <w:spacing w:before="240" w:line="360" w:lineRule="auto"/>
-        <w:jc w:val="both"/>
-        <w:rPr>
-          <w:rFonts w:ascii="Times New Roman" w:hAnsi="Times New Roman" w:cs="Times New Roman"/>
-          <w:sz w:val="24"/>
-          <w:szCs w:val="24"/>
-        </w:rPr>
-      </w:pPr>
-      <w:r>
-        <w:rPr>
-          <w:rFonts w:ascii="Times New Roman" w:hAnsi="Times New Roman" w:cs="Times New Roman"/>
-          <w:sz w:val="24"/>
-          <w:szCs w:val="24"/>
-        </w:rPr>
+      <w:r>
         <w:t>To design a functional food inventory system within the first 2 weeks</w:t>
       </w:r>
     </w:p>
     <w:p>
-      <w:pPr>
-        <w:pStyle w:val="ListParagraph"/>
-        <w:numPr>
-          <w:ilvl w:val="1"/>
-          <w:numId w:val="7"/>
-        </w:numPr>
-        <w:spacing w:before="240" w:line="360" w:lineRule="auto"/>
-        <w:jc w:val="both"/>
-        <w:rPr>
-          <w:rFonts w:ascii="Times New Roman" w:hAnsi="Times New Roman" w:cs="Times New Roman"/>
-          <w:sz w:val="24"/>
-          <w:szCs w:val="24"/>
-        </w:rPr>
-      </w:pPr>
-      <w:r>
-        <w:rPr>
-          <w:rFonts w:ascii="Times New Roman" w:hAnsi="Times New Roman" w:cs="Times New Roman"/>
-          <w:sz w:val="24"/>
-          <w:szCs w:val="24"/>
-        </w:rPr>
+      <w:r>
         <w:t>To implement notification alerts for expiry tracking</w:t>
       </w:r>
     </w:p>
     <w:p>
-      <w:pPr>
-        <w:pStyle w:val="ListParagraph"/>
-        <w:numPr>
-          <w:ilvl w:val="1"/>
-          <w:numId w:val="7"/>
-        </w:numPr>
-        <w:spacing w:before="240" w:line="360" w:lineRule="auto"/>
-        <w:jc w:val="both"/>
-        <w:rPr>
-          <w:rFonts w:ascii="Times New Roman" w:hAnsi="Times New Roman" w:cs="Times New Roman"/>
-          <w:sz w:val="24"/>
-          <w:szCs w:val="24"/>
-        </w:rPr>
-      </w:pPr>
-      <w:r>
-        <w:rPr>
-          <w:rFonts w:ascii="Times New Roman" w:hAnsi="Times New Roman" w:cs="Times New Roman"/>
-          <w:sz w:val="24"/>
-          <w:szCs w:val="24"/>
-        </w:rPr>
+      <w:r>
         <w:t>To develop a meal planning module for users (households, donors, and individuals)</w:t>
       </w:r>
     </w:p>
     <w:p>
-      <w:pPr>
-        <w:pStyle w:val="ListParagraph"/>
-        <w:numPr>
-          <w:ilvl w:val="1"/>
-          <w:numId w:val="7"/>
-        </w:numPr>
-        <w:spacing w:before="240" w:line="360" w:lineRule="auto"/>
-        <w:jc w:val="both"/>
-        <w:rPr>
-          <w:rFonts w:ascii="Times New Roman" w:hAnsi="Times New Roman" w:cs="Times New Roman"/>
-          <w:sz w:val="24"/>
-          <w:szCs w:val="24"/>
-        </w:rPr>
-      </w:pPr>
-      <w:r>
-        <w:rPr>
-          <w:rFonts w:ascii="Times New Roman" w:hAnsi="Times New Roman" w:cs="Times New Roman"/>
-          <w:sz w:val="24"/>
-          <w:szCs w:val="24"/>
-        </w:rPr>
+      <w:r>
         <w:t>To ensure the system usability and performance</w:t>
       </w:r>
     </w:p>
     <w:p>
-      <w:pPr>
-        <w:spacing w:before="240" w:line="360" w:lineRule="auto"/>
-        <w:rPr>
-          <w:rFonts w:ascii="Times New Roman" w:hAnsi="Times New Roman" w:cs="Times New Roman"/>
-          <w:sz w:val="24"/>
-          <w:szCs w:val="24"/>
-        </w:rPr>
-      </w:pPr>
-      <w:r>
-        <w:rPr>
-          <w:rFonts w:ascii="Times New Roman" w:hAnsi="Times New Roman" w:cs="Times New Roman"/>
-          <w:sz w:val="24"/>
-          <w:szCs w:val="24"/>
-        </w:rPr>
+      <w:r>
         <w:br w:type="page"/>
       </w:r>
     </w:p>
     <w:p>
-      <w:pPr>
-        <w:pStyle w:val="ListParagraph"/>
-        <w:numPr>
-          <w:ilvl w:val="0"/>
-          <w:numId w:val="7"/>
-        </w:numPr>
-        <w:spacing w:before="240" w:line="360" w:lineRule="auto"/>
-        <w:jc w:val="both"/>
-        <w:rPr>
-          <w:rFonts w:ascii="Times New Roman" w:hAnsi="Times New Roman" w:cs="Times New Roman"/>
-          <w:b/>
-          <w:bCs/>
-          <w:sz w:val="24"/>
-          <w:szCs w:val="24"/>
-        </w:rPr>
-      </w:pPr>
-      <w:r>
-        <w:rPr>
-          <w:rFonts w:ascii="Times New Roman" w:hAnsi="Times New Roman" w:cs="Times New Roman"/>
-          <w:b/>
-          <w:bCs/>
-          <w:sz w:val="24"/>
-          <w:szCs w:val="24"/>
-        </w:rPr>
+      <w:r>
         <w:lastRenderedPageBreak/>
         <w:t>Project Scope</w:t>
       </w:r>
     </w:p>
     <w:p>
-      <w:pPr>
-        <w:pStyle w:val="ListParagraph"/>
-        <w:numPr>
-          <w:ilvl w:val="1"/>
-          <w:numId w:val="7"/>
-        </w:numPr>
-        <w:spacing w:before="240" w:line="360" w:lineRule="auto"/>
-        <w:jc w:val="both"/>
-        <w:rPr>
-          <w:rFonts w:ascii="Times New Roman" w:hAnsi="Times New Roman" w:cs="Times New Roman"/>
-          <w:sz w:val="24"/>
-          <w:szCs w:val="24"/>
-        </w:rPr>
-      </w:pPr>
-      <w:r>
-        <w:rPr>
-          <w:rFonts w:ascii="Times New Roman" w:hAnsi="Times New Roman" w:cs="Times New Roman"/>
-          <w:b/>
-          <w:bCs/>
-          <w:sz w:val="24"/>
-          <w:szCs w:val="24"/>
-        </w:rPr>
+      <w:r>
         <w:t>In Scope</w:t>
       </w:r>
       <w:r>
-        <w:rPr>
-          <w:rFonts w:ascii="Times New Roman" w:hAnsi="Times New Roman" w:cs="Times New Roman"/>
-          <w:sz w:val="24"/>
-          <w:szCs w:val="24"/>
-        </w:rPr>
         <w:t>:</w:t>
       </w:r>
     </w:p>
     <w:p>
-      <w:pPr>
-        <w:pStyle w:val="ListParagraph"/>
-        <w:numPr>
-          <w:ilvl w:val="2"/>
-          <w:numId w:val="7"/>
-        </w:numPr>
-        <w:spacing w:before="240" w:line="360" w:lineRule="auto"/>
-        <w:jc w:val="both"/>
-        <w:rPr>
-          <w:rFonts w:ascii="Times New Roman" w:hAnsi="Times New Roman" w:cs="Times New Roman"/>
-          <w:sz w:val="24"/>
-          <w:szCs w:val="24"/>
-        </w:rPr>
-      </w:pPr>
-      <w:r>
-        <w:rPr>
-          <w:rFonts w:ascii="Times New Roman" w:hAnsi="Times New Roman" w:cs="Times New Roman"/>
-          <w:sz w:val="24"/>
-          <w:szCs w:val="24"/>
-        </w:rPr>
+      <w:r>
         <w:t>User Registration and Login</w:t>
       </w:r>
     </w:p>
     <w:p>
-      <w:pPr>
-        <w:pStyle w:val="ListParagraph"/>
-        <w:numPr>
-          <w:ilvl w:val="2"/>
-          <w:numId w:val="7"/>
-        </w:numPr>
-        <w:spacing w:before="240" w:line="360" w:lineRule="auto"/>
-        <w:jc w:val="both"/>
-        <w:rPr>
-          <w:rFonts w:ascii="Times New Roman" w:hAnsi="Times New Roman" w:cs="Times New Roman"/>
-          <w:sz w:val="24"/>
-          <w:szCs w:val="24"/>
-        </w:rPr>
-      </w:pPr>
-      <w:r>
-        <w:rPr>
-          <w:rFonts w:ascii="Times New Roman" w:hAnsi="Times New Roman" w:cs="Times New Roman"/>
-          <w:sz w:val="24"/>
-          <w:szCs w:val="24"/>
-        </w:rPr>
+      <w:r>
         <w:t>Food Inventory Management</w:t>
       </w:r>
     </w:p>
     <w:p>
-      <w:pPr>
-        <w:pStyle w:val="ListParagraph"/>
-        <w:numPr>
-          <w:ilvl w:val="2"/>
-          <w:numId w:val="7"/>
-        </w:numPr>
-        <w:spacing w:before="240" w:line="360" w:lineRule="auto"/>
-        <w:jc w:val="both"/>
-        <w:rPr>
-          <w:rFonts w:ascii="Times New Roman" w:hAnsi="Times New Roman" w:cs="Times New Roman"/>
-          <w:sz w:val="24"/>
-          <w:szCs w:val="24"/>
-        </w:rPr>
-      </w:pPr>
-      <w:r>
-        <w:rPr>
-          <w:rFonts w:ascii="Times New Roman" w:hAnsi="Times New Roman" w:cs="Times New Roman"/>
-          <w:sz w:val="24"/>
-          <w:szCs w:val="24"/>
-        </w:rPr>
+      <w:r>
         <w:t>Expiry Notifications</w:t>
       </w:r>
     </w:p>
     <w:p>
-      <w:pPr>
-        <w:pStyle w:val="ListParagraph"/>
-        <w:numPr>
-          <w:ilvl w:val="2"/>
-          <w:numId w:val="7"/>
-        </w:numPr>
-        <w:spacing w:before="240" w:line="360" w:lineRule="auto"/>
-        <w:jc w:val="both"/>
-        <w:rPr>
-          <w:rFonts w:ascii="Times New Roman" w:hAnsi="Times New Roman" w:cs="Times New Roman"/>
-          <w:sz w:val="24"/>
-          <w:szCs w:val="24"/>
-        </w:rPr>
-      </w:pPr>
-      <w:r>
-        <w:rPr>
-          <w:rFonts w:ascii="Times New Roman" w:hAnsi="Times New Roman" w:cs="Times New Roman"/>
-          <w:sz w:val="24"/>
-          <w:szCs w:val="24"/>
-        </w:rPr>
+      <w:r>
         <w:t>Meal Planning System</w:t>
       </w:r>
     </w:p>
     <w:p>
-      <w:pPr>
-        <w:pStyle w:val="ListParagraph"/>
-        <w:numPr>
-          <w:ilvl w:val="1"/>
-          <w:numId w:val="7"/>
-        </w:numPr>
-        <w:spacing w:before="240" w:line="360" w:lineRule="auto"/>
-        <w:jc w:val="both"/>
-        <w:rPr>
-          <w:rFonts w:ascii="Times New Roman" w:hAnsi="Times New Roman" w:cs="Times New Roman"/>
-          <w:sz w:val="24"/>
-          <w:szCs w:val="24"/>
-        </w:rPr>
-      </w:pPr>
-      <w:r>
-        <w:rPr>
-          <w:rFonts w:ascii="Times New Roman" w:hAnsi="Times New Roman" w:cs="Times New Roman"/>
-          <w:b/>
-          <w:bCs/>
-          <w:sz w:val="24"/>
-          <w:szCs w:val="24"/>
-        </w:rPr>
+      <w:r>
         <w:t>Out of</w:t>
       </w:r>
       <w:r>
-        <w:rPr>
-          <w:rFonts w:ascii="Times New Roman" w:hAnsi="Times New Roman" w:cs="Times New Roman"/>
-          <w:sz w:val="24"/>
-          <w:szCs w:val="24"/>
-        </w:rPr>
         <w:t xml:space="preserve"> </w:t>
       </w:r>
       <w:r>
-        <w:rPr>
-          <w:rFonts w:ascii="Times New Roman" w:hAnsi="Times New Roman" w:cs="Times New Roman"/>
-          <w:b/>
-          <w:bCs/>
-          <w:sz w:val="24"/>
-          <w:szCs w:val="24"/>
-        </w:rPr>
         <w:t>Scope</w:t>
       </w:r>
     </w:p>
     <w:p>
-      <w:pPr>
-        <w:pStyle w:val="ListParagraph"/>
-        <w:numPr>
-          <w:ilvl w:val="2"/>
-          <w:numId w:val="7"/>
-        </w:numPr>
-        <w:spacing w:before="240" w:line="360" w:lineRule="auto"/>
-        <w:jc w:val="both"/>
-        <w:rPr>
-          <w:rFonts w:ascii="Times New Roman" w:hAnsi="Times New Roman" w:cs="Times New Roman"/>
-          <w:sz w:val="24"/>
-          <w:szCs w:val="24"/>
-        </w:rPr>
-      </w:pPr>
-      <w:r>
-        <w:rPr>
-          <w:rFonts w:ascii="Times New Roman" w:hAnsi="Times New Roman" w:cs="Times New Roman"/>
-          <w:sz w:val="24"/>
-          <w:szCs w:val="24"/>
-        </w:rPr>
+      <w:r>
         <w:t>Online Payment System</w:t>
       </w:r>
     </w:p>
     <w:p>
-      <w:pPr>
-        <w:pStyle w:val="ListParagraph"/>
-        <w:numPr>
-          <w:ilvl w:val="2"/>
-          <w:numId w:val="7"/>
-        </w:numPr>
-        <w:spacing w:before="240" w:line="360" w:lineRule="auto"/>
-        <w:jc w:val="both"/>
-        <w:rPr>
-          <w:rFonts w:ascii="Times New Roman" w:hAnsi="Times New Roman" w:cs="Times New Roman"/>
-          <w:sz w:val="24"/>
-          <w:szCs w:val="24"/>
-        </w:rPr>
-      </w:pPr>
-      <w:r>
-        <w:rPr>
-          <w:rFonts w:ascii="Times New Roman" w:hAnsi="Times New Roman" w:cs="Times New Roman"/>
-          <w:sz w:val="24"/>
-          <w:szCs w:val="24"/>
-        </w:rPr>
+      <w:r>
         <w:t>Third-party delivery services</w:t>
       </w:r>
     </w:p>
-    <w:p>
-      <w:pPr>
-        <w:pStyle w:val="ListParagraph"/>
-        <w:spacing w:before="240" w:line="360" w:lineRule="auto"/>
-        <w:ind w:left="2160"/>
-        <w:jc w:val="both"/>
-        <w:rPr>
-          <w:rFonts w:ascii="Times New Roman" w:hAnsi="Times New Roman" w:cs="Times New Roman"/>
-          <w:sz w:val="24"/>
-          <w:szCs w:val="24"/>
-        </w:rPr>
-      </w:pPr>
-    </w:p>
-    <w:p>
-      <w:pPr>
-        <w:pStyle w:val="ListParagraph"/>
-        <w:numPr>
-          <w:ilvl w:val="0"/>
-          <w:numId w:val="7"/>
-        </w:numPr>
-        <w:spacing w:before="240" w:line="360" w:lineRule="auto"/>
-        <w:jc w:val="both"/>
-        <w:rPr>
-          <w:rFonts w:ascii="Times New Roman" w:hAnsi="Times New Roman" w:cs="Times New Roman"/>
-          <w:b/>
-          <w:bCs/>
-          <w:sz w:val="24"/>
-          <w:szCs w:val="24"/>
-        </w:rPr>
-      </w:pPr>
-      <w:r>
-        <w:rPr>
-          <w:rFonts w:ascii="Times New Roman" w:hAnsi="Times New Roman" w:cs="Times New Roman"/>
-          <w:b/>
-          <w:bCs/>
-          <w:sz w:val="24"/>
-          <w:szCs w:val="24"/>
-        </w:rPr>
+    <w:p/>
+    <w:p>
+      <w:r>
         <w:t>Project Schedule</w:t>
       </w:r>
     </w:p>
     <w:p>
-      <w:pPr>
-        <w:spacing w:before="240" w:line="360" w:lineRule="auto"/>
-        <w:ind w:left="720"/>
-        <w:jc w:val="both"/>
-        <w:rPr>
-          <w:rFonts w:ascii="Times New Roman" w:hAnsi="Times New Roman" w:cs="Times New Roman"/>
-          <w:sz w:val="24"/>
-          <w:szCs w:val="24"/>
-        </w:rPr>
-      </w:pPr>
-      <w:r>
-        <w:rPr>
-          <w:rFonts w:ascii="Times New Roman" w:hAnsi="Times New Roman" w:cs="Times New Roman"/>
-          <w:sz w:val="24"/>
-          <w:szCs w:val="24"/>
-        </w:rPr>
+      <w:r>
         <w:t>The project follows an iterative and incremental methodology.</w:t>
       </w:r>
       <w:r>
-        <w:rPr>
-          <w:rFonts w:ascii="Times New Roman" w:hAnsi="Times New Roman" w:cs="Times New Roman"/>
-          <w:sz w:val="24"/>
-          <w:szCs w:val="24"/>
-        </w:rPr>
         <w:t xml:space="preserve"> It includes: </w:t>
       </w:r>
     </w:p>
     <w:p>
-      <w:pPr>
-        <w:pStyle w:val="ListParagraph"/>
-        <w:numPr>
-          <w:ilvl w:val="1"/>
-          <w:numId w:val="7"/>
-        </w:numPr>
-        <w:spacing w:before="240" w:line="360" w:lineRule="auto"/>
-        <w:jc w:val="both"/>
-        <w:rPr>
-          <w:rFonts w:ascii="Times New Roman" w:hAnsi="Times New Roman" w:cs="Times New Roman"/>
-          <w:sz w:val="24"/>
-          <w:szCs w:val="24"/>
-        </w:rPr>
-      </w:pPr>
-      <w:r>
-        <w:rPr>
-          <w:rFonts w:ascii="Times New Roman" w:hAnsi="Times New Roman" w:cs="Times New Roman"/>
-          <w:sz w:val="24"/>
-          <w:szCs w:val="24"/>
-        </w:rPr>
+      <w:r>
         <w:t>Work Breakdown Structure (WBS)</w:t>
       </w:r>
     </w:p>
     <w:p>
-      <w:pPr>
-        <w:pStyle w:val="ListParagraph"/>
-        <w:numPr>
-          <w:ilvl w:val="1"/>
-          <w:numId w:val="7"/>
-        </w:numPr>
-        <w:spacing w:before="240" w:line="360" w:lineRule="auto"/>
-        <w:jc w:val="both"/>
-        <w:rPr>
-          <w:rFonts w:ascii="Times New Roman" w:hAnsi="Times New Roman" w:cs="Times New Roman"/>
-          <w:sz w:val="24"/>
-          <w:szCs w:val="24"/>
-        </w:rPr>
-      </w:pPr>
-      <w:r>
-        <w:rPr>
-          <w:rFonts w:ascii="Times New Roman" w:hAnsi="Times New Roman" w:cs="Times New Roman"/>
-          <w:sz w:val="24"/>
-          <w:szCs w:val="24"/>
-        </w:rPr>
+      <w:r>
         <w:t>Gantt Chart</w:t>
       </w:r>
     </w:p>
     <w:p>
-      <w:pPr>
-        <w:pStyle w:val="ListParagraph"/>
-        <w:numPr>
-          <w:ilvl w:val="1"/>
-          <w:numId w:val="7"/>
-        </w:numPr>
-        <w:spacing w:before="240" w:line="360" w:lineRule="auto"/>
-        <w:jc w:val="both"/>
-        <w:rPr>
-          <w:rFonts w:ascii="Times New Roman" w:hAnsi="Times New Roman" w:cs="Times New Roman"/>
-          <w:sz w:val="24"/>
-          <w:szCs w:val="24"/>
-        </w:rPr>
-      </w:pPr>
-      <w:r>
-        <w:rPr>
-          <w:rFonts w:ascii="Times New Roman" w:hAnsi="Times New Roman" w:cs="Times New Roman"/>
-          <w:sz w:val="24"/>
-          <w:szCs w:val="24"/>
-        </w:rPr>
+      <w:r>
         <w:t>Milestones</w:t>
       </w:r>
     </w:p>
-    <w:p>
-      <w:pPr>
-        <w:pStyle w:val="ListParagraph"/>
-        <w:spacing w:before="240" w:line="360" w:lineRule="auto"/>
-        <w:ind w:left="1440"/>
-        <w:jc w:val="both"/>
-        <w:rPr>
-          <w:rFonts w:ascii="Times New Roman" w:hAnsi="Times New Roman" w:cs="Times New Roman"/>
-          <w:sz w:val="24"/>
-          <w:szCs w:val="24"/>
-        </w:rPr>
-      </w:pPr>
-    </w:p>
-    <w:p>
-      <w:pPr>
-        <w:pStyle w:val="ListParagraph"/>
-        <w:numPr>
-          <w:ilvl w:val="0"/>
-          <w:numId w:val="7"/>
-        </w:numPr>
-        <w:spacing w:before="240" w:line="360" w:lineRule="auto"/>
-        <w:jc w:val="both"/>
-        <w:rPr>
-          <w:rFonts w:ascii="Times New Roman" w:hAnsi="Times New Roman" w:cs="Times New Roman"/>
-          <w:b/>
-          <w:bCs/>
-          <w:sz w:val="24"/>
-          <w:szCs w:val="24"/>
-        </w:rPr>
-      </w:pPr>
-      <w:r>
-        <w:rPr>
-          <w:rFonts w:ascii="Times New Roman" w:hAnsi="Times New Roman" w:cs="Times New Roman"/>
-          <w:b/>
-          <w:bCs/>
-          <w:sz w:val="24"/>
-          <w:szCs w:val="24"/>
-        </w:rPr>
+    <w:p/>
+    <w:p>
+      <w:r>
         <w:t>Technical Description</w:t>
       </w:r>
     </w:p>
     <w:p>
-      <w:pPr>
-        <w:pStyle w:val="ListParagraph"/>
-        <w:numPr>
-          <w:ilvl w:val="1"/>
-          <w:numId w:val="7"/>
-        </w:numPr>
-        <w:spacing w:before="240" w:line="360" w:lineRule="auto"/>
-        <w:jc w:val="both"/>
-        <w:rPr>
-          <w:rFonts w:ascii="Times New Roman" w:hAnsi="Times New Roman" w:cs="Times New Roman"/>
-          <w:b/>
-          <w:bCs/>
-          <w:sz w:val="24"/>
-          <w:szCs w:val="24"/>
-        </w:rPr>
-      </w:pPr>
-      <w:r>
-        <w:rPr>
-          <w:rFonts w:ascii="Times New Roman" w:hAnsi="Times New Roman" w:cs="Times New Roman"/>
-          <w:b/>
-          <w:bCs/>
-          <w:sz w:val="24"/>
-          <w:szCs w:val="24"/>
-        </w:rPr>
+      <w:r>
         <w:t>Development Platform</w:t>
       </w:r>
     </w:p>
@@ -1986,27 +1393,7 @@
             <w:tcW w:w="2241" w:type="dxa"/>
           </w:tcPr>
           <w:p>
-            <w:pPr>
-              <w:pStyle w:val="ListParagraph"/>
-              <w:spacing w:before="240" w:line="360" w:lineRule="auto"/>
-              <w:ind w:left="0"/>
-              <w:jc w:val="both"/>
-              <w:rPr>
-                <w:rFonts w:ascii="Times New Roman" w:hAnsi="Times New Roman" w:cs="Times New Roman"/>
-                <w:b/>
-                <w:bCs/>
-                <w:sz w:val="24"/>
-                <w:szCs w:val="24"/>
-              </w:rPr>
-            </w:pPr>
             <w:r>
-              <w:rPr>
-                <w:rFonts w:ascii="Times New Roman" w:hAnsi="Times New Roman" w:cs="Times New Roman"/>
-                <w:b/>
-                <w:bCs/>
-                <w:sz w:val="24"/>
-                <w:szCs w:val="24"/>
-              </w:rPr>
               <w:t>Criteria</w:t>
             </w:r>
           </w:p>
@@ -2016,27 +1403,7 @@
             <w:tcW w:w="1417" w:type="dxa"/>
           </w:tcPr>
           <w:p>
-            <w:pPr>
-              <w:pStyle w:val="ListParagraph"/>
-              <w:spacing w:before="240" w:line="360" w:lineRule="auto"/>
-              <w:ind w:left="0"/>
-              <w:jc w:val="both"/>
-              <w:rPr>
-                <w:rFonts w:ascii="Times New Roman" w:hAnsi="Times New Roman" w:cs="Times New Roman"/>
-                <w:b/>
-                <w:bCs/>
-                <w:sz w:val="24"/>
-                <w:szCs w:val="24"/>
-              </w:rPr>
-            </w:pPr>
             <w:r>
-              <w:rPr>
-                <w:rFonts w:ascii="Times New Roman" w:hAnsi="Times New Roman" w:cs="Times New Roman"/>
-                <w:b/>
-                <w:bCs/>
-                <w:sz w:val="24"/>
-                <w:szCs w:val="24"/>
-              </w:rPr>
               <w:t>Tools</w:t>
             </w:r>
           </w:p>
@@ -2046,27 +1413,7 @@
             <w:tcW w:w="1276" w:type="dxa"/>
           </w:tcPr>
           <w:p>
-            <w:pPr>
-              <w:pStyle w:val="ListParagraph"/>
-              <w:spacing w:before="240" w:line="360" w:lineRule="auto"/>
-              <w:ind w:left="0"/>
-              <w:jc w:val="both"/>
-              <w:rPr>
-                <w:rFonts w:ascii="Times New Roman" w:hAnsi="Times New Roman" w:cs="Times New Roman"/>
-                <w:b/>
-                <w:bCs/>
-                <w:sz w:val="24"/>
-                <w:szCs w:val="24"/>
-              </w:rPr>
-            </w:pPr>
             <w:r>
-              <w:rPr>
-                <w:rFonts w:ascii="Times New Roman" w:hAnsi="Times New Roman" w:cs="Times New Roman"/>
-                <w:b/>
-                <w:bCs/>
-                <w:sz w:val="24"/>
-                <w:szCs w:val="24"/>
-              </w:rPr>
               <w:t xml:space="preserve">Version </w:t>
             </w:r>
           </w:p>
@@ -2076,27 +1423,7 @@
             <w:tcW w:w="2552" w:type="dxa"/>
           </w:tcPr>
           <w:p>
-            <w:pPr>
-              <w:pStyle w:val="ListParagraph"/>
-              <w:spacing w:before="240" w:line="360" w:lineRule="auto"/>
-              <w:ind w:left="0"/>
-              <w:jc w:val="both"/>
-              <w:rPr>
-                <w:rFonts w:ascii="Times New Roman" w:hAnsi="Times New Roman" w:cs="Times New Roman"/>
-                <w:b/>
-                <w:bCs/>
-                <w:sz w:val="24"/>
-                <w:szCs w:val="24"/>
-              </w:rPr>
-            </w:pPr>
             <w:r>
-              <w:rPr>
-                <w:rFonts w:ascii="Times New Roman" w:hAnsi="Times New Roman" w:cs="Times New Roman"/>
-                <w:b/>
-                <w:bCs/>
-                <w:sz w:val="24"/>
-                <w:szCs w:val="24"/>
-              </w:rPr>
               <w:t>Description</w:t>
             </w:r>
           </w:p>
@@ -2108,23 +1435,7 @@
             <w:tcW w:w="2241" w:type="dxa"/>
           </w:tcPr>
           <w:p>
-            <w:pPr>
-              <w:pStyle w:val="ListParagraph"/>
-              <w:spacing w:before="240" w:line="360" w:lineRule="auto"/>
-              <w:ind w:left="0"/>
-              <w:jc w:val="both"/>
-              <w:rPr>
-                <w:rFonts w:ascii="Times New Roman" w:hAnsi="Times New Roman" w:cs="Times New Roman"/>
-                <w:sz w:val="24"/>
-                <w:szCs w:val="24"/>
-              </w:rPr>
-            </w:pPr>
             <w:r>
-              <w:rPr>
-                <w:rFonts w:ascii="Times New Roman" w:hAnsi="Times New Roman" w:cs="Times New Roman"/>
-                <w:sz w:val="24"/>
-                <w:szCs w:val="24"/>
-              </w:rPr>
               <w:t>Design &amp; Prototype</w:t>
             </w:r>
           </w:p>
@@ -2134,23 +1445,7 @@
             <w:tcW w:w="1417" w:type="dxa"/>
           </w:tcPr>
           <w:p>
-            <w:pPr>
-              <w:pStyle w:val="ListParagraph"/>
-              <w:spacing w:before="240" w:line="360" w:lineRule="auto"/>
-              <w:ind w:left="0"/>
-              <w:jc w:val="center"/>
-              <w:rPr>
-                <w:rFonts w:ascii="Times New Roman" w:hAnsi="Times New Roman" w:cs="Times New Roman"/>
-                <w:sz w:val="24"/>
-                <w:szCs w:val="24"/>
-              </w:rPr>
-            </w:pPr>
             <w:r>
-              <w:rPr>
-                <w:rFonts w:ascii="Times New Roman" w:hAnsi="Times New Roman" w:cs="Times New Roman"/>
-                <w:sz w:val="24"/>
-                <w:szCs w:val="24"/>
-              </w:rPr>
               <w:t>Figma</w:t>
             </w:r>
           </w:p>
@@ -2160,23 +1455,7 @@
             <w:tcW w:w="1276" w:type="dxa"/>
           </w:tcPr>
           <w:p>
-            <w:pPr>
-              <w:pStyle w:val="ListParagraph"/>
-              <w:spacing w:before="240" w:line="360" w:lineRule="auto"/>
-              <w:ind w:left="0"/>
-              <w:jc w:val="center"/>
-              <w:rPr>
-                <w:rFonts w:ascii="Times New Roman" w:hAnsi="Times New Roman" w:cs="Times New Roman"/>
-                <w:sz w:val="24"/>
-                <w:szCs w:val="24"/>
-              </w:rPr>
-            </w:pPr>
             <w:r>
-              <w:rPr>
-                <w:rFonts w:ascii="Times New Roman" w:hAnsi="Times New Roman" w:cs="Times New Roman"/>
-                <w:sz w:val="24"/>
-                <w:szCs w:val="24"/>
-              </w:rPr>
               <w:t>Latest</w:t>
             </w:r>
           </w:p>
@@ -2186,23 +1465,7 @@
             <w:tcW w:w="2552" w:type="dxa"/>
           </w:tcPr>
           <w:p>
-            <w:pPr>
-              <w:pStyle w:val="ListParagraph"/>
-              <w:spacing w:before="240" w:line="360" w:lineRule="auto"/>
-              <w:ind w:left="0"/>
-              <w:jc w:val="both"/>
-              <w:rPr>
-                <w:rFonts w:ascii="Times New Roman" w:hAnsi="Times New Roman" w:cs="Times New Roman"/>
-                <w:sz w:val="24"/>
-                <w:szCs w:val="24"/>
-              </w:rPr>
-            </w:pPr>
             <w:r>
-              <w:rPr>
-                <w:rFonts w:ascii="Times New Roman" w:hAnsi="Times New Roman" w:cs="Times New Roman"/>
-                <w:sz w:val="24"/>
-                <w:szCs w:val="24"/>
-              </w:rPr>
               <w:t>UI design and prototype</w:t>
             </w:r>
           </w:p>
@@ -2214,23 +1477,7 @@
             <w:tcW w:w="2241" w:type="dxa"/>
           </w:tcPr>
           <w:p>
-            <w:pPr>
-              <w:pStyle w:val="ListParagraph"/>
-              <w:spacing w:before="240" w:line="360" w:lineRule="auto"/>
-              <w:ind w:left="0"/>
-              <w:jc w:val="both"/>
-              <w:rPr>
-                <w:rFonts w:ascii="Times New Roman" w:hAnsi="Times New Roman" w:cs="Times New Roman"/>
-                <w:sz w:val="24"/>
-                <w:szCs w:val="24"/>
-              </w:rPr>
-            </w:pPr>
             <w:r>
-              <w:rPr>
-                <w:rFonts w:ascii="Times New Roman" w:hAnsi="Times New Roman" w:cs="Times New Roman"/>
-                <w:sz w:val="24"/>
-                <w:szCs w:val="24"/>
-              </w:rPr>
               <w:t>Frontend</w:t>
             </w:r>
           </w:p>
@@ -2240,23 +1487,7 @@
             <w:tcW w:w="1417" w:type="dxa"/>
           </w:tcPr>
           <w:p>
-            <w:pPr>
-              <w:pStyle w:val="ListParagraph"/>
-              <w:spacing w:before="240" w:line="360" w:lineRule="auto"/>
-              <w:ind w:left="0"/>
-              <w:jc w:val="center"/>
-              <w:rPr>
-                <w:rFonts w:ascii="Times New Roman" w:hAnsi="Times New Roman" w:cs="Times New Roman"/>
-                <w:sz w:val="24"/>
-                <w:szCs w:val="24"/>
-              </w:rPr>
-            </w:pPr>
             <w:r>
-              <w:rPr>
-                <w:rFonts w:ascii="Times New Roman" w:hAnsi="Times New Roman" w:cs="Times New Roman"/>
-                <w:sz w:val="24"/>
-                <w:szCs w:val="24"/>
-              </w:rPr>
               <w:t>React</w:t>
             </w:r>
           </w:p>
@@ -2266,23 +1497,7 @@
             <w:tcW w:w="1276" w:type="dxa"/>
           </w:tcPr>
           <w:p>
-            <w:pPr>
-              <w:pStyle w:val="ListParagraph"/>
-              <w:spacing w:before="240" w:line="360" w:lineRule="auto"/>
-              <w:ind w:left="0"/>
-              <w:jc w:val="center"/>
-              <w:rPr>
-                <w:rFonts w:ascii="Times New Roman" w:hAnsi="Times New Roman" w:cs="Times New Roman"/>
-                <w:sz w:val="24"/>
-                <w:szCs w:val="24"/>
-              </w:rPr>
-            </w:pPr>
             <w:r>
-              <w:rPr>
-                <w:rFonts w:ascii="Times New Roman" w:hAnsi="Times New Roman" w:cs="Times New Roman"/>
-                <w:sz w:val="24"/>
-                <w:szCs w:val="24"/>
-              </w:rPr>
               <w:t>Latest</w:t>
             </w:r>
           </w:p>
@@ -2292,23 +1507,7 @@
             <w:tcW w:w="2552" w:type="dxa"/>
           </w:tcPr>
           <w:p>
-            <w:pPr>
-              <w:pStyle w:val="ListParagraph"/>
-              <w:spacing w:before="240" w:line="360" w:lineRule="auto"/>
-              <w:ind w:left="0"/>
-              <w:jc w:val="both"/>
-              <w:rPr>
-                <w:rFonts w:ascii="Times New Roman" w:hAnsi="Times New Roman" w:cs="Times New Roman"/>
-                <w:sz w:val="24"/>
-                <w:szCs w:val="24"/>
-              </w:rPr>
-            </w:pPr>
             <w:r>
-              <w:rPr>
-                <w:rFonts w:ascii="Times New Roman" w:hAnsi="Times New Roman" w:cs="Times New Roman"/>
-                <w:sz w:val="24"/>
-                <w:szCs w:val="24"/>
-              </w:rPr>
               <w:t>UI development</w:t>
             </w:r>
           </w:p>
@@ -2320,23 +1519,7 @@
             <w:tcW w:w="2241" w:type="dxa"/>
           </w:tcPr>
           <w:p>
-            <w:pPr>
-              <w:pStyle w:val="ListParagraph"/>
-              <w:spacing w:before="240" w:line="360" w:lineRule="auto"/>
-              <w:ind w:left="0"/>
-              <w:jc w:val="both"/>
-              <w:rPr>
-                <w:rFonts w:ascii="Times New Roman" w:hAnsi="Times New Roman" w:cs="Times New Roman"/>
-                <w:sz w:val="24"/>
-                <w:szCs w:val="24"/>
-              </w:rPr>
-            </w:pPr>
             <w:r>
-              <w:rPr>
-                <w:rFonts w:ascii="Times New Roman" w:hAnsi="Times New Roman" w:cs="Times New Roman"/>
-                <w:sz w:val="24"/>
-                <w:szCs w:val="24"/>
-              </w:rPr>
               <w:t>Backend</w:t>
             </w:r>
           </w:p>
@@ -2346,23 +1529,7 @@
             <w:tcW w:w="1417" w:type="dxa"/>
           </w:tcPr>
           <w:p>
-            <w:pPr>
-              <w:pStyle w:val="ListParagraph"/>
-              <w:spacing w:before="240" w:line="360" w:lineRule="auto"/>
-              <w:ind w:left="0"/>
-              <w:jc w:val="center"/>
-              <w:rPr>
-                <w:rFonts w:ascii="Times New Roman" w:hAnsi="Times New Roman" w:cs="Times New Roman"/>
-                <w:sz w:val="24"/>
-                <w:szCs w:val="24"/>
-              </w:rPr>
-            </w:pPr>
             <w:r>
-              <w:rPr>
-                <w:rFonts w:ascii="Times New Roman" w:hAnsi="Times New Roman" w:cs="Times New Roman"/>
-                <w:sz w:val="24"/>
-                <w:szCs w:val="24"/>
-              </w:rPr>
               <w:t>Spring Boot</w:t>
             </w:r>
           </w:p>
@@ -2372,23 +1539,7 @@
             <w:tcW w:w="1276" w:type="dxa"/>
           </w:tcPr>
           <w:p>
-            <w:pPr>
-              <w:pStyle w:val="ListParagraph"/>
-              <w:spacing w:before="240" w:line="360" w:lineRule="auto"/>
-              <w:ind w:left="0"/>
-              <w:jc w:val="center"/>
-              <w:rPr>
-                <w:rFonts w:ascii="Times New Roman" w:hAnsi="Times New Roman" w:cs="Times New Roman"/>
-                <w:sz w:val="24"/>
-                <w:szCs w:val="24"/>
-              </w:rPr>
-            </w:pPr>
             <w:r>
-              <w:rPr>
-                <w:rFonts w:ascii="Times New Roman" w:hAnsi="Times New Roman" w:cs="Times New Roman"/>
-                <w:sz w:val="24"/>
-                <w:szCs w:val="24"/>
-              </w:rPr>
               <w:t>Latest</w:t>
             </w:r>
           </w:p>
@@ -2398,23 +1549,7 @@
             <w:tcW w:w="2552" w:type="dxa"/>
           </w:tcPr>
           <w:p>
-            <w:pPr>
-              <w:pStyle w:val="ListParagraph"/>
-              <w:spacing w:before="240" w:line="360" w:lineRule="auto"/>
-              <w:ind w:left="0"/>
-              <w:jc w:val="both"/>
-              <w:rPr>
-                <w:rFonts w:ascii="Times New Roman" w:hAnsi="Times New Roman" w:cs="Times New Roman"/>
-                <w:sz w:val="24"/>
-                <w:szCs w:val="24"/>
-              </w:rPr>
-            </w:pPr>
             <w:r>
-              <w:rPr>
-                <w:rFonts w:ascii="Times New Roman" w:hAnsi="Times New Roman" w:cs="Times New Roman"/>
-                <w:sz w:val="24"/>
-                <w:szCs w:val="24"/>
-              </w:rPr>
               <w:t>Server Logic</w:t>
             </w:r>
           </w:p>
@@ -2426,23 +1561,7 @@
             <w:tcW w:w="2241" w:type="dxa"/>
           </w:tcPr>
           <w:p>
-            <w:pPr>
-              <w:pStyle w:val="ListParagraph"/>
-              <w:spacing w:before="240" w:line="360" w:lineRule="auto"/>
-              <w:ind w:left="0"/>
-              <w:jc w:val="both"/>
-              <w:rPr>
-                <w:rFonts w:ascii="Times New Roman" w:hAnsi="Times New Roman" w:cs="Times New Roman"/>
-                <w:sz w:val="24"/>
-                <w:szCs w:val="24"/>
-              </w:rPr>
-            </w:pPr>
             <w:r>
-              <w:rPr>
-                <w:rFonts w:ascii="Times New Roman" w:hAnsi="Times New Roman" w:cs="Times New Roman"/>
-                <w:sz w:val="24"/>
-                <w:szCs w:val="24"/>
-              </w:rPr>
               <w:t>Database</w:t>
             </w:r>
           </w:p>
@@ -2452,23 +1571,7 @@
             <w:tcW w:w="1417" w:type="dxa"/>
           </w:tcPr>
           <w:p>
-            <w:pPr>
-              <w:pStyle w:val="ListParagraph"/>
-              <w:spacing w:before="240" w:line="360" w:lineRule="auto"/>
-              <w:ind w:left="0"/>
-              <w:jc w:val="center"/>
-              <w:rPr>
-                <w:rFonts w:ascii="Times New Roman" w:hAnsi="Times New Roman" w:cs="Times New Roman"/>
-                <w:sz w:val="24"/>
-                <w:szCs w:val="24"/>
-              </w:rPr>
-            </w:pPr>
             <w:r>
-              <w:rPr>
-                <w:rFonts w:ascii="Times New Roman" w:hAnsi="Times New Roman" w:cs="Times New Roman"/>
-                <w:sz w:val="24"/>
-                <w:szCs w:val="24"/>
-              </w:rPr>
               <w:t>SQL</w:t>
             </w:r>
           </w:p>
@@ -2478,23 +1581,7 @@
             <w:tcW w:w="1276" w:type="dxa"/>
           </w:tcPr>
           <w:p>
-            <w:pPr>
-              <w:pStyle w:val="ListParagraph"/>
-              <w:spacing w:before="240" w:line="360" w:lineRule="auto"/>
-              <w:ind w:left="0"/>
-              <w:jc w:val="center"/>
-              <w:rPr>
-                <w:rFonts w:ascii="Times New Roman" w:hAnsi="Times New Roman" w:cs="Times New Roman"/>
-                <w:sz w:val="24"/>
-                <w:szCs w:val="24"/>
-              </w:rPr>
-            </w:pPr>
             <w:r>
-              <w:rPr>
-                <w:rFonts w:ascii="Times New Roman" w:hAnsi="Times New Roman" w:cs="Times New Roman"/>
-                <w:sz w:val="24"/>
-                <w:szCs w:val="24"/>
-              </w:rPr>
               <w:t>Latest</w:t>
             </w:r>
           </w:p>
@@ -2504,23 +1591,7 @@
             <w:tcW w:w="2552" w:type="dxa"/>
           </w:tcPr>
           <w:p>
-            <w:pPr>
-              <w:pStyle w:val="ListParagraph"/>
-              <w:spacing w:before="240" w:line="360" w:lineRule="auto"/>
-              <w:ind w:left="0"/>
-              <w:jc w:val="both"/>
-              <w:rPr>
-                <w:rFonts w:ascii="Times New Roman" w:hAnsi="Times New Roman" w:cs="Times New Roman"/>
-                <w:sz w:val="24"/>
-                <w:szCs w:val="24"/>
-              </w:rPr>
-            </w:pPr>
             <w:r>
-              <w:rPr>
-                <w:rFonts w:ascii="Times New Roman" w:hAnsi="Times New Roman" w:cs="Times New Roman"/>
-                <w:sz w:val="24"/>
-                <w:szCs w:val="24"/>
-              </w:rPr>
               <w:t>Data Storage</w:t>
             </w:r>
           </w:p>
@@ -2532,23 +1603,7 @@
             <w:tcW w:w="2241" w:type="dxa"/>
           </w:tcPr>
           <w:p>
-            <w:pPr>
-              <w:pStyle w:val="ListParagraph"/>
-              <w:spacing w:before="240" w:line="360" w:lineRule="auto"/>
-              <w:ind w:left="0"/>
-              <w:jc w:val="both"/>
-              <w:rPr>
-                <w:rFonts w:ascii="Times New Roman" w:hAnsi="Times New Roman" w:cs="Times New Roman"/>
-                <w:sz w:val="24"/>
-                <w:szCs w:val="24"/>
-              </w:rPr>
-            </w:pPr>
             <w:r>
-              <w:rPr>
-                <w:rFonts w:ascii="Times New Roman" w:hAnsi="Times New Roman" w:cs="Times New Roman"/>
-                <w:sz w:val="24"/>
-                <w:szCs w:val="24"/>
-              </w:rPr>
               <w:t>Version Control</w:t>
             </w:r>
           </w:p>
@@ -2558,23 +1613,7 @@
             <w:tcW w:w="1417" w:type="dxa"/>
           </w:tcPr>
           <w:p>
-            <w:pPr>
-              <w:pStyle w:val="ListParagraph"/>
-              <w:spacing w:before="240" w:line="360" w:lineRule="auto"/>
-              <w:ind w:left="0"/>
-              <w:jc w:val="center"/>
-              <w:rPr>
-                <w:rFonts w:ascii="Times New Roman" w:hAnsi="Times New Roman" w:cs="Times New Roman"/>
-                <w:sz w:val="24"/>
-                <w:szCs w:val="24"/>
-              </w:rPr>
-            </w:pPr>
             <w:r>
-              <w:rPr>
-                <w:rFonts w:ascii="Times New Roman" w:hAnsi="Times New Roman" w:cs="Times New Roman"/>
-                <w:sz w:val="24"/>
-                <w:szCs w:val="24"/>
-              </w:rPr>
               <w:t>GitHub</w:t>
             </w:r>
           </w:p>
@@ -2584,23 +1623,7 @@
             <w:tcW w:w="1276" w:type="dxa"/>
           </w:tcPr>
           <w:p>
-            <w:pPr>
-              <w:pStyle w:val="ListParagraph"/>
-              <w:spacing w:before="240" w:line="360" w:lineRule="auto"/>
-              <w:ind w:left="0"/>
-              <w:jc w:val="center"/>
-              <w:rPr>
-                <w:rFonts w:ascii="Times New Roman" w:hAnsi="Times New Roman" w:cs="Times New Roman"/>
-                <w:sz w:val="24"/>
-                <w:szCs w:val="24"/>
-              </w:rPr>
-            </w:pPr>
             <w:r>
-              <w:rPr>
-                <w:rFonts w:ascii="Times New Roman" w:hAnsi="Times New Roman" w:cs="Times New Roman"/>
-                <w:sz w:val="24"/>
-                <w:szCs w:val="24"/>
-              </w:rPr>
               <w:t>Latest</w:t>
             </w:r>
           </w:p>
@@ -2610,67 +1633,16 @@
             <w:tcW w:w="2552" w:type="dxa"/>
           </w:tcPr>
           <w:p>
-            <w:pPr>
-              <w:pStyle w:val="ListParagraph"/>
-              <w:spacing w:before="240" w:line="360" w:lineRule="auto"/>
-              <w:ind w:left="0"/>
-              <w:jc w:val="both"/>
-              <w:rPr>
-                <w:rFonts w:ascii="Times New Roman" w:hAnsi="Times New Roman" w:cs="Times New Roman"/>
-                <w:sz w:val="24"/>
-                <w:szCs w:val="24"/>
-              </w:rPr>
-            </w:pPr>
             <w:r>
-              <w:rPr>
-                <w:rFonts w:ascii="Times New Roman" w:hAnsi="Times New Roman" w:cs="Times New Roman"/>
-                <w:sz w:val="24"/>
-                <w:szCs w:val="24"/>
-              </w:rPr>
               <w:t>Collaboration</w:t>
             </w:r>
           </w:p>
         </w:tc>
       </w:tr>
     </w:tbl>
-    <w:p>
-      <w:pPr>
-        <w:pStyle w:val="ListParagraph"/>
-        <w:spacing w:before="240" w:line="360" w:lineRule="auto"/>
-        <w:ind w:left="1440"/>
-        <w:jc w:val="both"/>
-        <w:rPr>
-          <w:rFonts w:ascii="Times New Roman" w:hAnsi="Times New Roman" w:cs="Times New Roman"/>
-          <w:sz w:val="24"/>
-          <w:szCs w:val="24"/>
-        </w:rPr>
-      </w:pPr>
-    </w:p>
-    <w:p>
-      <w:pPr>
-        <w:pStyle w:val="ListParagraph"/>
-        <w:numPr>
-          <w:ilvl w:val="1"/>
-          <w:numId w:val="7"/>
-        </w:numPr>
-        <w:spacing w:before="240" w:line="360" w:lineRule="auto"/>
-        <w:jc w:val="both"/>
-        <w:rPr>
-          <w:rFonts w:ascii="Times New Roman" w:hAnsi="Times New Roman" w:cs="Times New Roman"/>
-          <w:b/>
-          <w:bCs/>
-          <w:sz w:val="24"/>
-          <w:szCs w:val="24"/>
-        </w:rPr>
-      </w:pPr>
-      <w:r>
-        <w:rPr>
-          <w:rFonts w:ascii="Times New Roman" w:hAnsi="Times New Roman" w:cs="Times New Roman"/>
-          <w:b/>
-          <w:bCs/>
-          <w:sz w:val="24"/>
-          <w:szCs w:val="24"/>
-        </w:rPr>
+    <w:p/>
+    <w:p>
+      <w:r>
         <w:t>Demonstration Platform</w:t>
       </w:r>
     </w:p>
@@ -2693,121 +1665,226 @@
             <w:tcW w:w="2241" w:type="dxa"/>
           </w:tcPr>
           <w:p>
+            <w:r>
+              <w:t>Criteria</w:t>
+            </w:r>
+          </w:p>
+        </w:tc>
+        <w:tc>
+          <w:tcPr>
+            <w:tcW w:w="1417" w:type="dxa"/>
+          </w:tcPr>
+          <w:p>
+            <w:r>
+              <w:t>Tools</w:t>
+            </w:r>
+          </w:p>
+        </w:tc>
+        <w:tc>
+          <w:tcPr>
+            <w:tcW w:w="1276" w:type="dxa"/>
+          </w:tcPr>
+          <w:p>
+            <w:r>
+              <w:t xml:space="preserve">Version </w:t>
+            </w:r>
+          </w:p>
+        </w:tc>
+        <w:tc>
+          <w:tcPr>
+            <w:tcW w:w="2552" w:type="dxa"/>
+          </w:tcPr>
+          <w:p>
+            <w:r>
+              <w:t>Description</w:t>
+            </w:r>
+          </w:p>
+        </w:tc>
+      </w:tr>
+      <w:tr>
+        <w:tc>
+          <w:tcPr>
+            <w:tcW w:w="2241" w:type="dxa"/>
+          </w:tcPr>
+          <w:p>
+            <w:r>
+              <w:t>Browser</w:t>
+            </w:r>
+          </w:p>
+        </w:tc>
+        <w:tc>
+          <w:tcPr>
+            <w:tcW w:w="1417" w:type="dxa"/>
+          </w:tcPr>
+          <w:p>
+            <w:r>
+              <w:t>Chrome</w:t>
+            </w:r>
+          </w:p>
+        </w:tc>
+        <w:tc>
+          <w:tcPr>
+            <w:tcW w:w="1276" w:type="dxa"/>
+          </w:tcPr>
+          <w:p>
+            <w:r>
+              <w:t>Latest</w:t>
+            </w:r>
+          </w:p>
+        </w:tc>
+        <w:tc>
+          <w:tcPr>
+            <w:tcW w:w="2552" w:type="dxa"/>
+          </w:tcPr>
+          <w:p>
+            <w:r>
+              <w:t>Testing</w:t>
+            </w:r>
+          </w:p>
+        </w:tc>
+      </w:tr>
+    </w:tbl>
+    <w:p>
+      <w:pPr>
+        <w:spacing w:before="240" w:line="360" w:lineRule="auto"/>
+        <w:jc w:val="both"/>
+        <w:rPr>
+          <w:rFonts w:cs="Times New Roman"/>
+          <w:szCs w:val="24"/>
+        </w:rPr>
+      </w:pPr>
+    </w:p>
+    <w:p>
+      <w:pPr>
+        <w:pStyle w:val="Main-Heading"/>
+      </w:pPr>
+      <w:r>
+        <w:t>Risk Management Plan</w:t>
+      </w:r>
+    </w:p>
+    <w:p>
+      <w:r>
+        <w:t xml:space="preserve">The following table clearly identifies the risk related with our project </w:t>
+      </w:r>
+      <w:proofErr w:type="spellStart"/>
+      <w:r>
+        <w:t>ZeroWaste</w:t>
+      </w:r>
+      <w:proofErr w:type="spellEnd"/>
+      <w:r>
+        <w:t xml:space="preserve">. Here explains, what kind of risk we may face, what is </w:t>
+      </w:r>
+      <w:proofErr w:type="gramStart"/>
+      <w:r>
+        <w:t>there</w:t>
+      </w:r>
+      <w:proofErr w:type="gramEnd"/>
+      <w:r>
+        <w:t xml:space="preserve"> likelihood to occur and how can be move past it:</w:t>
+      </w:r>
+    </w:p>
+    <w:tbl>
+      <w:tblPr>
+        <w:tblStyle w:val="TableGrid"/>
+        <w:tblW w:w="0" w:type="auto"/>
+        <w:tblLook w:val="04A0" w:firstRow="1" w:lastRow="0" w:firstColumn="1" w:lastColumn="0" w:noHBand="0" w:noVBand="1"/>
+      </w:tblPr>
+      <w:tblGrid>
+        <w:gridCol w:w="2254"/>
+        <w:gridCol w:w="2254"/>
+        <w:gridCol w:w="2254"/>
+        <w:gridCol w:w="2254"/>
+      </w:tblGrid>
+      <w:tr>
+        <w:trPr>
+          <w:trHeight w:val="530"/>
+        </w:trPr>
+        <w:tc>
+          <w:tcPr>
+            <w:tcW w:w="2254" w:type="dxa"/>
+            <w:vAlign w:val="center"/>
+          </w:tcPr>
+          <w:p>
             <w:pPr>
-              <w:pStyle w:val="ListParagraph"/>
-              <w:numPr>
-                <w:ilvl w:val="0"/>
-                <w:numId w:val="7"/>
-              </w:numPr>
-              <w:spacing w:before="240" w:line="360" w:lineRule="auto"/>
-              <w:jc w:val="both"/>
+              <w:jc w:val="center"/>
               <w:rPr>
-                <w:rFonts w:ascii="Times New Roman" w:hAnsi="Times New Roman" w:cs="Times New Roman"/>
                 <w:b/>
                 <w:bCs/>
-                <w:sz w:val="24"/>
-                <w:szCs w:val="24"/>
               </w:rPr>
             </w:pPr>
             <w:r>
               <w:rPr>
-                <w:rFonts w:ascii="Times New Roman" w:hAnsi="Times New Roman" w:cs="Times New Roman"/>
                 <w:b/>
                 <w:bCs/>
-                <w:sz w:val="24"/>
-                <w:szCs w:val="24"/>
               </w:rPr>
-              <w:t>Criteria</w:t>
+              <w:lastRenderedPageBreak/>
+              <w:t>Risk Name</w:t>
             </w:r>
           </w:p>
         </w:tc>
         <w:tc>
           <w:tcPr>
-            <w:tcW w:w="1417" w:type="dxa"/>
+            <w:tcW w:w="2254" w:type="dxa"/>
+            <w:vAlign w:val="center"/>
           </w:tcPr>
           <w:p>
             <w:pPr>
-              <w:pStyle w:val="ListParagraph"/>
-              <w:spacing w:before="240" w:line="360" w:lineRule="auto"/>
-              <w:ind w:left="0"/>
-              <w:jc w:val="both"/>
+              <w:jc w:val="center"/>
               <w:rPr>
-                <w:rFonts w:ascii="Times New Roman" w:hAnsi="Times New Roman" w:cs="Times New Roman"/>
                 <w:b/>
                 <w:bCs/>
-                <w:sz w:val="24"/>
-                <w:szCs w:val="24"/>
               </w:rPr>
             </w:pPr>
             <w:r>
               <w:rPr>
-                <w:rFonts w:ascii="Times New Roman" w:hAnsi="Times New Roman" w:cs="Times New Roman"/>
                 <w:b/>
                 <w:bCs/>
-                <w:sz w:val="24"/>
-                <w:szCs w:val="24"/>
               </w:rPr>
-              <w:t>Tools</w:t>
+              <w:t>Description</w:t>
             </w:r>
           </w:p>
         </w:tc>
         <w:tc>
           <w:tcPr>
-            <w:tcW w:w="1276" w:type="dxa"/>
+            <w:tcW w:w="2254" w:type="dxa"/>
+            <w:vAlign w:val="center"/>
           </w:tcPr>
           <w:p>
             <w:pPr>
-              <w:pStyle w:val="ListParagraph"/>
-              <w:spacing w:before="240" w:line="360" w:lineRule="auto"/>
-              <w:ind w:left="0"/>
-              <w:jc w:val="both"/>
+              <w:jc w:val="center"/>
               <w:rPr>
-                <w:rFonts w:ascii="Times New Roman" w:hAnsi="Times New Roman" w:cs="Times New Roman"/>
                 <w:b/>
                 <w:bCs/>
-                <w:sz w:val="24"/>
-                <w:szCs w:val="24"/>
               </w:rPr>
             </w:pPr>
             <w:r>
               <w:rPr>
-                <w:rFonts w:ascii="Times New Roman" w:hAnsi="Times New Roman" w:cs="Times New Roman"/>
                 <w:b/>
                 <w:bCs/>
-                <w:sz w:val="24"/>
-                <w:szCs w:val="24"/>
               </w:rPr>
-              <w:t xml:space="preserve">Version </w:t>
+              <w:t>Probability</w:t>
             </w:r>
           </w:p>
         </w:tc>
         <w:tc>
           <w:tcPr>
-            <w:tcW w:w="2552" w:type="dxa"/>
+            <w:tcW w:w="2254" w:type="dxa"/>
+            <w:vAlign w:val="center"/>
           </w:tcPr>
           <w:p>
             <w:pPr>
-              <w:pStyle w:val="ListParagraph"/>
-              <w:spacing w:before="240" w:line="360" w:lineRule="auto"/>
-              <w:ind w:left="0"/>
-              <w:jc w:val="both"/>
+              <w:jc w:val="center"/>
               <w:rPr>
-                <w:rFonts w:ascii="Times New Roman" w:hAnsi="Times New Roman" w:cs="Times New Roman"/>
                 <w:b/>
                 <w:bCs/>
-                <w:sz w:val="24"/>
-                <w:szCs w:val="24"/>
               </w:rPr>
             </w:pPr>
             <w:r>
               <w:rPr>
-                <w:rFonts w:ascii="Times New Roman" w:hAnsi="Times New Roman" w:cs="Times New Roman"/>
                 <w:b/>
                 <w:bCs/>
-                <w:sz w:val="24"/>
-                <w:szCs w:val="24"/>
               </w:rPr>
-              <w:t>Description</w:t>
+              <w:t>Mitigation Strategy</w:t>
             </w:r>
           </w:p>
         </w:tc>
@@ -2815,630 +1892,136 @@
       <w:tr>
         <w:tc>
           <w:tcPr>
-            <w:tcW w:w="2241" w:type="dxa"/>
+            <w:tcW w:w="2254" w:type="dxa"/>
           </w:tcPr>
           <w:p>
-            <w:pPr>
-              <w:pStyle w:val="ListParagraph"/>
-              <w:spacing w:before="240" w:line="360" w:lineRule="auto"/>
-              <w:ind w:left="0"/>
-              <w:jc w:val="both"/>
-              <w:rPr>
-                <w:rFonts w:ascii="Times New Roman" w:hAnsi="Times New Roman" w:cs="Times New Roman"/>
-                <w:sz w:val="24"/>
-                <w:szCs w:val="24"/>
-              </w:rPr>
-            </w:pPr>
             <w:r>
-              <w:rPr>
-                <w:rFonts w:ascii="Times New Roman" w:hAnsi="Times New Roman" w:cs="Times New Roman"/>
-                <w:sz w:val="24"/>
-                <w:szCs w:val="24"/>
-              </w:rPr>
-              <w:t>Browser</w:t>
+              <w:t>Delay on Development</w:t>
             </w:r>
           </w:p>
         </w:tc>
         <w:tc>
           <w:tcPr>
-            <w:tcW w:w="1417" w:type="dxa"/>
-          </w:tcPr>
-          <w:p>
-            <w:pPr>
-              <w:pStyle w:val="ListParagraph"/>
-              <w:spacing w:before="240" w:line="360" w:lineRule="auto"/>
-              <w:ind w:left="0"/>
-              <w:jc w:val="center"/>
-              <w:rPr>
-                <w:rFonts w:ascii="Times New Roman" w:hAnsi="Times New Roman" w:cs="Times New Roman"/>
-                <w:sz w:val="24"/>
-                <w:szCs w:val="24"/>
-              </w:rPr>
-            </w:pPr>
-            <w:r>
-              <w:rPr>
-                <w:rFonts w:ascii="Times New Roman" w:hAnsi="Times New Roman" w:cs="Times New Roman"/>
-                <w:sz w:val="24"/>
-                <w:szCs w:val="24"/>
-              </w:rPr>
-              <w:t>Chrome</w:t>
-            </w:r>
-          </w:p>
-        </w:tc>
-        <w:tc>
-          <w:tcPr>
-            <w:tcW w:w="1276" w:type="dxa"/>
-          </w:tcPr>
-          <w:p>
-            <w:pPr>
-              <w:pStyle w:val="ListParagraph"/>
-              <w:spacing w:before="240" w:line="360" w:lineRule="auto"/>
-              <w:ind w:left="0"/>
-              <w:jc w:val="center"/>
-              <w:rPr>
-                <w:rFonts w:ascii="Times New Roman" w:hAnsi="Times New Roman" w:cs="Times New Roman"/>
-                <w:sz w:val="24"/>
-                <w:szCs w:val="24"/>
-              </w:rPr>
-            </w:pPr>
-            <w:r>
-              <w:rPr>
-                <w:rFonts w:ascii="Times New Roman" w:hAnsi="Times New Roman" w:cs="Times New Roman"/>
-                <w:sz w:val="24"/>
-                <w:szCs w:val="24"/>
-              </w:rPr>
-              <w:t>Latest</w:t>
-            </w:r>
-          </w:p>
-        </w:tc>
-        <w:tc>
-          <w:tcPr>
-            <w:tcW w:w="2552" w:type="dxa"/>
-          </w:tcPr>
-          <w:p>
-            <w:pPr>
-              <w:pStyle w:val="ListParagraph"/>
-              <w:spacing w:before="240" w:line="360" w:lineRule="auto"/>
-              <w:ind w:left="0"/>
-              <w:jc w:val="both"/>
-              <w:rPr>
-                <w:rFonts w:ascii="Times New Roman" w:hAnsi="Times New Roman" w:cs="Times New Roman"/>
-                <w:sz w:val="24"/>
-                <w:szCs w:val="24"/>
-              </w:rPr>
-            </w:pPr>
-            <w:r>
-              <w:rPr>
-                <w:rFonts w:ascii="Times New Roman" w:hAnsi="Times New Roman" w:cs="Times New Roman"/>
-                <w:sz w:val="24"/>
-                <w:szCs w:val="24"/>
-              </w:rPr>
-              <w:t>Testing</w:t>
-            </w:r>
-          </w:p>
+            <w:tcW w:w="2254" w:type="dxa"/>
+          </w:tcPr>
+          <w:p/>
+        </w:tc>
+        <w:tc>
+          <w:tcPr>
+            <w:tcW w:w="2254" w:type="dxa"/>
+          </w:tcPr>
+          <w:p/>
+        </w:tc>
+        <w:tc>
+          <w:tcPr>
+            <w:tcW w:w="2254" w:type="dxa"/>
+          </w:tcPr>
+          <w:p/>
+        </w:tc>
+      </w:tr>
+      <w:tr>
+        <w:tc>
+          <w:tcPr>
+            <w:tcW w:w="2254" w:type="dxa"/>
+          </w:tcPr>
+          <w:p/>
+        </w:tc>
+        <w:tc>
+          <w:tcPr>
+            <w:tcW w:w="2254" w:type="dxa"/>
+          </w:tcPr>
+          <w:p/>
+        </w:tc>
+        <w:tc>
+          <w:tcPr>
+            <w:tcW w:w="2254" w:type="dxa"/>
+          </w:tcPr>
+          <w:p/>
+        </w:tc>
+        <w:tc>
+          <w:tcPr>
+            <w:tcW w:w="2254" w:type="dxa"/>
+          </w:tcPr>
+          <w:p/>
+        </w:tc>
+      </w:tr>
+      <w:tr>
+        <w:tc>
+          <w:tcPr>
+            <w:tcW w:w="2254" w:type="dxa"/>
+          </w:tcPr>
+          <w:p/>
+        </w:tc>
+        <w:tc>
+          <w:tcPr>
+            <w:tcW w:w="2254" w:type="dxa"/>
+          </w:tcPr>
+          <w:p/>
+        </w:tc>
+        <w:tc>
+          <w:tcPr>
+            <w:tcW w:w="2254" w:type="dxa"/>
+          </w:tcPr>
+          <w:p/>
+        </w:tc>
+        <w:tc>
+          <w:tcPr>
+            <w:tcW w:w="2254" w:type="dxa"/>
+          </w:tcPr>
+          <w:p/>
+        </w:tc>
+      </w:tr>
+      <w:tr>
+        <w:tc>
+          <w:tcPr>
+            <w:tcW w:w="2254" w:type="dxa"/>
+          </w:tcPr>
+          <w:p/>
+        </w:tc>
+        <w:tc>
+          <w:tcPr>
+            <w:tcW w:w="2254" w:type="dxa"/>
+          </w:tcPr>
+          <w:p/>
+        </w:tc>
+        <w:tc>
+          <w:tcPr>
+            <w:tcW w:w="2254" w:type="dxa"/>
+          </w:tcPr>
+          <w:p/>
+        </w:tc>
+        <w:tc>
+          <w:tcPr>
+            <w:tcW w:w="2254" w:type="dxa"/>
+          </w:tcPr>
+          <w:p/>
         </w:tc>
       </w:tr>
     </w:tbl>
     <w:p>
+      <w:r>
+        <w:br w:type="page"/>
+      </w:r>
+    </w:p>
+    <w:p>
       <w:pPr>
         <w:spacing w:before="240" w:line="360" w:lineRule="auto"/>
         <w:jc w:val="both"/>
         <w:rPr>
-          <w:rFonts w:ascii="Times New Roman" w:hAnsi="Times New Roman" w:cs="Times New Roman"/>
-          <w:sz w:val="24"/>
-          <w:szCs w:val="24"/>
-        </w:rPr>
-      </w:pPr>
-    </w:p>
-    <w:p>
-      <w:pPr>
-        <w:spacing w:before="240" w:line="360" w:lineRule="auto"/>
-        <w:rPr>
-          <w:rFonts w:ascii="Times New Roman" w:hAnsi="Times New Roman" w:cs="Times New Roman"/>
-          <w:sz w:val="24"/>
-          <w:szCs w:val="24"/>
-        </w:rPr>
-      </w:pPr>
-      <w:r>
-        <w:rPr>
-          <w:rFonts w:ascii="Times New Roman" w:hAnsi="Times New Roman" w:cs="Times New Roman"/>
-          <w:sz w:val="24"/>
-          <w:szCs w:val="24"/>
-        </w:rPr>
-        <w:br w:type="page"/>
-      </w:r>
-    </w:p>
-    <w:p>
-      <w:pPr>
-        <w:pStyle w:val="ListParagraph"/>
-        <w:numPr>
-          <w:ilvl w:val="0"/>
-          <w:numId w:val="7"/>
-        </w:numPr>
-        <w:spacing w:before="240" w:line="360" w:lineRule="auto"/>
-        <w:jc w:val="both"/>
-        <w:rPr>
-          <w:rFonts w:ascii="Times New Roman" w:hAnsi="Times New Roman" w:cs="Times New Roman"/>
+          <w:rFonts w:cs="Times New Roman"/>
           <w:b/>
           <w:bCs/>
-          <w:sz w:val="24"/>
-          <w:szCs w:val="24"/>
-        </w:rPr>
-      </w:pPr>
-      <w:r>
-        <w:rPr>
-          <w:rFonts w:ascii="Times New Roman" w:hAnsi="Times New Roman" w:cs="Times New Roman"/>
-          <w:b/>
-          <w:bCs/>
-          <w:sz w:val="24"/>
-          <w:szCs w:val="24"/>
-        </w:rPr>
-        <w:lastRenderedPageBreak/>
-        <w:t>Risk Management Plan</w:t>
-      </w:r>
-    </w:p>
-    <w:tbl>
-      <w:tblPr>
-        <w:tblStyle w:val="TableGrid"/>
-        <w:tblW w:w="9214" w:type="dxa"/>
-        <w:tblInd w:w="704" w:type="dxa"/>
-        <w:tblLook w:val="04A0" w:firstRow="1" w:lastRow="0" w:firstColumn="1" w:lastColumn="0" w:noHBand="0" w:noVBand="1"/>
-      </w:tblPr>
-      <w:tblGrid>
-        <w:gridCol w:w="2552"/>
-        <w:gridCol w:w="2982"/>
-        <w:gridCol w:w="1372"/>
-        <w:gridCol w:w="2308"/>
-      </w:tblGrid>
-      <w:tr>
-        <w:tc>
-          <w:tcPr>
-            <w:tcW w:w="2552" w:type="dxa"/>
-          </w:tcPr>
-          <w:p>
-            <w:pPr>
-              <w:pStyle w:val="ListParagraph"/>
-              <w:spacing w:before="240" w:line="360" w:lineRule="auto"/>
-              <w:ind w:left="0"/>
-              <w:jc w:val="both"/>
-              <w:rPr>
-                <w:rFonts w:ascii="Times New Roman" w:hAnsi="Times New Roman" w:cs="Times New Roman"/>
-                <w:b/>
-                <w:bCs/>
-                <w:sz w:val="24"/>
-                <w:szCs w:val="24"/>
-              </w:rPr>
-            </w:pPr>
-            <w:r>
-              <w:rPr>
-                <w:rFonts w:ascii="Times New Roman" w:hAnsi="Times New Roman" w:cs="Times New Roman"/>
-                <w:b/>
-                <w:bCs/>
-                <w:sz w:val="24"/>
-                <w:szCs w:val="24"/>
-              </w:rPr>
-              <w:t>Risk Name</w:t>
-            </w:r>
-          </w:p>
-        </w:tc>
-        <w:tc>
-          <w:tcPr>
-            <w:tcW w:w="2982" w:type="dxa"/>
-          </w:tcPr>
-          <w:p>
-            <w:pPr>
-              <w:pStyle w:val="ListParagraph"/>
-              <w:spacing w:before="240" w:line="360" w:lineRule="auto"/>
-              <w:ind w:left="0"/>
-              <w:jc w:val="both"/>
-              <w:rPr>
-                <w:rFonts w:ascii="Times New Roman" w:hAnsi="Times New Roman" w:cs="Times New Roman"/>
-                <w:b/>
-                <w:bCs/>
-                <w:sz w:val="24"/>
-                <w:szCs w:val="24"/>
-              </w:rPr>
-            </w:pPr>
-            <w:r>
-              <w:rPr>
-                <w:rFonts w:ascii="Times New Roman" w:hAnsi="Times New Roman" w:cs="Times New Roman"/>
-                <w:b/>
-                <w:bCs/>
-                <w:sz w:val="24"/>
-                <w:szCs w:val="24"/>
-              </w:rPr>
-              <w:t>Description</w:t>
-            </w:r>
-          </w:p>
-        </w:tc>
-        <w:tc>
-          <w:tcPr>
-            <w:tcW w:w="1372" w:type="dxa"/>
-          </w:tcPr>
-          <w:p>
-            <w:pPr>
-              <w:pStyle w:val="ListParagraph"/>
-              <w:spacing w:before="240" w:line="360" w:lineRule="auto"/>
-              <w:ind w:left="0"/>
-              <w:jc w:val="both"/>
-              <w:rPr>
-                <w:rFonts w:ascii="Times New Roman" w:hAnsi="Times New Roman" w:cs="Times New Roman"/>
-                <w:b/>
-                <w:bCs/>
-                <w:sz w:val="24"/>
-                <w:szCs w:val="24"/>
-              </w:rPr>
-            </w:pPr>
-            <w:r>
-              <w:rPr>
-                <w:rFonts w:ascii="Times New Roman" w:hAnsi="Times New Roman" w:cs="Times New Roman"/>
-                <w:b/>
-                <w:bCs/>
-                <w:sz w:val="24"/>
-                <w:szCs w:val="24"/>
-              </w:rPr>
-              <w:t>Probability</w:t>
-            </w:r>
-          </w:p>
-        </w:tc>
-        <w:tc>
-          <w:tcPr>
-            <w:tcW w:w="2308" w:type="dxa"/>
-          </w:tcPr>
-          <w:p>
-            <w:pPr>
-              <w:pStyle w:val="ListParagraph"/>
-              <w:spacing w:before="240" w:line="360" w:lineRule="auto"/>
-              <w:ind w:left="0"/>
-              <w:jc w:val="both"/>
-              <w:rPr>
-                <w:rFonts w:ascii="Times New Roman" w:hAnsi="Times New Roman" w:cs="Times New Roman"/>
-                <w:b/>
-                <w:bCs/>
-                <w:sz w:val="24"/>
-                <w:szCs w:val="24"/>
-              </w:rPr>
-            </w:pPr>
-            <w:r>
-              <w:rPr>
-                <w:rFonts w:ascii="Times New Roman" w:hAnsi="Times New Roman" w:cs="Times New Roman"/>
-                <w:b/>
-                <w:bCs/>
-                <w:sz w:val="24"/>
-                <w:szCs w:val="24"/>
-              </w:rPr>
-              <w:t>Mitigation</w:t>
-            </w:r>
-          </w:p>
-        </w:tc>
-      </w:tr>
-      <w:tr>
-        <w:tc>
-          <w:tcPr>
-            <w:tcW w:w="2552" w:type="dxa"/>
-          </w:tcPr>
-          <w:p>
-            <w:pPr>
-              <w:pStyle w:val="ListParagraph"/>
-              <w:spacing w:before="240" w:line="360" w:lineRule="auto"/>
-              <w:ind w:left="0"/>
-              <w:jc w:val="both"/>
-              <w:rPr>
-                <w:rFonts w:ascii="Times New Roman" w:hAnsi="Times New Roman" w:cs="Times New Roman"/>
-                <w:sz w:val="24"/>
-                <w:szCs w:val="24"/>
-              </w:rPr>
-            </w:pPr>
-            <w:r>
-              <w:rPr>
-                <w:rFonts w:ascii="Times New Roman" w:hAnsi="Times New Roman" w:cs="Times New Roman"/>
-                <w:sz w:val="24"/>
-                <w:szCs w:val="24"/>
-              </w:rPr>
-              <w:t xml:space="preserve">Delay in development </w:t>
-            </w:r>
-          </w:p>
-        </w:tc>
-        <w:tc>
-          <w:tcPr>
-            <w:tcW w:w="2982" w:type="dxa"/>
-          </w:tcPr>
-          <w:p>
-            <w:pPr>
-              <w:pStyle w:val="ListParagraph"/>
-              <w:spacing w:before="240" w:line="360" w:lineRule="auto"/>
-              <w:ind w:left="0"/>
-              <w:jc w:val="center"/>
-              <w:rPr>
-                <w:rFonts w:ascii="Times New Roman" w:hAnsi="Times New Roman" w:cs="Times New Roman"/>
-                <w:sz w:val="24"/>
-                <w:szCs w:val="24"/>
-              </w:rPr>
-            </w:pPr>
-            <w:r>
-              <w:rPr>
-                <w:rFonts w:ascii="Times New Roman" w:hAnsi="Times New Roman" w:cs="Times New Roman"/>
-                <w:sz w:val="24"/>
-                <w:szCs w:val="24"/>
-              </w:rPr>
-              <w:t>Tasks not completed in time</w:t>
-            </w:r>
-          </w:p>
-        </w:tc>
-        <w:tc>
-          <w:tcPr>
-            <w:tcW w:w="1372" w:type="dxa"/>
-          </w:tcPr>
-          <w:p>
-            <w:pPr>
-              <w:pStyle w:val="ListParagraph"/>
-              <w:spacing w:before="240" w:line="360" w:lineRule="auto"/>
-              <w:ind w:left="0"/>
-              <w:jc w:val="center"/>
-              <w:rPr>
-                <w:rFonts w:ascii="Times New Roman" w:hAnsi="Times New Roman" w:cs="Times New Roman"/>
-                <w:sz w:val="24"/>
-                <w:szCs w:val="24"/>
-              </w:rPr>
-            </w:pPr>
-            <w:r>
-              <w:rPr>
-                <w:rFonts w:ascii="Times New Roman" w:hAnsi="Times New Roman" w:cs="Times New Roman"/>
-                <w:sz w:val="24"/>
-                <w:szCs w:val="24"/>
-              </w:rPr>
-              <w:t>Medium</w:t>
-            </w:r>
-          </w:p>
-        </w:tc>
-        <w:tc>
-          <w:tcPr>
-            <w:tcW w:w="2308" w:type="dxa"/>
-          </w:tcPr>
-          <w:p>
-            <w:pPr>
-              <w:pStyle w:val="ListParagraph"/>
-              <w:spacing w:before="240" w:line="360" w:lineRule="auto"/>
-              <w:ind w:left="0"/>
-              <w:jc w:val="both"/>
-              <w:rPr>
-                <w:rFonts w:ascii="Times New Roman" w:hAnsi="Times New Roman" w:cs="Times New Roman"/>
-                <w:sz w:val="24"/>
-                <w:szCs w:val="24"/>
-              </w:rPr>
-            </w:pPr>
-            <w:r>
-              <w:rPr>
-                <w:rFonts w:ascii="Times New Roman" w:hAnsi="Times New Roman" w:cs="Times New Roman"/>
-                <w:sz w:val="24"/>
-                <w:szCs w:val="24"/>
-              </w:rPr>
-              <w:t>Weekly meetings</w:t>
-            </w:r>
-          </w:p>
-        </w:tc>
-      </w:tr>
-      <w:tr>
-        <w:tc>
-          <w:tcPr>
-            <w:tcW w:w="2552" w:type="dxa"/>
-          </w:tcPr>
-          <w:p>
-            <w:pPr>
-              <w:pStyle w:val="ListParagraph"/>
-              <w:spacing w:before="240" w:line="360" w:lineRule="auto"/>
-              <w:ind w:left="0"/>
-              <w:jc w:val="both"/>
-              <w:rPr>
-                <w:rFonts w:ascii="Times New Roman" w:hAnsi="Times New Roman" w:cs="Times New Roman"/>
-                <w:sz w:val="24"/>
-                <w:szCs w:val="24"/>
-              </w:rPr>
-            </w:pPr>
-            <w:r>
-              <w:rPr>
-                <w:rFonts w:ascii="Times New Roman" w:hAnsi="Times New Roman" w:cs="Times New Roman"/>
-                <w:sz w:val="24"/>
-                <w:szCs w:val="24"/>
-              </w:rPr>
-              <w:t>Data loss</w:t>
-            </w:r>
-          </w:p>
-        </w:tc>
-        <w:tc>
-          <w:tcPr>
-            <w:tcW w:w="2982" w:type="dxa"/>
-          </w:tcPr>
-          <w:p>
-            <w:pPr>
-              <w:pStyle w:val="ListParagraph"/>
-              <w:spacing w:before="240" w:line="360" w:lineRule="auto"/>
-              <w:ind w:left="0"/>
-              <w:jc w:val="center"/>
-              <w:rPr>
-                <w:rFonts w:ascii="Times New Roman" w:hAnsi="Times New Roman" w:cs="Times New Roman"/>
-                <w:sz w:val="24"/>
-                <w:szCs w:val="24"/>
-              </w:rPr>
-            </w:pPr>
-            <w:r>
-              <w:rPr>
-                <w:rFonts w:ascii="Times New Roman" w:hAnsi="Times New Roman" w:cs="Times New Roman"/>
-                <w:sz w:val="24"/>
-                <w:szCs w:val="24"/>
-              </w:rPr>
-              <w:t>Loss of project files</w:t>
-            </w:r>
-          </w:p>
-        </w:tc>
-        <w:tc>
-          <w:tcPr>
-            <w:tcW w:w="1372" w:type="dxa"/>
-          </w:tcPr>
-          <w:p>
-            <w:pPr>
-              <w:pStyle w:val="ListParagraph"/>
-              <w:spacing w:before="240" w:line="360" w:lineRule="auto"/>
-              <w:ind w:left="0"/>
-              <w:jc w:val="center"/>
-              <w:rPr>
-                <w:rFonts w:ascii="Times New Roman" w:hAnsi="Times New Roman" w:cs="Times New Roman"/>
-                <w:sz w:val="24"/>
-                <w:szCs w:val="24"/>
-              </w:rPr>
-            </w:pPr>
-            <w:r>
-              <w:rPr>
-                <w:rFonts w:ascii="Times New Roman" w:hAnsi="Times New Roman" w:cs="Times New Roman"/>
-                <w:sz w:val="24"/>
-                <w:szCs w:val="24"/>
-              </w:rPr>
-              <w:t>Low</w:t>
-            </w:r>
-          </w:p>
-        </w:tc>
-        <w:tc>
-          <w:tcPr>
-            <w:tcW w:w="2308" w:type="dxa"/>
-          </w:tcPr>
-          <w:p>
-            <w:pPr>
-              <w:pStyle w:val="ListParagraph"/>
-              <w:spacing w:before="240" w:line="360" w:lineRule="auto"/>
-              <w:ind w:left="0"/>
-              <w:jc w:val="both"/>
-              <w:rPr>
-                <w:rFonts w:ascii="Times New Roman" w:hAnsi="Times New Roman" w:cs="Times New Roman"/>
-                <w:sz w:val="24"/>
-                <w:szCs w:val="24"/>
-              </w:rPr>
-            </w:pPr>
-            <w:r>
-              <w:rPr>
-                <w:rFonts w:ascii="Times New Roman" w:hAnsi="Times New Roman" w:cs="Times New Roman"/>
-                <w:sz w:val="24"/>
-                <w:szCs w:val="24"/>
-              </w:rPr>
-              <w:t>Backup system</w:t>
-            </w:r>
-          </w:p>
-        </w:tc>
-      </w:tr>
-      <w:tr>
-        <w:tc>
-          <w:tcPr>
-            <w:tcW w:w="2552" w:type="dxa"/>
-          </w:tcPr>
-          <w:p>
-            <w:pPr>
-              <w:pStyle w:val="ListParagraph"/>
-              <w:spacing w:before="240" w:line="360" w:lineRule="auto"/>
-              <w:ind w:left="0"/>
-              <w:jc w:val="both"/>
-              <w:rPr>
-                <w:rFonts w:ascii="Times New Roman" w:hAnsi="Times New Roman" w:cs="Times New Roman"/>
-                <w:sz w:val="24"/>
-                <w:szCs w:val="24"/>
-              </w:rPr>
-            </w:pPr>
-            <w:r>
-              <w:rPr>
-                <w:rFonts w:ascii="Times New Roman" w:hAnsi="Times New Roman" w:cs="Times New Roman"/>
-                <w:sz w:val="24"/>
-                <w:szCs w:val="24"/>
-              </w:rPr>
-              <w:t>Miscommunication</w:t>
-            </w:r>
-          </w:p>
-        </w:tc>
-        <w:tc>
-          <w:tcPr>
-            <w:tcW w:w="2982" w:type="dxa"/>
-          </w:tcPr>
-          <w:p>
-            <w:pPr>
-              <w:pStyle w:val="ListParagraph"/>
-              <w:spacing w:before="240" w:line="360" w:lineRule="auto"/>
-              <w:ind w:left="0"/>
-              <w:jc w:val="center"/>
-              <w:rPr>
-                <w:rFonts w:ascii="Times New Roman" w:hAnsi="Times New Roman" w:cs="Times New Roman"/>
-                <w:sz w:val="24"/>
-                <w:szCs w:val="24"/>
-              </w:rPr>
-            </w:pPr>
-            <w:r>
-              <w:rPr>
-                <w:rFonts w:ascii="Times New Roman" w:hAnsi="Times New Roman" w:cs="Times New Roman"/>
-                <w:sz w:val="24"/>
-                <w:szCs w:val="24"/>
-              </w:rPr>
-              <w:t>Team misunderstanding</w:t>
-            </w:r>
-          </w:p>
-        </w:tc>
-        <w:tc>
-          <w:tcPr>
-            <w:tcW w:w="1372" w:type="dxa"/>
-          </w:tcPr>
-          <w:p>
-            <w:pPr>
-              <w:pStyle w:val="ListParagraph"/>
-              <w:spacing w:before="240" w:line="360" w:lineRule="auto"/>
-              <w:ind w:left="0"/>
-              <w:jc w:val="center"/>
-              <w:rPr>
-                <w:rFonts w:ascii="Times New Roman" w:hAnsi="Times New Roman" w:cs="Times New Roman"/>
-                <w:sz w:val="24"/>
-                <w:szCs w:val="24"/>
-              </w:rPr>
-            </w:pPr>
-            <w:r>
-              <w:rPr>
-                <w:rFonts w:ascii="Times New Roman" w:hAnsi="Times New Roman" w:cs="Times New Roman"/>
-                <w:sz w:val="24"/>
-                <w:szCs w:val="24"/>
-              </w:rPr>
-              <w:t>Medium</w:t>
-            </w:r>
-          </w:p>
-        </w:tc>
-        <w:tc>
-          <w:tcPr>
-            <w:tcW w:w="2308" w:type="dxa"/>
-          </w:tcPr>
-          <w:p>
-            <w:pPr>
-              <w:pStyle w:val="ListParagraph"/>
-              <w:spacing w:before="240" w:line="360" w:lineRule="auto"/>
-              <w:ind w:left="0"/>
-              <w:jc w:val="both"/>
-              <w:rPr>
-                <w:rFonts w:ascii="Times New Roman" w:hAnsi="Times New Roman" w:cs="Times New Roman"/>
-                <w:sz w:val="24"/>
-                <w:szCs w:val="24"/>
-              </w:rPr>
-            </w:pPr>
-            <w:r>
-              <w:rPr>
-                <w:rFonts w:ascii="Times New Roman" w:hAnsi="Times New Roman" w:cs="Times New Roman"/>
-                <w:sz w:val="24"/>
-                <w:szCs w:val="24"/>
-              </w:rPr>
-              <w:t>Clear communication</w:t>
-            </w:r>
-          </w:p>
-        </w:tc>
-      </w:tr>
-    </w:tbl>
+          <w:szCs w:val="24"/>
+        </w:rPr>
+      </w:pPr>
+    </w:p>
     <w:p>
       <w:pPr>
         <w:pStyle w:val="ListParagraph"/>
         <w:spacing w:before="240" w:line="360" w:lineRule="auto"/>
         <w:jc w:val="both"/>
         <w:rPr>
-          <w:rFonts w:ascii="Times New Roman" w:hAnsi="Times New Roman" w:cs="Times New Roman"/>
-          <w:sz w:val="24"/>
+          <w:rFonts w:cs="Times New Roman"/>
           <w:szCs w:val="24"/>
         </w:rPr>
       </w:pPr>
@@ -3447,15 +2030,13 @@
       <w:pPr>
         <w:spacing w:before="240" w:line="360" w:lineRule="auto"/>
         <w:rPr>
-          <w:rFonts w:ascii="Times New Roman" w:hAnsi="Times New Roman" w:cs="Times New Roman"/>
-          <w:sz w:val="24"/>
-          <w:szCs w:val="24"/>
-        </w:rPr>
-      </w:pPr>
-      <w:r>
-        <w:rPr>
-          <w:rFonts w:ascii="Times New Roman" w:hAnsi="Times New Roman" w:cs="Times New Roman"/>
-          <w:sz w:val="24"/>
+          <w:rFonts w:cs="Times New Roman"/>
+          <w:szCs w:val="24"/>
+        </w:rPr>
+      </w:pPr>
+      <w:r>
+        <w:rPr>
+          <w:rFonts w:cs="Times New Roman"/>
           <w:szCs w:val="24"/>
         </w:rPr>
         <w:br w:type="page"/>
@@ -3463,6 +2044,12 @@
     </w:p>
     <w:sdt>
       <w:sdtPr>
+        <w:rPr>
+          <w:rFonts w:ascii="Times New Roman" w:eastAsiaTheme="minorHAnsi" w:hAnsi="Times New Roman" w:cstheme="minorBidi"/>
+          <w:color w:val="auto"/>
+          <w:sz w:val="24"/>
+          <w:szCs w:val="22"/>
+        </w:rPr>
         <w:id w:val="18667245"/>
         <w:docPartObj>
           <w:docPartGallery w:val="Bibliographies"/>
@@ -3471,12 +2058,10 @@
       </w:sdtPr>
       <w:sdtEndPr>
         <w:rPr>
-          <w:rFonts w:asciiTheme="minorHAnsi" w:eastAsiaTheme="minorHAnsi" w:hAnsiTheme="minorHAnsi" w:cstheme="minorBidi"/>
+          <w:rFonts w:asciiTheme="minorHAnsi" w:hAnsiTheme="minorHAnsi"/>
           <w:b/>
           <w:bCs/>
-          <w:color w:val="auto"/>
           <w:sz w:val="22"/>
-          <w:szCs w:val="22"/>
         </w:rPr>
       </w:sdtEndPr>
       <w:sdtContent>
@@ -3497,7 +2082,6 @@
               <w:rFonts w:cs="Times New Roman"/>
               <w:noProof/>
               <w:kern w:val="0"/>
-              <w:sz w:val="24"/>
               <w14:ligatures w14:val="none"/>
             </w:rPr>
           </w:pPr>
@@ -3551,8 +2135,7 @@
         <w:spacing w:before="240" w:line="360" w:lineRule="auto"/>
         <w:jc w:val="both"/>
         <w:rPr>
-          <w:rFonts w:ascii="Times New Roman" w:hAnsi="Times New Roman" w:cs="Times New Roman"/>
-          <w:sz w:val="24"/>
+          <w:rFonts w:cs="Times New Roman"/>
           <w:szCs w:val="24"/>
         </w:rPr>
       </w:pPr>
@@ -4970,6 +3553,10 @@
     <w:name w:val="Normal"/>
     <w:qFormat/>
     <w:rsid w:val="00B140B3"/>
+    <w:rPr>
+      <w:rFonts w:ascii="Times New Roman" w:hAnsi="Times New Roman"/>
+      <w:sz w:val="24"/>
+    </w:rPr>
   </w:style>
   <w:style w:type="paragraph" w:styleId="Heading1">
     <w:name w:val="heading 1"/>
@@ -5312,7 +3899,6 @@
       <w:ind w:left="504"/>
     </w:pPr>
     <w:rPr>
-      <w:rFonts w:ascii="Times New Roman" w:hAnsi="Times New Roman"/>
       <w:b/>
       <w:color w:val="000000" w:themeColor="text1"/>
       <w:sz w:val="24"/>
@@ -5709,16 +4295,6 @@
     <w:uiPriority w:val="37"/>
     <w:unhideWhenUsed/>
     <w:rsid w:val="00D66C91"/>
-  </w:style>
-  <w:style w:type="paragraph" w:styleId="Normal0">
-    <w:name w:val="Normal"/>
-    <w:next w:val="Normal"/>
-    <w:qFormat/>
-    <w:rsid w:val="00B140B3"/>
-    <w:rPr>
-      <w:rFonts w:ascii="Times New Roman" w:hAnsi="Times New Roman"/>
-      <w:sz w:val="24"/>
-    </w:rPr>
   </w:style>
 </w:styles>
 </file>

</xml_diff>

<commit_message>
Assignment 1 report merged from feature branch and pushed to share
</commit_message>
<xml_diff>
--- a/Report/zerowaste_business_plan.docx
+++ b/Report/zerowaste_business_plan.docx
@@ -91,6 +91,7 @@
         </w:rPr>
         <w:br/>
       </w:r>
+      <w:proofErr w:type="spellStart"/>
       <w:r>
         <w:rPr>
           <w:rFonts w:cs="Times New Roman"/>
@@ -99,7 +100,18 @@
           <w:sz w:val="32"/>
           <w:szCs w:val="32"/>
         </w:rPr>
-        <w:t>SavePlate: Smart Food Waste Reduction System</w:t>
+        <w:t>SavePlate</w:t>
+      </w:r>
+      <w:proofErr w:type="spellEnd"/>
+      <w:r>
+        <w:rPr>
+          <w:rFonts w:cs="Times New Roman"/>
+          <w:b/>
+          <w:bCs/>
+          <w:sz w:val="32"/>
+          <w:szCs w:val="32"/>
+        </w:rPr>
+        <w:t>: Smart Food Waste Reduction System</w:t>
       </w:r>
     </w:p>
     <w:p>
@@ -306,7 +318,23 @@
           <w:rFonts w:cs="Times New Roman"/>
           <w:szCs w:val="24"/>
         </w:rPr>
-        <w:t>To reduce the major problem of food waste, household food waste, Saveplate is a smart web application (an intelligent inventory management system), we have designed to help users/customers manage their food inventory, track the expiration dates, receive timely alerts</w:t>
+        <w:t xml:space="preserve">To reduce the major problem of food waste, household food waste, </w:t>
+      </w:r>
+      <w:proofErr w:type="spellStart"/>
+      <w:r>
+        <w:rPr>
+          <w:rFonts w:cs="Times New Roman"/>
+          <w:szCs w:val="24"/>
+        </w:rPr>
+        <w:t>Saveplate</w:t>
+      </w:r>
+      <w:proofErr w:type="spellEnd"/>
+      <w:r>
+        <w:rPr>
+          <w:rFonts w:cs="Times New Roman"/>
+          <w:szCs w:val="24"/>
+        </w:rPr>
+        <w:t xml:space="preserve"> is a smart web application (an intelligent inventory management system), we have designed to help users/customers manage their food inventory, track the expiration dates, receive timely alerts</w:t>
       </w:r>
       <w:r>
         <w:rPr>
@@ -563,7 +591,25 @@
           <w:szCs w:val="24"/>
           <w:shd w:val="clear" w:color="auto" w:fill="FFFFFF"/>
         </w:rPr>
-        <w:t>With this increasing issue, SavePlate is motivated to help minimize the food wastage and the proper management of the food and resources.</w:t>
+        <w:t xml:space="preserve">With this increasing issue, </w:t>
+      </w:r>
+      <w:proofErr w:type="spellStart"/>
+      <w:r>
+        <w:rPr>
+          <w:rFonts w:cs="Times New Roman"/>
+          <w:szCs w:val="24"/>
+          <w:shd w:val="clear" w:color="auto" w:fill="FFFFFF"/>
+        </w:rPr>
+        <w:t>SavePlate</w:t>
+      </w:r>
+      <w:proofErr w:type="spellEnd"/>
+      <w:r>
+        <w:rPr>
+          <w:rFonts w:cs="Times New Roman"/>
+          <w:szCs w:val="24"/>
+          <w:shd w:val="clear" w:color="auto" w:fill="FFFFFF"/>
+        </w:rPr>
+        <w:t xml:space="preserve"> is motivated to help minimize the food wastage and the proper management of the food and resources.</w:t>
       </w:r>
     </w:p>
     <w:p>
@@ -586,7 +632,23 @@
           <w:rFonts w:cs="Times New Roman"/>
           <w:szCs w:val="24"/>
         </w:rPr>
-        <w:t>The primary users for the SavePlate are:</w:t>
+        <w:t xml:space="preserve">The primary users for the </w:t>
+      </w:r>
+      <w:proofErr w:type="spellStart"/>
+      <w:r>
+        <w:rPr>
+          <w:rFonts w:cs="Times New Roman"/>
+          <w:szCs w:val="24"/>
+        </w:rPr>
+        <w:t>SavePlate</w:t>
+      </w:r>
+      <w:proofErr w:type="spellEnd"/>
+      <w:r>
+        <w:rPr>
+          <w:rFonts w:cs="Times New Roman"/>
+          <w:szCs w:val="24"/>
+        </w:rPr>
+        <w:t xml:space="preserve"> are:</w:t>
       </w:r>
     </w:p>
     <w:p>
@@ -698,7 +760,23 @@
           <w:rFonts w:cs="Times New Roman"/>
           <w:szCs w:val="24"/>
         </w:rPr>
-        <w:t>Our product is a new product, and not an extension of any existing project. Built to address food waste management for Malaysian households. SavePlate will be delivered as a fully functional, web-based application accessible via web browser.</w:t>
+        <w:t xml:space="preserve">Our product is a new product, and not an extension of any existing project. Built to address food waste management for Malaysian households. </w:t>
+      </w:r>
+      <w:proofErr w:type="spellStart"/>
+      <w:r>
+        <w:rPr>
+          <w:rFonts w:cs="Times New Roman"/>
+          <w:szCs w:val="24"/>
+        </w:rPr>
+        <w:t>SavePlate</w:t>
+      </w:r>
+      <w:proofErr w:type="spellEnd"/>
+      <w:r>
+        <w:rPr>
+          <w:rFonts w:cs="Times New Roman"/>
+          <w:szCs w:val="24"/>
+        </w:rPr>
+        <w:t xml:space="preserve"> will be delivered as a fully functional, web-based application accessible via web browser.</w:t>
       </w:r>
     </w:p>
     <w:p>
@@ -909,7 +987,23 @@
           <w:rFonts w:cs="Times New Roman"/>
           <w:szCs w:val="24"/>
         </w:rPr>
-        <w:t xml:space="preserve">The development timeline for the SavePlate is estimated at approximately 6 to 8 weeks, divided into two phases, which is aligned with the assignment submission deadlines, Phase 1 and Phase 2 for coding and testing </w:t>
+        <w:t xml:space="preserve">The development timeline for the </w:t>
+      </w:r>
+      <w:proofErr w:type="spellStart"/>
+      <w:r>
+        <w:rPr>
+          <w:rFonts w:cs="Times New Roman"/>
+          <w:szCs w:val="24"/>
+        </w:rPr>
+        <w:t>SavePlate</w:t>
+      </w:r>
+      <w:proofErr w:type="spellEnd"/>
+      <w:r>
+        <w:rPr>
+          <w:rFonts w:cs="Times New Roman"/>
+          <w:szCs w:val="24"/>
+        </w:rPr>
+        <w:t xml:space="preserve"> is estimated at approximately 6 to 8 weeks, divided into two phases, which is aligned with the assignment submission deadlines, Phase 1 and Phase 2 for coding and testing </w:t>
       </w:r>
       <w:r>
         <w:rPr>
@@ -950,8 +1044,13 @@
       <w:r>
         <w:t xml:space="preserve">The main aims for the development of </w:t>
       </w:r>
-      <w:r>
-        <w:t>SavePlate are listed below;</w:t>
+      <w:proofErr w:type="spellStart"/>
+      <w:r>
+        <w:t>SavePlate</w:t>
+      </w:r>
+      <w:proofErr w:type="spellEnd"/>
+      <w:r>
+        <w:t xml:space="preserve"> are listed below;</w:t>
       </w:r>
     </w:p>
     <w:p>
@@ -1131,7 +1230,7 @@
       </w:r>
       <w:proofErr w:type="spellStart"/>
       <w:r>
-        <w:t>saveplate</w:t>
+        <w:t>ZeroWaste</w:t>
       </w:r>
       <w:proofErr w:type="spellEnd"/>
       <w:r>
@@ -1168,17 +1267,19 @@
         <w:spacing w:after="0" w:line="360" w:lineRule="auto"/>
       </w:pPr>
       <w:r>
-        <w:t xml:space="preserve">To build a functional food inventory management system, allowing use to </w:t>
-      </w:r>
-      <w:proofErr w:type="spellStart"/>
-      <w:proofErr w:type="gramStart"/>
-      <w:r>
-        <w:t>add,update</w:t>
-      </w:r>
-      <w:proofErr w:type="spellEnd"/>
-      <w:proofErr w:type="gramEnd"/>
-      <w:r>
-        <w:t xml:space="preserve"> (edit), categorize, and delete food items,</w:t>
+        <w:t>To build a functional food inventory management system, allowing use to add,</w:t>
+      </w:r>
+      <w:r>
+        <w:t xml:space="preserve"> </w:t>
+      </w:r>
+      <w:r>
+        <w:t>update (edit), categorize, and delete food items,</w:t>
+      </w:r>
+      <w:r>
+        <w:t xml:space="preserve"> that also tracks the food </w:t>
+      </w:r>
+      <w:r>
+        <w:t>item used</w:t>
       </w:r>
     </w:p>
     <w:p>
@@ -1191,7 +1292,10 @@
         <w:spacing w:after="0" w:line="360" w:lineRule="auto"/>
       </w:pPr>
       <w:r>
-        <w:t>To build a functional expiry date tracking system,</w:t>
+        <w:t>To build a functional expiry date tracking system</w:t>
+      </w:r>
+      <w:r>
+        <w:t xml:space="preserve"> which notifies the user,</w:t>
       </w:r>
     </w:p>
     <w:p>
@@ -1217,15 +1321,7 @@
         <w:spacing w:after="0" w:line="360" w:lineRule="auto"/>
       </w:pPr>
       <w:r>
-        <w:t xml:space="preserve">To build </w:t>
-      </w:r>
-      <w:proofErr w:type="gramStart"/>
-      <w:r>
-        <w:t>an</w:t>
-      </w:r>
-      <w:proofErr w:type="gramEnd"/>
-      <w:r>
-        <w:t xml:space="preserve"> real-time notification features that alerts users days prior to the food expiry date of the stored items, notify </w:t>
+        <w:t xml:space="preserve">To build real-time notification features that alerts users days prior to the food expiry date of the stored items, notify </w:t>
       </w:r>
       <w:r>
         <w:t>when a donation is made,</w:t>
@@ -1241,40 +1337,229 @@
         <w:spacing w:after="0" w:line="360" w:lineRule="auto"/>
       </w:pPr>
       <w:r>
-        <w:t>To provide visual</w:t>
+        <w:t xml:space="preserve">To </w:t>
+      </w:r>
+      <w:r>
+        <w:t>provide user the visual food analytics for the stored food items, tacking each user’s food saving and waste statistics,</w:t>
       </w:r>
     </w:p>
     <w:p>
       <w:pPr>
         <w:pStyle w:val="ListParagraph"/>
-      </w:pPr>
-    </w:p>
-    <w:p>
-      <w:r>
-        <w:t>Project Objectives</w:t>
-      </w:r>
-    </w:p>
-    <w:p>
-      <w:r>
-        <w:t>To design a functional food inventory system within the first 2 weeks</w:t>
-      </w:r>
-    </w:p>
-    <w:p>
-      <w:r>
-        <w:t>To implement notification alerts for expiry tracking</w:t>
-      </w:r>
-    </w:p>
-    <w:p>
-      <w:r>
-        <w:t>To develop a meal planning module for users (households, donors, and individuals)</w:t>
-      </w:r>
-    </w:p>
-    <w:p>
-      <w:r>
-        <w:t>To ensure the system usability and performance</w:t>
-      </w:r>
-    </w:p>
-    <w:p>
+        <w:numPr>
+          <w:ilvl w:val="0"/>
+          <w:numId w:val="11"/>
+        </w:numPr>
+        <w:spacing w:after="0" w:line="360" w:lineRule="auto"/>
+      </w:pPr>
+      <w:r>
+        <w:t xml:space="preserve">To provide user the </w:t>
+      </w:r>
+      <w:r>
+        <w:t xml:space="preserve">ease to search the food items stored in </w:t>
+      </w:r>
+      <w:proofErr w:type="spellStart"/>
+      <w:r>
+        <w:t>there</w:t>
+      </w:r>
+      <w:proofErr w:type="spellEnd"/>
+      <w:r>
+        <w:t xml:space="preserve"> home from anywhere with access to internet,</w:t>
+      </w:r>
+    </w:p>
+    <w:p>
+      <w:pPr>
+        <w:pStyle w:val="ListParagraph"/>
+        <w:numPr>
+          <w:ilvl w:val="0"/>
+          <w:numId w:val="11"/>
+        </w:numPr>
+        <w:spacing w:after="0" w:line="360" w:lineRule="auto"/>
+      </w:pPr>
+      <w:r>
+        <w:t xml:space="preserve">To develop </w:t>
+      </w:r>
+      <w:r>
+        <w:t xml:space="preserve">a </w:t>
+      </w:r>
+      <w:r>
+        <w:t>weekly meal planner feature that suggest meal plan according to their current inventory, reducing ingredient redundancy and food wastage,</w:t>
+      </w:r>
+    </w:p>
+    <w:p>
+      <w:pPr>
+        <w:pStyle w:val="ListParagraph"/>
+        <w:numPr>
+          <w:ilvl w:val="0"/>
+          <w:numId w:val="11"/>
+        </w:numPr>
+        <w:spacing w:after="0" w:line="360" w:lineRule="auto"/>
+      </w:pPr>
+      <w:r>
+        <w:t>To ensure the system aligns with usability and performance standard</w:t>
+      </w:r>
+      <w:r>
+        <w:t>, including a target load time under 2 seconds, meeting security standards</w:t>
+      </w:r>
+      <w:r>
+        <w:t>, and</w:t>
+      </w:r>
+    </w:p>
+    <w:p>
+      <w:pPr>
+        <w:pStyle w:val="ListParagraph"/>
+        <w:numPr>
+          <w:ilvl w:val="0"/>
+          <w:numId w:val="11"/>
+        </w:numPr>
+        <w:spacing w:after="0" w:line="360" w:lineRule="auto"/>
+      </w:pPr>
+      <w:r>
+        <w:t xml:space="preserve">To </w:t>
+      </w:r>
+      <w:r>
+        <w:t>develop a hierarch</w:t>
+      </w:r>
+      <w:r>
+        <w:t xml:space="preserve">ical </w:t>
+      </w:r>
+      <w:r>
+        <w:t xml:space="preserve">design to help user navigate </w:t>
+      </w:r>
+      <w:r>
+        <w:t>through the system</w:t>
+      </w:r>
+    </w:p>
+    <w:p>
+      <w:r>
+        <w:br w:type="page"/>
+      </w:r>
+    </w:p>
+    <w:p>
+      <w:pPr>
+        <w:pStyle w:val="Main-Heading"/>
+      </w:pPr>
+      <w:r>
+        <w:lastRenderedPageBreak/>
+        <w:t>Project Scope</w:t>
+      </w:r>
+    </w:p>
+    <w:p>
+      <w:r>
+        <w:t xml:space="preserve">The scope clearly defines the boundaries of </w:t>
+      </w:r>
+      <w:proofErr w:type="spellStart"/>
+      <w:r>
+        <w:t>ZeroWaste</w:t>
+      </w:r>
+      <w:proofErr w:type="spellEnd"/>
+      <w:r>
+        <w:t>, clearly stating what the system will and will not deliver. This is essential to manage the expectation of the project, avoid scope creep, and also ensure that the project aligns with project objectives.</w:t>
+      </w:r>
+    </w:p>
+    <w:p>
+      <w:pPr>
+        <w:pStyle w:val="sub-heading2"/>
+      </w:pPr>
+      <w:r>
+        <w:t>In Scope</w:t>
+      </w:r>
+    </w:p>
+    <w:p>
+      <w:r>
+        <w:t xml:space="preserve">The following functionalities will be developed as part of </w:t>
+      </w:r>
+      <w:proofErr w:type="spellStart"/>
+      <w:r>
+        <w:t>ZeroWaste</w:t>
+      </w:r>
+      <w:proofErr w:type="spellEnd"/>
+      <w:r>
+        <w:t xml:space="preserve"> </w:t>
+      </w:r>
+      <w:r>
+        <w:t>(</w:t>
+      </w:r>
+      <w:r>
+        <w:t>will deliver part of our project):</w:t>
+      </w:r>
+    </w:p>
+    <w:p>
+      <w:pPr>
+        <w:pStyle w:val="ListParagraph"/>
+        <w:numPr>
+          <w:ilvl w:val="0"/>
+          <w:numId w:val="19"/>
+        </w:numPr>
+      </w:pPr>
+      <w:r>
+        <w:t>User Registration and Privacy Settings – New users can register with their email and password. Two-factor authentication is implemented. Users can maintain a basic level of account preferences from their account</w:t>
+      </w:r>
+      <w:r>
+        <w:t>,</w:t>
+      </w:r>
+    </w:p>
+    <w:p>
+      <w:pPr>
+        <w:pStyle w:val="ListParagraph"/>
+        <w:numPr>
+          <w:ilvl w:val="0"/>
+          <w:numId w:val="19"/>
+        </w:numPr>
+      </w:pPr>
+      <w:r>
+        <w:t xml:space="preserve">Food Inventory Management </w:t>
+      </w:r>
+      <w:r>
+        <w:t xml:space="preserve">–Users can add, view, edit and delete food </w:t>
+      </w:r>
+      <w:r>
+        <w:t>i</w:t>
+      </w:r>
+      <w:r>
+        <w:t>tem</w:t>
+      </w:r>
+      <w:r>
+        <w:t>s, from their inventory. Each item includes, details such as name, quantity, expiry date, category</w:t>
+      </w:r>
+      <w:r>
+        <w:t>,</w:t>
+      </w:r>
+    </w:p>
+    <w:p>
+      <w:pPr>
+        <w:pStyle w:val="ListParagraph"/>
+        <w:numPr>
+          <w:ilvl w:val="0"/>
+          <w:numId w:val="19"/>
+        </w:numPr>
+      </w:pPr>
+      <w:r>
+        <w:t xml:space="preserve">Make donation – Users can donate the food items in their inventory, </w:t>
+      </w:r>
+      <w:proofErr w:type="spellStart"/>
+      <w:r>
+        <w:t>i.e</w:t>
+      </w:r>
+      <w:proofErr w:type="spellEnd"/>
+      <w:r>
+        <w:t xml:space="preserve"> convert the items from inventory listing to donation listings,</w:t>
+      </w:r>
+    </w:p>
+    <w:p>
+      <w:pPr>
+        <w:pStyle w:val="ListParagraph"/>
+        <w:numPr>
+          <w:ilvl w:val="0"/>
+          <w:numId w:val="19"/>
+        </w:numPr>
+      </w:pPr>
+      <w:r>
+        <w:t>Browse and claim food donations – Users can search for food items</w:t>
+      </w:r>
+      <w:r>
+        <w:t xml:space="preserve"> listed by other users for donation, filtering by categories and expiry date. Items details includes the pickup location</w:t>
+      </w:r>
       <w:r>
         <w:br w:type="page"/>
       </w:r>
@@ -1756,9 +2041,30 @@
     </w:p>
     <w:p>
       <w:pPr>
+        <w:spacing w:before="240" w:line="360" w:lineRule="auto"/>
+        <w:jc w:val="both"/>
+        <w:rPr>
+          <w:rFonts w:cs="Times New Roman"/>
+          <w:szCs w:val="24"/>
+        </w:rPr>
+      </w:pPr>
+    </w:p>
+    <w:p>
+      <w:pPr>
+        <w:spacing w:before="240" w:line="360" w:lineRule="auto"/>
+        <w:jc w:val="both"/>
+        <w:rPr>
+          <w:rFonts w:cs="Times New Roman"/>
+          <w:szCs w:val="24"/>
+        </w:rPr>
+      </w:pPr>
+    </w:p>
+    <w:p>
+      <w:pPr>
         <w:pStyle w:val="Main-Heading"/>
       </w:pPr>
       <w:r>
+        <w:lastRenderedPageBreak/>
         <w:t>Risk Management Plan</w:t>
       </w:r>
     </w:p>
@@ -1817,7 +2123,6 @@
                 <w:b/>
                 <w:bCs/>
               </w:rPr>
-              <w:lastRenderedPageBreak/>
               <w:t>Risk Name</w:t>
             </w:r>
           </w:p>
@@ -1904,19 +2209,53 @@
           <w:tcPr>
             <w:tcW w:w="2254" w:type="dxa"/>
           </w:tcPr>
-          <w:p/>
+          <w:p>
+            <w:r>
+              <w:t xml:space="preserve">Team Member fall behind schedule due to academic work, lack on the required technical knowledge, technical </w:t>
+            </w:r>
+            <w:r>
+              <w:t>difficulties.</w:t>
+            </w:r>
+          </w:p>
         </w:tc>
         <w:tc>
           <w:tcPr>
             <w:tcW w:w="2254" w:type="dxa"/>
           </w:tcPr>
-          <w:p/>
+          <w:p>
+            <w:r>
+              <w:t>Medium Probability</w:t>
+            </w:r>
+          </w:p>
         </w:tc>
         <w:tc>
           <w:tcPr>
             <w:tcW w:w="2254" w:type="dxa"/>
           </w:tcPr>
-          <w:p/>
+          <w:p>
+            <w:pPr>
+              <w:pStyle w:val="ListParagraph"/>
+              <w:numPr>
+                <w:ilvl w:val="0"/>
+                <w:numId w:val="13"/>
+              </w:numPr>
+            </w:pPr>
+            <w:r>
+              <w:t>Tasks broken into small goals,</w:t>
+            </w:r>
+          </w:p>
+          <w:p>
+            <w:pPr>
+              <w:pStyle w:val="ListParagraph"/>
+              <w:numPr>
+                <w:ilvl w:val="0"/>
+                <w:numId w:val="13"/>
+              </w:numPr>
+            </w:pPr>
+            <w:r>
+              <w:t>Define technical requirements needed for the project, to be ready before hand</w:t>
+            </w:r>
+          </w:p>
         </w:tc>
       </w:tr>
       <w:tr>
@@ -1924,25 +2263,101 @@
           <w:tcPr>
             <w:tcW w:w="2254" w:type="dxa"/>
           </w:tcPr>
-          <w:p/>
+          <w:p>
+            <w:r>
+              <w:t>Data Loss and file Corruption</w:t>
+            </w:r>
+          </w:p>
         </w:tc>
         <w:tc>
           <w:tcPr>
             <w:tcW w:w="2254" w:type="dxa"/>
           </w:tcPr>
-          <w:p/>
+          <w:p>
+            <w:r>
+              <w:t>Accidental deletion and corruption of project source code or documents resulting in holdback.</w:t>
+            </w:r>
+          </w:p>
         </w:tc>
         <w:tc>
           <w:tcPr>
             <w:tcW w:w="2254" w:type="dxa"/>
           </w:tcPr>
-          <w:p/>
+          <w:p>
+            <w:r>
+              <w:t>Low Probability</w:t>
+            </w:r>
+          </w:p>
         </w:tc>
         <w:tc>
           <w:tcPr>
             <w:tcW w:w="2254" w:type="dxa"/>
           </w:tcPr>
-          <w:p/>
+          <w:p>
+            <w:pPr>
+              <w:pStyle w:val="ListParagraph"/>
+              <w:numPr>
+                <w:ilvl w:val="0"/>
+                <w:numId w:val="14"/>
+              </w:numPr>
+            </w:pPr>
+            <w:r>
+              <w:t xml:space="preserve">All file stored on </w:t>
+            </w:r>
+            <w:proofErr w:type="spellStart"/>
+            <w:r>
+              <w:t>Git</w:t>
+            </w:r>
+            <w:r>
+              <w:t>h</w:t>
+            </w:r>
+            <w:r>
+              <w:t>ub</w:t>
+            </w:r>
+            <w:proofErr w:type="spellEnd"/>
+            <w:r>
+              <w:t xml:space="preserve"> with regular commits</w:t>
+            </w:r>
+          </w:p>
+          <w:p>
+            <w:pPr>
+              <w:pStyle w:val="ListParagraph"/>
+              <w:numPr>
+                <w:ilvl w:val="0"/>
+                <w:numId w:val="14"/>
+              </w:numPr>
+            </w:pPr>
+            <w:r>
+              <w:t>Document stored on Google drive,</w:t>
+            </w:r>
+          </w:p>
+          <w:p>
+            <w:pPr>
+              <w:pStyle w:val="ListParagraph"/>
+              <w:numPr>
+                <w:ilvl w:val="0"/>
+                <w:numId w:val="14"/>
+              </w:numPr>
+            </w:pPr>
+            <w:r>
+              <w:t>Redevelop only the affected files,</w:t>
+            </w:r>
+          </w:p>
+          <w:p>
+            <w:pPr>
+              <w:pStyle w:val="ListParagraph"/>
+              <w:numPr>
+                <w:ilvl w:val="0"/>
+                <w:numId w:val="14"/>
+              </w:numPr>
+            </w:pPr>
+            <w:r>
+              <w:t>Regularly updating on all team system for latest updated</w:t>
+            </w:r>
+            <w:r>
+              <w:t>.</w:t>
+            </w:r>
+          </w:p>
         </w:tc>
       </w:tr>
       <w:tr>
@@ -1950,25 +2365,72 @@
           <w:tcPr>
             <w:tcW w:w="2254" w:type="dxa"/>
           </w:tcPr>
-          <w:p/>
+          <w:p>
+            <w:r>
+              <w:t>Miscommunication among team</w:t>
+            </w:r>
+          </w:p>
         </w:tc>
         <w:tc>
           <w:tcPr>
             <w:tcW w:w="2254" w:type="dxa"/>
           </w:tcPr>
-          <w:p/>
+          <w:p>
+            <w:r>
+              <w:t>Misaligned understanding of task requirements and project objectives among team or incompatible work between members.</w:t>
+            </w:r>
+          </w:p>
         </w:tc>
         <w:tc>
           <w:tcPr>
             <w:tcW w:w="2254" w:type="dxa"/>
           </w:tcPr>
-          <w:p/>
+          <w:p>
+            <w:r>
+              <w:t>Medium Probability</w:t>
+            </w:r>
+          </w:p>
         </w:tc>
         <w:tc>
           <w:tcPr>
             <w:tcW w:w="2254" w:type="dxa"/>
           </w:tcPr>
-          <w:p/>
+          <w:p>
+            <w:pPr>
+              <w:pStyle w:val="ListParagraph"/>
+              <w:numPr>
+                <w:ilvl w:val="0"/>
+                <w:numId w:val="15"/>
+              </w:numPr>
+            </w:pPr>
+            <w:r>
+              <w:t>Assign a team leader,</w:t>
+            </w:r>
+          </w:p>
+          <w:p>
+            <w:pPr>
+              <w:pStyle w:val="ListParagraph"/>
+              <w:numPr>
+                <w:ilvl w:val="0"/>
+                <w:numId w:val="15"/>
+              </w:numPr>
+            </w:pPr>
+            <w:r>
+              <w:t>Continuous discussion among team to maintain consistency on the project scope.</w:t>
+            </w:r>
+          </w:p>
+          <w:p>
+            <w:pPr>
+              <w:pStyle w:val="ListParagraph"/>
+              <w:numPr>
+                <w:ilvl w:val="0"/>
+                <w:numId w:val="15"/>
+              </w:numPr>
+            </w:pPr>
+            <w:r>
+              <w:t>Re-divide tasks if responsibilities overlap.</w:t>
+            </w:r>
+          </w:p>
         </w:tc>
       </w:tr>
       <w:tr>
@@ -1976,25 +2438,235 @@
           <w:tcPr>
             <w:tcW w:w="2254" w:type="dxa"/>
           </w:tcPr>
-          <w:p/>
+          <w:p>
+            <w:r>
+              <w:t>Technical Knowledge Gap</w:t>
+            </w:r>
+          </w:p>
         </w:tc>
         <w:tc>
           <w:tcPr>
             <w:tcW w:w="2254" w:type="dxa"/>
           </w:tcPr>
-          <w:p/>
+          <w:p>
+            <w:r>
+              <w:t>Any team member lacks the skill</w:t>
+            </w:r>
+            <w:r>
+              <w:t xml:space="preserve">s </w:t>
+            </w:r>
+            <w:r>
+              <w:t>required to implement a specific function, resulting in delay, and task re-distribution</w:t>
+            </w:r>
+          </w:p>
         </w:tc>
         <w:tc>
           <w:tcPr>
             <w:tcW w:w="2254" w:type="dxa"/>
           </w:tcPr>
-          <w:p/>
+          <w:p>
+            <w:r>
+              <w:t>Medium Probability</w:t>
+            </w:r>
+          </w:p>
         </w:tc>
         <w:tc>
           <w:tcPr>
             <w:tcW w:w="2254" w:type="dxa"/>
           </w:tcPr>
-          <w:p/>
+          <w:p>
+            <w:pPr>
+              <w:pStyle w:val="ListParagraph"/>
+              <w:numPr>
+                <w:ilvl w:val="0"/>
+                <w:numId w:val="16"/>
+              </w:numPr>
+            </w:pPr>
+            <w:r>
+              <w:t>Task distribution based on skills and field of knowledge,</w:t>
+            </w:r>
+          </w:p>
+          <w:p>
+            <w:pPr>
+              <w:pStyle w:val="ListParagraph"/>
+              <w:numPr>
+                <w:ilvl w:val="0"/>
+                <w:numId w:val="16"/>
+              </w:numPr>
+            </w:pPr>
+            <w:r>
+              <w:t>Conduct a knowledge sharing documentation,</w:t>
+            </w:r>
+          </w:p>
+          <w:p>
+            <w:pPr>
+              <w:pStyle w:val="ListParagraph"/>
+              <w:numPr>
+                <w:ilvl w:val="0"/>
+                <w:numId w:val="16"/>
+              </w:numPr>
+            </w:pPr>
+            <w:r>
+              <w:lastRenderedPageBreak/>
+              <w:t>Re-distribute tasks to each member</w:t>
+            </w:r>
+            <w:r>
+              <w:t>,</w:t>
+            </w:r>
+          </w:p>
+          <w:p>
+            <w:pPr>
+              <w:pStyle w:val="ListParagraph"/>
+              <w:numPr>
+                <w:ilvl w:val="0"/>
+                <w:numId w:val="16"/>
+              </w:numPr>
+            </w:pPr>
+            <w:r>
+              <w:t>Reduce unwanted complexities.</w:t>
+            </w:r>
+          </w:p>
+        </w:tc>
+      </w:tr>
+      <w:tr>
+        <w:tc>
+          <w:tcPr>
+            <w:tcW w:w="2254" w:type="dxa"/>
+          </w:tcPr>
+          <w:p>
+            <w:r>
+              <w:lastRenderedPageBreak/>
+              <w:t>Scope Creep</w:t>
+            </w:r>
+          </w:p>
+        </w:tc>
+        <w:tc>
+          <w:tcPr>
+            <w:tcW w:w="2254" w:type="dxa"/>
+          </w:tcPr>
+          <w:p>
+            <w:r>
+              <w:t>Team adds features more and more, diverging away from the project initial scopes, increasing work load and risking missed deadlines.</w:t>
+            </w:r>
+          </w:p>
+        </w:tc>
+        <w:tc>
+          <w:tcPr>
+            <w:tcW w:w="2254" w:type="dxa"/>
+          </w:tcPr>
+          <w:p>
+            <w:r>
+              <w:t xml:space="preserve">High </w:t>
+            </w:r>
+            <w:r>
+              <w:t>Possibility</w:t>
+            </w:r>
+          </w:p>
+        </w:tc>
+        <w:tc>
+          <w:tcPr>
+            <w:tcW w:w="2254" w:type="dxa"/>
+          </w:tcPr>
+          <w:p>
+            <w:pPr>
+              <w:pStyle w:val="ListParagraph"/>
+              <w:numPr>
+                <w:ilvl w:val="0"/>
+                <w:numId w:val="17"/>
+              </w:numPr>
+            </w:pPr>
+            <w:r>
+              <w:t>Proper documentation of project scope objective and features in each step of planning and implementation,</w:t>
+            </w:r>
+          </w:p>
+          <w:p>
+            <w:pPr>
+              <w:pStyle w:val="ListParagraph"/>
+              <w:numPr>
+                <w:ilvl w:val="0"/>
+                <w:numId w:val="17"/>
+              </w:numPr>
+            </w:pPr>
+            <w:r>
+              <w:t>Refer back to the project scope before adding new features</w:t>
+            </w:r>
+            <w:r>
+              <w:t>, scope changes should be agreed by all team members.</w:t>
+            </w:r>
+          </w:p>
+        </w:tc>
+      </w:tr>
+      <w:tr>
+        <w:tc>
+          <w:tcPr>
+            <w:tcW w:w="2254" w:type="dxa"/>
+          </w:tcPr>
+          <w:p>
+            <w:r>
+              <w:t>Security Vulnerability</w:t>
+            </w:r>
+          </w:p>
+        </w:tc>
+        <w:tc>
+          <w:tcPr>
+            <w:tcW w:w="2254" w:type="dxa"/>
+          </w:tcPr>
+          <w:p>
+            <w:r>
+              <w:t>The application may expose user data through insecure authentications, unvalidated, inputs, or weak session management</w:t>
+            </w:r>
+          </w:p>
+        </w:tc>
+        <w:tc>
+          <w:tcPr>
+            <w:tcW w:w="2254" w:type="dxa"/>
+          </w:tcPr>
+          <w:p>
+            <w:r>
+              <w:t>High Possibility</w:t>
+            </w:r>
+          </w:p>
+        </w:tc>
+        <w:tc>
+          <w:tcPr>
+            <w:tcW w:w="2254" w:type="dxa"/>
+          </w:tcPr>
+          <w:p>
+            <w:pPr>
+              <w:pStyle w:val="ListParagraph"/>
+              <w:numPr>
+                <w:ilvl w:val="0"/>
+                <w:numId w:val="18"/>
+              </w:numPr>
+            </w:pPr>
+            <w:r>
+              <w:t>Using Spring Security for authentication,</w:t>
+            </w:r>
+          </w:p>
+          <w:p>
+            <w:pPr>
+              <w:pStyle w:val="ListParagraph"/>
+              <w:numPr>
+                <w:ilvl w:val="0"/>
+                <w:numId w:val="18"/>
+              </w:numPr>
+            </w:pPr>
+            <w:r>
+              <w:t>Implement input validation on both frontend and backend,</w:t>
+            </w:r>
+          </w:p>
+          <w:p>
+            <w:pPr>
+              <w:pStyle w:val="ListParagraph"/>
+              <w:numPr>
+                <w:ilvl w:val="0"/>
+                <w:numId w:val="18"/>
+              </w:numPr>
+            </w:pPr>
+            <w:r>
+              <w:t>Test for common vulnerabilities.</w:t>
+            </w:r>
+          </w:p>
         </w:tc>
       </w:tr>
     </w:tbl>
@@ -2153,6 +2825,232 @@
 <file path=word/numbering.xml><?xml version="1.0" encoding="utf-8"?>
 <w:numbering xmlns:wpc="http://schemas.microsoft.com/office/word/2010/wordprocessingCanvas" xmlns:cx="http://schemas.microsoft.com/office/drawing/2014/chartex" xmlns:cx1="http://schemas.microsoft.com/office/drawing/2015/9/8/chartex" xmlns:cx2="http://schemas.microsoft.com/office/drawing/2015/10/21/chartex" xmlns:cx3="http://schemas.microsoft.com/office/drawing/2016/5/9/chartex" xmlns:cx4="http://schemas.microsoft.com/office/drawing/2016/5/10/chartex" xmlns:cx5="http://schemas.microsoft.com/office/drawing/2016/5/11/chartex" xmlns:cx6="http://schemas.microsoft.com/office/drawing/2016/5/12/chartex" xmlns:cx7="http://schemas.microsoft.com/office/drawing/2016/5/13/chartex" xmlns:cx8="http://schemas.microsoft.com/office/drawing/2016/5/14/chartex" xmlns:mc="http://schemas.openxmlformats.org/markup-compatibility/2006" xmlns:aink="http://schemas.microsoft.com/office/drawing/2016/ink" xmlns:am3d="http://schemas.microsoft.com/office/drawing/2017/model3d" xmlns:o="urn:schemas-microsoft-com:office:office" xmlns:oel="http://schemas.microsoft.com/office/2019/extlst" xmlns:r="http://schemas.openxmlformats.org/officeDocument/2006/relationships" xmlns:m="http://schemas.openxmlformats.org/officeDocument/2006/math" xmlns:v="urn:schemas-microsoft-com:vml" xmlns:wp14="http://schemas.microsoft.com/office/word/2010/wordprocessingDrawing" xmlns:wp="http://schemas.openxmlformats.org/drawingml/2006/wordprocessingDrawing" xmlns:w10="urn:schemas-microsoft-com:office:word" xmlns:w="http://schemas.openxmlformats.org/wordprocessingml/2006/main" xmlns:w14="http://schemas.microsoft.com/office/word/2010/wordml" xmlns:w15="http://schemas.microsoft.com/office/word/2012/wordml" xmlns:w16cex="http://schemas.microsoft.com/office/word/2018/wordml/cex" xmlns:w16cid="http://schemas.microsoft.com/office/word/2016/wordml/cid" xmlns:w16="http://schemas.microsoft.com/office/word/2018/wordml" xmlns:w16du="http://schemas.microsoft.com/office/word/2023/wordml/word16du" xmlns:w16sdtdh="http://schemas.microsoft.com/office/word/2020/wordml/sdtdatahash" xmlns:w16se="http://schemas.microsoft.com/office/word/2015/wordml/symex" xmlns:wpg="http://schemas.microsoft.com/office/word/2010/wordprocessingGroup" xmlns:wpi="http://schemas.microsoft.com/office/word/2010/wordprocessingInk" xmlns:wne="http://schemas.microsoft.com/office/word/2006/wordml" xmlns:wps="http://schemas.microsoft.com/office/word/2010/wordprocessingShape" mc:Ignorable="w14 w15 w16se w16cid w16 w16cex w16sdtdh wp14">
   <w:abstractNum w:abstractNumId="0" w15:restartNumberingAfterBreak="0">
+    <w:nsid w:val="0D1A55F3"/>
+    <w:multiLevelType w:val="hybridMultilevel"/>
+    <w:tmpl w:val="1A0EEEF8"/>
+    <w:lvl w:ilvl="0" w:tplc="04090001">
+      <w:start w:val="1"/>
+      <w:numFmt w:val="bullet"/>
+      <w:lvlText w:val=""/>
+      <w:lvlJc w:val="left"/>
+      <w:pPr>
+        <w:ind w:left="360" w:hanging="360"/>
+      </w:pPr>
+      <w:rPr>
+        <w:rFonts w:ascii="Symbol" w:hAnsi="Symbol" w:hint="default"/>
+      </w:rPr>
+    </w:lvl>
+    <w:lvl w:ilvl="1" w:tplc="04090003" w:tentative="1">
+      <w:start w:val="1"/>
+      <w:numFmt w:val="bullet"/>
+      <w:lvlText w:val="o"/>
+      <w:lvlJc w:val="left"/>
+      <w:pPr>
+        <w:ind w:left="1080" w:hanging="360"/>
+      </w:pPr>
+      <w:rPr>
+        <w:rFonts w:ascii="Courier New" w:hAnsi="Courier New" w:cs="Courier New" w:hint="default"/>
+      </w:rPr>
+    </w:lvl>
+    <w:lvl w:ilvl="2" w:tplc="04090005" w:tentative="1">
+      <w:start w:val="1"/>
+      <w:numFmt w:val="bullet"/>
+      <w:lvlText w:val=""/>
+      <w:lvlJc w:val="left"/>
+      <w:pPr>
+        <w:ind w:left="1800" w:hanging="360"/>
+      </w:pPr>
+      <w:rPr>
+        <w:rFonts w:ascii="Wingdings" w:hAnsi="Wingdings" w:hint="default"/>
+      </w:rPr>
+    </w:lvl>
+    <w:lvl w:ilvl="3" w:tplc="04090001" w:tentative="1">
+      <w:start w:val="1"/>
+      <w:numFmt w:val="bullet"/>
+      <w:lvlText w:val=""/>
+      <w:lvlJc w:val="left"/>
+      <w:pPr>
+        <w:ind w:left="2520" w:hanging="360"/>
+      </w:pPr>
+      <w:rPr>
+        <w:rFonts w:ascii="Symbol" w:hAnsi="Symbol" w:hint="default"/>
+      </w:rPr>
+    </w:lvl>
+    <w:lvl w:ilvl="4" w:tplc="04090003" w:tentative="1">
+      <w:start w:val="1"/>
+      <w:numFmt w:val="bullet"/>
+      <w:lvlText w:val="o"/>
+      <w:lvlJc w:val="left"/>
+      <w:pPr>
+        <w:ind w:left="3240" w:hanging="360"/>
+      </w:pPr>
+      <w:rPr>
+        <w:rFonts w:ascii="Courier New" w:hAnsi="Courier New" w:cs="Courier New" w:hint="default"/>
+      </w:rPr>
+    </w:lvl>
+    <w:lvl w:ilvl="5" w:tplc="04090005" w:tentative="1">
+      <w:start w:val="1"/>
+      <w:numFmt w:val="bullet"/>
+      <w:lvlText w:val=""/>
+      <w:lvlJc w:val="left"/>
+      <w:pPr>
+        <w:ind w:left="3960" w:hanging="360"/>
+      </w:pPr>
+      <w:rPr>
+        <w:rFonts w:ascii="Wingdings" w:hAnsi="Wingdings" w:hint="default"/>
+      </w:rPr>
+    </w:lvl>
+    <w:lvl w:ilvl="6" w:tplc="04090001" w:tentative="1">
+      <w:start w:val="1"/>
+      <w:numFmt w:val="bullet"/>
+      <w:lvlText w:val=""/>
+      <w:lvlJc w:val="left"/>
+      <w:pPr>
+        <w:ind w:left="4680" w:hanging="360"/>
+      </w:pPr>
+      <w:rPr>
+        <w:rFonts w:ascii="Symbol" w:hAnsi="Symbol" w:hint="default"/>
+      </w:rPr>
+    </w:lvl>
+    <w:lvl w:ilvl="7" w:tplc="04090003" w:tentative="1">
+      <w:start w:val="1"/>
+      <w:numFmt w:val="bullet"/>
+      <w:lvlText w:val="o"/>
+      <w:lvlJc w:val="left"/>
+      <w:pPr>
+        <w:ind w:left="5400" w:hanging="360"/>
+      </w:pPr>
+      <w:rPr>
+        <w:rFonts w:ascii="Courier New" w:hAnsi="Courier New" w:cs="Courier New" w:hint="default"/>
+      </w:rPr>
+    </w:lvl>
+    <w:lvl w:ilvl="8" w:tplc="04090005" w:tentative="1">
+      <w:start w:val="1"/>
+      <w:numFmt w:val="bullet"/>
+      <w:lvlText w:val=""/>
+      <w:lvlJc w:val="left"/>
+      <w:pPr>
+        <w:ind w:left="6120" w:hanging="360"/>
+      </w:pPr>
+      <w:rPr>
+        <w:rFonts w:ascii="Wingdings" w:hAnsi="Wingdings" w:hint="default"/>
+      </w:rPr>
+    </w:lvl>
+  </w:abstractNum>
+  <w:abstractNum w:abstractNumId="1" w15:restartNumberingAfterBreak="0">
+    <w:nsid w:val="0E767745"/>
+    <w:multiLevelType w:val="hybridMultilevel"/>
+    <w:tmpl w:val="EBC43E42"/>
+    <w:lvl w:ilvl="0" w:tplc="04090001">
+      <w:start w:val="1"/>
+      <w:numFmt w:val="bullet"/>
+      <w:lvlText w:val=""/>
+      <w:lvlJc w:val="left"/>
+      <w:pPr>
+        <w:ind w:left="360" w:hanging="360"/>
+      </w:pPr>
+      <w:rPr>
+        <w:rFonts w:ascii="Symbol" w:hAnsi="Symbol" w:hint="default"/>
+      </w:rPr>
+    </w:lvl>
+    <w:lvl w:ilvl="1" w:tplc="04090003" w:tentative="1">
+      <w:start w:val="1"/>
+      <w:numFmt w:val="bullet"/>
+      <w:lvlText w:val="o"/>
+      <w:lvlJc w:val="left"/>
+      <w:pPr>
+        <w:ind w:left="1080" w:hanging="360"/>
+      </w:pPr>
+      <w:rPr>
+        <w:rFonts w:ascii="Courier New" w:hAnsi="Courier New" w:cs="Courier New" w:hint="default"/>
+      </w:rPr>
+    </w:lvl>
+    <w:lvl w:ilvl="2" w:tplc="04090005" w:tentative="1">
+      <w:start w:val="1"/>
+      <w:numFmt w:val="bullet"/>
+      <w:lvlText w:val=""/>
+      <w:lvlJc w:val="left"/>
+      <w:pPr>
+        <w:ind w:left="1800" w:hanging="360"/>
+      </w:pPr>
+      <w:rPr>
+        <w:rFonts w:ascii="Wingdings" w:hAnsi="Wingdings" w:hint="default"/>
+      </w:rPr>
+    </w:lvl>
+    <w:lvl w:ilvl="3" w:tplc="04090001" w:tentative="1">
+      <w:start w:val="1"/>
+      <w:numFmt w:val="bullet"/>
+      <w:lvlText w:val=""/>
+      <w:lvlJc w:val="left"/>
+      <w:pPr>
+        <w:ind w:left="2520" w:hanging="360"/>
+      </w:pPr>
+      <w:rPr>
+        <w:rFonts w:ascii="Symbol" w:hAnsi="Symbol" w:hint="default"/>
+      </w:rPr>
+    </w:lvl>
+    <w:lvl w:ilvl="4" w:tplc="04090003" w:tentative="1">
+      <w:start w:val="1"/>
+      <w:numFmt w:val="bullet"/>
+      <w:lvlText w:val="o"/>
+      <w:lvlJc w:val="left"/>
+      <w:pPr>
+        <w:ind w:left="3240" w:hanging="360"/>
+      </w:pPr>
+      <w:rPr>
+        <w:rFonts w:ascii="Courier New" w:hAnsi="Courier New" w:cs="Courier New" w:hint="default"/>
+      </w:rPr>
+    </w:lvl>
+    <w:lvl w:ilvl="5" w:tplc="04090005" w:tentative="1">
+      <w:start w:val="1"/>
+      <w:numFmt w:val="bullet"/>
+      <w:lvlText w:val=""/>
+      <w:lvlJc w:val="left"/>
+      <w:pPr>
+        <w:ind w:left="3960" w:hanging="360"/>
+      </w:pPr>
+      <w:rPr>
+        <w:rFonts w:ascii="Wingdings" w:hAnsi="Wingdings" w:hint="default"/>
+      </w:rPr>
+    </w:lvl>
+    <w:lvl w:ilvl="6" w:tplc="04090001" w:tentative="1">
+      <w:start w:val="1"/>
+      <w:numFmt w:val="bullet"/>
+      <w:lvlText w:val=""/>
+      <w:lvlJc w:val="left"/>
+      <w:pPr>
+        <w:ind w:left="4680" w:hanging="360"/>
+      </w:pPr>
+      <w:rPr>
+        <w:rFonts w:ascii="Symbol" w:hAnsi="Symbol" w:hint="default"/>
+      </w:rPr>
+    </w:lvl>
+    <w:lvl w:ilvl="7" w:tplc="04090003" w:tentative="1">
+      <w:start w:val="1"/>
+      <w:numFmt w:val="bullet"/>
+      <w:lvlText w:val="o"/>
+      <w:lvlJc w:val="left"/>
+      <w:pPr>
+        <w:ind w:left="5400" w:hanging="360"/>
+      </w:pPr>
+      <w:rPr>
+        <w:rFonts w:ascii="Courier New" w:hAnsi="Courier New" w:cs="Courier New" w:hint="default"/>
+      </w:rPr>
+    </w:lvl>
+    <w:lvl w:ilvl="8" w:tplc="04090005" w:tentative="1">
+      <w:start w:val="1"/>
+      <w:numFmt w:val="bullet"/>
+      <w:lvlText w:val=""/>
+      <w:lvlJc w:val="left"/>
+      <w:pPr>
+        <w:ind w:left="6120" w:hanging="360"/>
+      </w:pPr>
+      <w:rPr>
+        <w:rFonts w:ascii="Wingdings" w:hAnsi="Wingdings" w:hint="default"/>
+      </w:rPr>
+    </w:lvl>
+  </w:abstractNum>
+  <w:abstractNum w:abstractNumId="2" w15:restartNumberingAfterBreak="0">
     <w:nsid w:val="2AEF3CF5"/>
     <w:multiLevelType w:val="hybridMultilevel"/>
     <w:tmpl w:val="85D25698"/>
@@ -2265,7 +3163,233 @@
       </w:rPr>
     </w:lvl>
   </w:abstractNum>
-  <w:abstractNum w:abstractNumId="1" w15:restartNumberingAfterBreak="0">
+  <w:abstractNum w:abstractNumId="3" w15:restartNumberingAfterBreak="0">
+    <w:nsid w:val="327E37C8"/>
+    <w:multiLevelType w:val="hybridMultilevel"/>
+    <w:tmpl w:val="73E6D44A"/>
+    <w:lvl w:ilvl="0" w:tplc="04090001">
+      <w:start w:val="1"/>
+      <w:numFmt w:val="bullet"/>
+      <w:lvlText w:val=""/>
+      <w:lvlJc w:val="left"/>
+      <w:pPr>
+        <w:ind w:left="360" w:hanging="360"/>
+      </w:pPr>
+      <w:rPr>
+        <w:rFonts w:ascii="Symbol" w:hAnsi="Symbol" w:hint="default"/>
+      </w:rPr>
+    </w:lvl>
+    <w:lvl w:ilvl="1" w:tplc="04090003" w:tentative="1">
+      <w:start w:val="1"/>
+      <w:numFmt w:val="bullet"/>
+      <w:lvlText w:val="o"/>
+      <w:lvlJc w:val="left"/>
+      <w:pPr>
+        <w:ind w:left="1080" w:hanging="360"/>
+      </w:pPr>
+      <w:rPr>
+        <w:rFonts w:ascii="Courier New" w:hAnsi="Courier New" w:cs="Courier New" w:hint="default"/>
+      </w:rPr>
+    </w:lvl>
+    <w:lvl w:ilvl="2" w:tplc="04090005" w:tentative="1">
+      <w:start w:val="1"/>
+      <w:numFmt w:val="bullet"/>
+      <w:lvlText w:val=""/>
+      <w:lvlJc w:val="left"/>
+      <w:pPr>
+        <w:ind w:left="1800" w:hanging="360"/>
+      </w:pPr>
+      <w:rPr>
+        <w:rFonts w:ascii="Wingdings" w:hAnsi="Wingdings" w:hint="default"/>
+      </w:rPr>
+    </w:lvl>
+    <w:lvl w:ilvl="3" w:tplc="04090001" w:tentative="1">
+      <w:start w:val="1"/>
+      <w:numFmt w:val="bullet"/>
+      <w:lvlText w:val=""/>
+      <w:lvlJc w:val="left"/>
+      <w:pPr>
+        <w:ind w:left="2520" w:hanging="360"/>
+      </w:pPr>
+      <w:rPr>
+        <w:rFonts w:ascii="Symbol" w:hAnsi="Symbol" w:hint="default"/>
+      </w:rPr>
+    </w:lvl>
+    <w:lvl w:ilvl="4" w:tplc="04090003" w:tentative="1">
+      <w:start w:val="1"/>
+      <w:numFmt w:val="bullet"/>
+      <w:lvlText w:val="o"/>
+      <w:lvlJc w:val="left"/>
+      <w:pPr>
+        <w:ind w:left="3240" w:hanging="360"/>
+      </w:pPr>
+      <w:rPr>
+        <w:rFonts w:ascii="Courier New" w:hAnsi="Courier New" w:cs="Courier New" w:hint="default"/>
+      </w:rPr>
+    </w:lvl>
+    <w:lvl w:ilvl="5" w:tplc="04090005" w:tentative="1">
+      <w:start w:val="1"/>
+      <w:numFmt w:val="bullet"/>
+      <w:lvlText w:val=""/>
+      <w:lvlJc w:val="left"/>
+      <w:pPr>
+        <w:ind w:left="3960" w:hanging="360"/>
+      </w:pPr>
+      <w:rPr>
+        <w:rFonts w:ascii="Wingdings" w:hAnsi="Wingdings" w:hint="default"/>
+      </w:rPr>
+    </w:lvl>
+    <w:lvl w:ilvl="6" w:tplc="04090001" w:tentative="1">
+      <w:start w:val="1"/>
+      <w:numFmt w:val="bullet"/>
+      <w:lvlText w:val=""/>
+      <w:lvlJc w:val="left"/>
+      <w:pPr>
+        <w:ind w:left="4680" w:hanging="360"/>
+      </w:pPr>
+      <w:rPr>
+        <w:rFonts w:ascii="Symbol" w:hAnsi="Symbol" w:hint="default"/>
+      </w:rPr>
+    </w:lvl>
+    <w:lvl w:ilvl="7" w:tplc="04090003" w:tentative="1">
+      <w:start w:val="1"/>
+      <w:numFmt w:val="bullet"/>
+      <w:lvlText w:val="o"/>
+      <w:lvlJc w:val="left"/>
+      <w:pPr>
+        <w:ind w:left="5400" w:hanging="360"/>
+      </w:pPr>
+      <w:rPr>
+        <w:rFonts w:ascii="Courier New" w:hAnsi="Courier New" w:cs="Courier New" w:hint="default"/>
+      </w:rPr>
+    </w:lvl>
+    <w:lvl w:ilvl="8" w:tplc="04090005" w:tentative="1">
+      <w:start w:val="1"/>
+      <w:numFmt w:val="bullet"/>
+      <w:lvlText w:val=""/>
+      <w:lvlJc w:val="left"/>
+      <w:pPr>
+        <w:ind w:left="6120" w:hanging="360"/>
+      </w:pPr>
+      <w:rPr>
+        <w:rFonts w:ascii="Wingdings" w:hAnsi="Wingdings" w:hint="default"/>
+      </w:rPr>
+    </w:lvl>
+  </w:abstractNum>
+  <w:abstractNum w:abstractNumId="4" w15:restartNumberingAfterBreak="0">
+    <w:nsid w:val="32F0661F"/>
+    <w:multiLevelType w:val="hybridMultilevel"/>
+    <w:tmpl w:val="252C934A"/>
+    <w:lvl w:ilvl="0" w:tplc="04090001">
+      <w:start w:val="1"/>
+      <w:numFmt w:val="bullet"/>
+      <w:lvlText w:val=""/>
+      <w:lvlJc w:val="left"/>
+      <w:pPr>
+        <w:ind w:left="360" w:hanging="360"/>
+      </w:pPr>
+      <w:rPr>
+        <w:rFonts w:ascii="Symbol" w:hAnsi="Symbol" w:hint="default"/>
+      </w:rPr>
+    </w:lvl>
+    <w:lvl w:ilvl="1" w:tplc="04090003" w:tentative="1">
+      <w:start w:val="1"/>
+      <w:numFmt w:val="bullet"/>
+      <w:lvlText w:val="o"/>
+      <w:lvlJc w:val="left"/>
+      <w:pPr>
+        <w:ind w:left="1080" w:hanging="360"/>
+      </w:pPr>
+      <w:rPr>
+        <w:rFonts w:ascii="Courier New" w:hAnsi="Courier New" w:cs="Courier New" w:hint="default"/>
+      </w:rPr>
+    </w:lvl>
+    <w:lvl w:ilvl="2" w:tplc="04090005" w:tentative="1">
+      <w:start w:val="1"/>
+      <w:numFmt w:val="bullet"/>
+      <w:lvlText w:val=""/>
+      <w:lvlJc w:val="left"/>
+      <w:pPr>
+        <w:ind w:left="1800" w:hanging="360"/>
+      </w:pPr>
+      <w:rPr>
+        <w:rFonts w:ascii="Wingdings" w:hAnsi="Wingdings" w:hint="default"/>
+      </w:rPr>
+    </w:lvl>
+    <w:lvl w:ilvl="3" w:tplc="04090001" w:tentative="1">
+      <w:start w:val="1"/>
+      <w:numFmt w:val="bullet"/>
+      <w:lvlText w:val=""/>
+      <w:lvlJc w:val="left"/>
+      <w:pPr>
+        <w:ind w:left="2520" w:hanging="360"/>
+      </w:pPr>
+      <w:rPr>
+        <w:rFonts w:ascii="Symbol" w:hAnsi="Symbol" w:hint="default"/>
+      </w:rPr>
+    </w:lvl>
+    <w:lvl w:ilvl="4" w:tplc="04090003" w:tentative="1">
+      <w:start w:val="1"/>
+      <w:numFmt w:val="bullet"/>
+      <w:lvlText w:val="o"/>
+      <w:lvlJc w:val="left"/>
+      <w:pPr>
+        <w:ind w:left="3240" w:hanging="360"/>
+      </w:pPr>
+      <w:rPr>
+        <w:rFonts w:ascii="Courier New" w:hAnsi="Courier New" w:cs="Courier New" w:hint="default"/>
+      </w:rPr>
+    </w:lvl>
+    <w:lvl w:ilvl="5" w:tplc="04090005" w:tentative="1">
+      <w:start w:val="1"/>
+      <w:numFmt w:val="bullet"/>
+      <w:lvlText w:val=""/>
+      <w:lvlJc w:val="left"/>
+      <w:pPr>
+        <w:ind w:left="3960" w:hanging="360"/>
+      </w:pPr>
+      <w:rPr>
+        <w:rFonts w:ascii="Wingdings" w:hAnsi="Wingdings" w:hint="default"/>
+      </w:rPr>
+    </w:lvl>
+    <w:lvl w:ilvl="6" w:tplc="04090001" w:tentative="1">
+      <w:start w:val="1"/>
+      <w:numFmt w:val="bullet"/>
+      <w:lvlText w:val=""/>
+      <w:lvlJc w:val="left"/>
+      <w:pPr>
+        <w:ind w:left="4680" w:hanging="360"/>
+      </w:pPr>
+      <w:rPr>
+        <w:rFonts w:ascii="Symbol" w:hAnsi="Symbol" w:hint="default"/>
+      </w:rPr>
+    </w:lvl>
+    <w:lvl w:ilvl="7" w:tplc="04090003" w:tentative="1">
+      <w:start w:val="1"/>
+      <w:numFmt w:val="bullet"/>
+      <w:lvlText w:val="o"/>
+      <w:lvlJc w:val="left"/>
+      <w:pPr>
+        <w:ind w:left="5400" w:hanging="360"/>
+      </w:pPr>
+      <w:rPr>
+        <w:rFonts w:ascii="Courier New" w:hAnsi="Courier New" w:cs="Courier New" w:hint="default"/>
+      </w:rPr>
+    </w:lvl>
+    <w:lvl w:ilvl="8" w:tplc="04090005" w:tentative="1">
+      <w:start w:val="1"/>
+      <w:numFmt w:val="bullet"/>
+      <w:lvlText w:val=""/>
+      <w:lvlJc w:val="left"/>
+      <w:pPr>
+        <w:ind w:left="6120" w:hanging="360"/>
+      </w:pPr>
+      <w:rPr>
+        <w:rFonts w:ascii="Wingdings" w:hAnsi="Wingdings" w:hint="default"/>
+      </w:rPr>
+    </w:lvl>
+  </w:abstractNum>
+  <w:abstractNum w:abstractNumId="5" w15:restartNumberingAfterBreak="0">
     <w:nsid w:val="333C3090"/>
     <w:multiLevelType w:val="hybridMultilevel"/>
     <w:tmpl w:val="690084A4"/>
@@ -2378,7 +3502,120 @@
       </w:rPr>
     </w:lvl>
   </w:abstractNum>
-  <w:abstractNum w:abstractNumId="2" w15:restartNumberingAfterBreak="0">
+  <w:abstractNum w:abstractNumId="6" w15:restartNumberingAfterBreak="0">
+    <w:nsid w:val="429B71C9"/>
+    <w:multiLevelType w:val="hybridMultilevel"/>
+    <w:tmpl w:val="DF6CBBC4"/>
+    <w:lvl w:ilvl="0" w:tplc="04090001">
+      <w:start w:val="1"/>
+      <w:numFmt w:val="bullet"/>
+      <w:lvlText w:val=""/>
+      <w:lvlJc w:val="left"/>
+      <w:pPr>
+        <w:ind w:left="360" w:hanging="360"/>
+      </w:pPr>
+      <w:rPr>
+        <w:rFonts w:ascii="Symbol" w:hAnsi="Symbol" w:hint="default"/>
+      </w:rPr>
+    </w:lvl>
+    <w:lvl w:ilvl="1" w:tplc="04090003" w:tentative="1">
+      <w:start w:val="1"/>
+      <w:numFmt w:val="bullet"/>
+      <w:lvlText w:val="o"/>
+      <w:lvlJc w:val="left"/>
+      <w:pPr>
+        <w:ind w:left="1080" w:hanging="360"/>
+      </w:pPr>
+      <w:rPr>
+        <w:rFonts w:ascii="Courier New" w:hAnsi="Courier New" w:cs="Courier New" w:hint="default"/>
+      </w:rPr>
+    </w:lvl>
+    <w:lvl w:ilvl="2" w:tplc="04090005" w:tentative="1">
+      <w:start w:val="1"/>
+      <w:numFmt w:val="bullet"/>
+      <w:lvlText w:val=""/>
+      <w:lvlJc w:val="left"/>
+      <w:pPr>
+        <w:ind w:left="1800" w:hanging="360"/>
+      </w:pPr>
+      <w:rPr>
+        <w:rFonts w:ascii="Wingdings" w:hAnsi="Wingdings" w:hint="default"/>
+      </w:rPr>
+    </w:lvl>
+    <w:lvl w:ilvl="3" w:tplc="04090001" w:tentative="1">
+      <w:start w:val="1"/>
+      <w:numFmt w:val="bullet"/>
+      <w:lvlText w:val=""/>
+      <w:lvlJc w:val="left"/>
+      <w:pPr>
+        <w:ind w:left="2520" w:hanging="360"/>
+      </w:pPr>
+      <w:rPr>
+        <w:rFonts w:ascii="Symbol" w:hAnsi="Symbol" w:hint="default"/>
+      </w:rPr>
+    </w:lvl>
+    <w:lvl w:ilvl="4" w:tplc="04090003" w:tentative="1">
+      <w:start w:val="1"/>
+      <w:numFmt w:val="bullet"/>
+      <w:lvlText w:val="o"/>
+      <w:lvlJc w:val="left"/>
+      <w:pPr>
+        <w:ind w:left="3240" w:hanging="360"/>
+      </w:pPr>
+      <w:rPr>
+        <w:rFonts w:ascii="Courier New" w:hAnsi="Courier New" w:cs="Courier New" w:hint="default"/>
+      </w:rPr>
+    </w:lvl>
+    <w:lvl w:ilvl="5" w:tplc="04090005" w:tentative="1">
+      <w:start w:val="1"/>
+      <w:numFmt w:val="bullet"/>
+      <w:lvlText w:val=""/>
+      <w:lvlJc w:val="left"/>
+      <w:pPr>
+        <w:ind w:left="3960" w:hanging="360"/>
+      </w:pPr>
+      <w:rPr>
+        <w:rFonts w:ascii="Wingdings" w:hAnsi="Wingdings" w:hint="default"/>
+      </w:rPr>
+    </w:lvl>
+    <w:lvl w:ilvl="6" w:tplc="04090001" w:tentative="1">
+      <w:start w:val="1"/>
+      <w:numFmt w:val="bullet"/>
+      <w:lvlText w:val=""/>
+      <w:lvlJc w:val="left"/>
+      <w:pPr>
+        <w:ind w:left="4680" w:hanging="360"/>
+      </w:pPr>
+      <w:rPr>
+        <w:rFonts w:ascii="Symbol" w:hAnsi="Symbol" w:hint="default"/>
+      </w:rPr>
+    </w:lvl>
+    <w:lvl w:ilvl="7" w:tplc="04090003" w:tentative="1">
+      <w:start w:val="1"/>
+      <w:numFmt w:val="bullet"/>
+      <w:lvlText w:val="o"/>
+      <w:lvlJc w:val="left"/>
+      <w:pPr>
+        <w:ind w:left="5400" w:hanging="360"/>
+      </w:pPr>
+      <w:rPr>
+        <w:rFonts w:ascii="Courier New" w:hAnsi="Courier New" w:cs="Courier New" w:hint="default"/>
+      </w:rPr>
+    </w:lvl>
+    <w:lvl w:ilvl="8" w:tplc="04090005" w:tentative="1">
+      <w:start w:val="1"/>
+      <w:numFmt w:val="bullet"/>
+      <w:lvlText w:val=""/>
+      <w:lvlJc w:val="left"/>
+      <w:pPr>
+        <w:ind w:left="6120" w:hanging="360"/>
+      </w:pPr>
+      <w:rPr>
+        <w:rFonts w:ascii="Wingdings" w:hAnsi="Wingdings" w:hint="default"/>
+      </w:rPr>
+    </w:lvl>
+  </w:abstractNum>
+  <w:abstractNum w:abstractNumId="7" w15:restartNumberingAfterBreak="0">
     <w:nsid w:val="48191DAB"/>
     <w:multiLevelType w:val="hybridMultilevel"/>
     <w:tmpl w:val="AF225A38"/>
@@ -2491,7 +3728,7 @@
       </w:rPr>
     </w:lvl>
   </w:abstractNum>
-  <w:abstractNum w:abstractNumId="3" w15:restartNumberingAfterBreak="0">
+  <w:abstractNum w:abstractNumId="8" w15:restartNumberingAfterBreak="0">
     <w:nsid w:val="4BC335D7"/>
     <w:multiLevelType w:val="multilevel"/>
     <w:tmpl w:val="689C936C"/>
@@ -2604,7 +3841,7 @@
       </w:pPr>
     </w:lvl>
   </w:abstractNum>
-  <w:abstractNum w:abstractNumId="4" w15:restartNumberingAfterBreak="0">
+  <w:abstractNum w:abstractNumId="9" w15:restartNumberingAfterBreak="0">
     <w:nsid w:val="525726A9"/>
     <w:multiLevelType w:val="hybridMultilevel"/>
     <w:tmpl w:val="01D2402A"/>
@@ -2697,7 +3934,7 @@
       </w:pPr>
     </w:lvl>
   </w:abstractNum>
-  <w:abstractNum w:abstractNumId="5" w15:restartNumberingAfterBreak="0">
+  <w:abstractNum w:abstractNumId="10" w15:restartNumberingAfterBreak="0">
     <w:nsid w:val="58502B1D"/>
     <w:multiLevelType w:val="multilevel"/>
     <w:tmpl w:val="D93A3E4A"/>
@@ -2827,7 +4064,209 @@
       </w:rPr>
     </w:lvl>
   </w:abstractNum>
-  <w:abstractNum w:abstractNumId="6" w15:restartNumberingAfterBreak="0">
+  <w:abstractNum w:abstractNumId="11" w15:restartNumberingAfterBreak="0">
+    <w:nsid w:val="5BBE4137"/>
+    <w:multiLevelType w:val="hybridMultilevel"/>
+    <w:tmpl w:val="13AAE67E"/>
+    <w:lvl w:ilvl="0" w:tplc="50A074B0">
+      <w:start w:val="1"/>
+      <w:numFmt w:val="upperRoman"/>
+      <w:lvlText w:val="%1."/>
+      <w:lvlJc w:val="left"/>
+      <w:pPr>
+        <w:ind w:left="1080" w:hanging="720"/>
+      </w:pPr>
+      <w:rPr>
+        <w:rFonts w:hint="default"/>
+      </w:rPr>
+    </w:lvl>
+    <w:lvl w:ilvl="1" w:tplc="04090019" w:tentative="1">
+      <w:start w:val="1"/>
+      <w:numFmt w:val="lowerLetter"/>
+      <w:lvlText w:val="%2."/>
+      <w:lvlJc w:val="left"/>
+      <w:pPr>
+        <w:ind w:left="1440" w:hanging="360"/>
+      </w:pPr>
+    </w:lvl>
+    <w:lvl w:ilvl="2" w:tplc="0409001B" w:tentative="1">
+      <w:start w:val="1"/>
+      <w:numFmt w:val="lowerRoman"/>
+      <w:lvlText w:val="%3."/>
+      <w:lvlJc w:val="right"/>
+      <w:pPr>
+        <w:ind w:left="2160" w:hanging="180"/>
+      </w:pPr>
+    </w:lvl>
+    <w:lvl w:ilvl="3" w:tplc="0409000F" w:tentative="1">
+      <w:start w:val="1"/>
+      <w:numFmt w:val="decimal"/>
+      <w:lvlText w:val="%4."/>
+      <w:lvlJc w:val="left"/>
+      <w:pPr>
+        <w:ind w:left="2880" w:hanging="360"/>
+      </w:pPr>
+    </w:lvl>
+    <w:lvl w:ilvl="4" w:tplc="04090019" w:tentative="1">
+      <w:start w:val="1"/>
+      <w:numFmt w:val="lowerLetter"/>
+      <w:lvlText w:val="%5."/>
+      <w:lvlJc w:val="left"/>
+      <w:pPr>
+        <w:ind w:left="3600" w:hanging="360"/>
+      </w:pPr>
+    </w:lvl>
+    <w:lvl w:ilvl="5" w:tplc="0409001B" w:tentative="1">
+      <w:start w:val="1"/>
+      <w:numFmt w:val="lowerRoman"/>
+      <w:lvlText w:val="%6."/>
+      <w:lvlJc w:val="right"/>
+      <w:pPr>
+        <w:ind w:left="4320" w:hanging="180"/>
+      </w:pPr>
+    </w:lvl>
+    <w:lvl w:ilvl="6" w:tplc="0409000F" w:tentative="1">
+      <w:start w:val="1"/>
+      <w:numFmt w:val="decimal"/>
+      <w:lvlText w:val="%7."/>
+      <w:lvlJc w:val="left"/>
+      <w:pPr>
+        <w:ind w:left="5040" w:hanging="360"/>
+      </w:pPr>
+    </w:lvl>
+    <w:lvl w:ilvl="7" w:tplc="04090019" w:tentative="1">
+      <w:start w:val="1"/>
+      <w:numFmt w:val="lowerLetter"/>
+      <w:lvlText w:val="%8."/>
+      <w:lvlJc w:val="left"/>
+      <w:pPr>
+        <w:ind w:left="5760" w:hanging="360"/>
+      </w:pPr>
+    </w:lvl>
+    <w:lvl w:ilvl="8" w:tplc="0409001B" w:tentative="1">
+      <w:start w:val="1"/>
+      <w:numFmt w:val="lowerRoman"/>
+      <w:lvlText w:val="%9."/>
+      <w:lvlJc w:val="right"/>
+      <w:pPr>
+        <w:ind w:left="6480" w:hanging="180"/>
+      </w:pPr>
+    </w:lvl>
+  </w:abstractNum>
+  <w:abstractNum w:abstractNumId="12" w15:restartNumberingAfterBreak="0">
+    <w:nsid w:val="5F365857"/>
+    <w:multiLevelType w:val="hybridMultilevel"/>
+    <w:tmpl w:val="9202E796"/>
+    <w:lvl w:ilvl="0" w:tplc="04090001">
+      <w:start w:val="1"/>
+      <w:numFmt w:val="bullet"/>
+      <w:lvlText w:val=""/>
+      <w:lvlJc w:val="left"/>
+      <w:pPr>
+        <w:ind w:left="1080" w:hanging="360"/>
+      </w:pPr>
+      <w:rPr>
+        <w:rFonts w:ascii="Symbol" w:hAnsi="Symbol" w:hint="default"/>
+      </w:rPr>
+    </w:lvl>
+    <w:lvl w:ilvl="1" w:tplc="04090003" w:tentative="1">
+      <w:start w:val="1"/>
+      <w:numFmt w:val="bullet"/>
+      <w:lvlText w:val="o"/>
+      <w:lvlJc w:val="left"/>
+      <w:pPr>
+        <w:ind w:left="1800" w:hanging="360"/>
+      </w:pPr>
+      <w:rPr>
+        <w:rFonts w:ascii="Courier New" w:hAnsi="Courier New" w:cs="Courier New" w:hint="default"/>
+      </w:rPr>
+    </w:lvl>
+    <w:lvl w:ilvl="2" w:tplc="04090005" w:tentative="1">
+      <w:start w:val="1"/>
+      <w:numFmt w:val="bullet"/>
+      <w:lvlText w:val=""/>
+      <w:lvlJc w:val="left"/>
+      <w:pPr>
+        <w:ind w:left="2520" w:hanging="360"/>
+      </w:pPr>
+      <w:rPr>
+        <w:rFonts w:ascii="Wingdings" w:hAnsi="Wingdings" w:hint="default"/>
+      </w:rPr>
+    </w:lvl>
+    <w:lvl w:ilvl="3" w:tplc="04090001" w:tentative="1">
+      <w:start w:val="1"/>
+      <w:numFmt w:val="bullet"/>
+      <w:lvlText w:val=""/>
+      <w:lvlJc w:val="left"/>
+      <w:pPr>
+        <w:ind w:left="3240" w:hanging="360"/>
+      </w:pPr>
+      <w:rPr>
+        <w:rFonts w:ascii="Symbol" w:hAnsi="Symbol" w:hint="default"/>
+      </w:rPr>
+    </w:lvl>
+    <w:lvl w:ilvl="4" w:tplc="04090003" w:tentative="1">
+      <w:start w:val="1"/>
+      <w:numFmt w:val="bullet"/>
+      <w:lvlText w:val="o"/>
+      <w:lvlJc w:val="left"/>
+      <w:pPr>
+        <w:ind w:left="3960" w:hanging="360"/>
+      </w:pPr>
+      <w:rPr>
+        <w:rFonts w:ascii="Courier New" w:hAnsi="Courier New" w:cs="Courier New" w:hint="default"/>
+      </w:rPr>
+    </w:lvl>
+    <w:lvl w:ilvl="5" w:tplc="04090005" w:tentative="1">
+      <w:start w:val="1"/>
+      <w:numFmt w:val="bullet"/>
+      <w:lvlText w:val=""/>
+      <w:lvlJc w:val="left"/>
+      <w:pPr>
+        <w:ind w:left="4680" w:hanging="360"/>
+      </w:pPr>
+      <w:rPr>
+        <w:rFonts w:ascii="Wingdings" w:hAnsi="Wingdings" w:hint="default"/>
+      </w:rPr>
+    </w:lvl>
+    <w:lvl w:ilvl="6" w:tplc="04090001" w:tentative="1">
+      <w:start w:val="1"/>
+      <w:numFmt w:val="bullet"/>
+      <w:lvlText w:val=""/>
+      <w:lvlJc w:val="left"/>
+      <w:pPr>
+        <w:ind w:left="5400" w:hanging="360"/>
+      </w:pPr>
+      <w:rPr>
+        <w:rFonts w:ascii="Symbol" w:hAnsi="Symbol" w:hint="default"/>
+      </w:rPr>
+    </w:lvl>
+    <w:lvl w:ilvl="7" w:tplc="04090003" w:tentative="1">
+      <w:start w:val="1"/>
+      <w:numFmt w:val="bullet"/>
+      <w:lvlText w:val="o"/>
+      <w:lvlJc w:val="left"/>
+      <w:pPr>
+        <w:ind w:left="6120" w:hanging="360"/>
+      </w:pPr>
+      <w:rPr>
+        <w:rFonts w:ascii="Courier New" w:hAnsi="Courier New" w:cs="Courier New" w:hint="default"/>
+      </w:rPr>
+    </w:lvl>
+    <w:lvl w:ilvl="8" w:tplc="04090005" w:tentative="1">
+      <w:start w:val="1"/>
+      <w:numFmt w:val="bullet"/>
+      <w:lvlText w:val=""/>
+      <w:lvlJc w:val="left"/>
+      <w:pPr>
+        <w:ind w:left="6840" w:hanging="360"/>
+      </w:pPr>
+      <w:rPr>
+        <w:rFonts w:ascii="Wingdings" w:hAnsi="Wingdings" w:hint="default"/>
+      </w:rPr>
+    </w:lvl>
+  </w:abstractNum>
+  <w:abstractNum w:abstractNumId="13" w15:restartNumberingAfterBreak="0">
     <w:nsid w:val="689C666C"/>
     <w:multiLevelType w:val="multilevel"/>
     <w:tmpl w:val="EE2EDA7E"/>
@@ -2941,7 +4380,120 @@
       </w:pPr>
     </w:lvl>
   </w:abstractNum>
-  <w:abstractNum w:abstractNumId="7" w15:restartNumberingAfterBreak="0">
+  <w:abstractNum w:abstractNumId="14" w15:restartNumberingAfterBreak="0">
+    <w:nsid w:val="6DCB40BA"/>
+    <w:multiLevelType w:val="hybridMultilevel"/>
+    <w:tmpl w:val="A788963A"/>
+    <w:lvl w:ilvl="0" w:tplc="04090001">
+      <w:start w:val="1"/>
+      <w:numFmt w:val="bullet"/>
+      <w:lvlText w:val=""/>
+      <w:lvlJc w:val="left"/>
+      <w:pPr>
+        <w:ind w:left="360" w:hanging="360"/>
+      </w:pPr>
+      <w:rPr>
+        <w:rFonts w:ascii="Symbol" w:hAnsi="Symbol" w:hint="default"/>
+      </w:rPr>
+    </w:lvl>
+    <w:lvl w:ilvl="1" w:tplc="04090003" w:tentative="1">
+      <w:start w:val="1"/>
+      <w:numFmt w:val="bullet"/>
+      <w:lvlText w:val="o"/>
+      <w:lvlJc w:val="left"/>
+      <w:pPr>
+        <w:ind w:left="1080" w:hanging="360"/>
+      </w:pPr>
+      <w:rPr>
+        <w:rFonts w:ascii="Courier New" w:hAnsi="Courier New" w:cs="Courier New" w:hint="default"/>
+      </w:rPr>
+    </w:lvl>
+    <w:lvl w:ilvl="2" w:tplc="04090005" w:tentative="1">
+      <w:start w:val="1"/>
+      <w:numFmt w:val="bullet"/>
+      <w:lvlText w:val=""/>
+      <w:lvlJc w:val="left"/>
+      <w:pPr>
+        <w:ind w:left="1800" w:hanging="360"/>
+      </w:pPr>
+      <w:rPr>
+        <w:rFonts w:ascii="Wingdings" w:hAnsi="Wingdings" w:hint="default"/>
+      </w:rPr>
+    </w:lvl>
+    <w:lvl w:ilvl="3" w:tplc="04090001" w:tentative="1">
+      <w:start w:val="1"/>
+      <w:numFmt w:val="bullet"/>
+      <w:lvlText w:val=""/>
+      <w:lvlJc w:val="left"/>
+      <w:pPr>
+        <w:ind w:left="2520" w:hanging="360"/>
+      </w:pPr>
+      <w:rPr>
+        <w:rFonts w:ascii="Symbol" w:hAnsi="Symbol" w:hint="default"/>
+      </w:rPr>
+    </w:lvl>
+    <w:lvl w:ilvl="4" w:tplc="04090003" w:tentative="1">
+      <w:start w:val="1"/>
+      <w:numFmt w:val="bullet"/>
+      <w:lvlText w:val="o"/>
+      <w:lvlJc w:val="left"/>
+      <w:pPr>
+        <w:ind w:left="3240" w:hanging="360"/>
+      </w:pPr>
+      <w:rPr>
+        <w:rFonts w:ascii="Courier New" w:hAnsi="Courier New" w:cs="Courier New" w:hint="default"/>
+      </w:rPr>
+    </w:lvl>
+    <w:lvl w:ilvl="5" w:tplc="04090005" w:tentative="1">
+      <w:start w:val="1"/>
+      <w:numFmt w:val="bullet"/>
+      <w:lvlText w:val=""/>
+      <w:lvlJc w:val="left"/>
+      <w:pPr>
+        <w:ind w:left="3960" w:hanging="360"/>
+      </w:pPr>
+      <w:rPr>
+        <w:rFonts w:ascii="Wingdings" w:hAnsi="Wingdings" w:hint="default"/>
+      </w:rPr>
+    </w:lvl>
+    <w:lvl w:ilvl="6" w:tplc="04090001" w:tentative="1">
+      <w:start w:val="1"/>
+      <w:numFmt w:val="bullet"/>
+      <w:lvlText w:val=""/>
+      <w:lvlJc w:val="left"/>
+      <w:pPr>
+        <w:ind w:left="4680" w:hanging="360"/>
+      </w:pPr>
+      <w:rPr>
+        <w:rFonts w:ascii="Symbol" w:hAnsi="Symbol" w:hint="default"/>
+      </w:rPr>
+    </w:lvl>
+    <w:lvl w:ilvl="7" w:tplc="04090003" w:tentative="1">
+      <w:start w:val="1"/>
+      <w:numFmt w:val="bullet"/>
+      <w:lvlText w:val="o"/>
+      <w:lvlJc w:val="left"/>
+      <w:pPr>
+        <w:ind w:left="5400" w:hanging="360"/>
+      </w:pPr>
+      <w:rPr>
+        <w:rFonts w:ascii="Courier New" w:hAnsi="Courier New" w:cs="Courier New" w:hint="default"/>
+      </w:rPr>
+    </w:lvl>
+    <w:lvl w:ilvl="8" w:tplc="04090005" w:tentative="1">
+      <w:start w:val="1"/>
+      <w:numFmt w:val="bullet"/>
+      <w:lvlText w:val=""/>
+      <w:lvlJc w:val="left"/>
+      <w:pPr>
+        <w:ind w:left="6120" w:hanging="360"/>
+      </w:pPr>
+      <w:rPr>
+        <w:rFonts w:ascii="Wingdings" w:hAnsi="Wingdings" w:hint="default"/>
+      </w:rPr>
+    </w:lvl>
+  </w:abstractNum>
+  <w:abstractNum w:abstractNumId="15" w15:restartNumberingAfterBreak="0">
     <w:nsid w:val="797666BE"/>
     <w:multiLevelType w:val="hybridMultilevel"/>
     <w:tmpl w:val="66DC98DA"/>
@@ -3027,7 +4579,7 @@
       </w:pPr>
     </w:lvl>
   </w:abstractNum>
-  <w:abstractNum w:abstractNumId="8" w15:restartNumberingAfterBreak="0">
+  <w:abstractNum w:abstractNumId="16" w15:restartNumberingAfterBreak="0">
     <w:nsid w:val="7A1B41C8"/>
     <w:multiLevelType w:val="hybridMultilevel"/>
     <w:tmpl w:val="4320A172"/>
@@ -3117,37 +4669,61 @@
     </w:lvl>
   </w:abstractNum>
   <w:num w:numId="1" w16cid:durableId="1153060903">
+    <w:abstractNumId w:val="10"/>
+  </w:num>
+  <w:num w:numId="2" w16cid:durableId="1660188722">
+    <w:abstractNumId w:val="10"/>
+  </w:num>
+  <w:num w:numId="3" w16cid:durableId="282200120">
+    <w:abstractNumId w:val="8"/>
+  </w:num>
+  <w:num w:numId="4" w16cid:durableId="800465909">
+    <w:abstractNumId w:val="10"/>
+  </w:num>
+  <w:num w:numId="5" w16cid:durableId="1347711845">
+    <w:abstractNumId w:val="13"/>
+  </w:num>
+  <w:num w:numId="6" w16cid:durableId="206335731">
+    <w:abstractNumId w:val="16"/>
+  </w:num>
+  <w:num w:numId="7" w16cid:durableId="1466585050">
+    <w:abstractNumId w:val="9"/>
+  </w:num>
+  <w:num w:numId="8" w16cid:durableId="1043946362">
     <w:abstractNumId w:val="5"/>
   </w:num>
-  <w:num w:numId="2" w16cid:durableId="1660188722">
-    <w:abstractNumId w:val="5"/>
+  <w:num w:numId="9" w16cid:durableId="1395351159">
+    <w:abstractNumId w:val="7"/>
   </w:num>
-  <w:num w:numId="3" w16cid:durableId="282200120">
+  <w:num w:numId="10" w16cid:durableId="1412192339">
+    <w:abstractNumId w:val="2"/>
+  </w:num>
+  <w:num w:numId="11" w16cid:durableId="2003924118">
+    <w:abstractNumId w:val="15"/>
+  </w:num>
+  <w:num w:numId="12" w16cid:durableId="1613050180">
+    <w:abstractNumId w:val="11"/>
+  </w:num>
+  <w:num w:numId="13" w16cid:durableId="2058434136">
+    <w:abstractNumId w:val="1"/>
+  </w:num>
+  <w:num w:numId="14" w16cid:durableId="200015892">
+    <w:abstractNumId w:val="4"/>
+  </w:num>
+  <w:num w:numId="15" w16cid:durableId="2133596065">
     <w:abstractNumId w:val="3"/>
   </w:num>
-  <w:num w:numId="4" w16cid:durableId="800465909">
-    <w:abstractNumId w:val="5"/>
-  </w:num>
-  <w:num w:numId="5" w16cid:durableId="1347711845">
+  <w:num w:numId="16" w16cid:durableId="1078405577">
     <w:abstractNumId w:val="6"/>
   </w:num>
-  <w:num w:numId="6" w16cid:durableId="206335731">
-    <w:abstractNumId w:val="8"/>
-  </w:num>
-  <w:num w:numId="7" w16cid:durableId="1466585050">
-    <w:abstractNumId w:val="4"/>
-  </w:num>
-  <w:num w:numId="8" w16cid:durableId="1043946362">
-    <w:abstractNumId w:val="1"/>
-  </w:num>
-  <w:num w:numId="9" w16cid:durableId="1395351159">
-    <w:abstractNumId w:val="2"/>
-  </w:num>
-  <w:num w:numId="10" w16cid:durableId="1412192339">
+  <w:num w:numId="17" w16cid:durableId="1058363497">
     <w:abstractNumId w:val="0"/>
   </w:num>
-  <w:num w:numId="11" w16cid:durableId="2003924118">
-    <w:abstractNumId w:val="7"/>
+  <w:num w:numId="18" w16cid:durableId="1557399084">
+    <w:abstractNumId w:val="14"/>
+  </w:num>
+  <w:num w:numId="19" w16cid:durableId="1646663553">
+    <w:abstractNumId w:val="12"/>
   </w:num>
 </w:numbering>
 </file>

</xml_diff>

<commit_message>
changes done in report
</commit_message>
<xml_diff>
--- a/Report/zerowaste_business_plan.docx
+++ b/Report/zerowaste_business_plan.docx
@@ -1,6 +1,6 @@
 
 <file path=word/document.xml><?xml version="1.0" encoding="utf-8"?>
-<w:document xmlns:wpc="http://schemas.microsoft.com/office/word/2010/wordprocessingCanvas" xmlns:cx="http://schemas.microsoft.com/office/drawing/2014/chartex" xmlns:cx1="http://schemas.microsoft.com/office/drawing/2015/9/8/chartex" xmlns:cx2="http://schemas.microsoft.com/office/drawing/2015/10/21/chartex" xmlns:cx3="http://schemas.microsoft.com/office/drawing/2016/5/9/chartex" xmlns:cx4="http://schemas.microsoft.com/office/drawing/2016/5/10/chartex" xmlns:cx5="http://schemas.microsoft.com/office/drawing/2016/5/11/chartex" xmlns:cx6="http://schemas.microsoft.com/office/drawing/2016/5/12/chartex" xmlns:cx7="http://schemas.microsoft.com/office/drawing/2016/5/13/chartex" xmlns:cx8="http://schemas.microsoft.com/office/drawing/2016/5/14/chartex" xmlns:mc="http://schemas.openxmlformats.org/markup-compatibility/2006" xmlns:aink="http://schemas.microsoft.com/office/drawing/2016/ink" xmlns:am3d="http://schemas.microsoft.com/office/drawing/2017/model3d" xmlns:o="urn:schemas-microsoft-com:office:office" xmlns:oel="http://schemas.microsoft.com/office/2019/extlst" xmlns:r="http://schemas.openxmlformats.org/officeDocument/2006/relationships" xmlns:m="http://schemas.openxmlformats.org/officeDocument/2006/math" xmlns:v="urn:schemas-microsoft-com:vml" xmlns:wp14="http://schemas.microsoft.com/office/word/2010/wordprocessingDrawing" xmlns:wp="http://schemas.openxmlformats.org/drawingml/2006/wordprocessingDrawing" xmlns:w10="urn:schemas-microsoft-com:office:word" xmlns:w="http://schemas.openxmlformats.org/wordprocessingml/2006/main" xmlns:w14="http://schemas.microsoft.com/office/word/2010/wordml" xmlns:w15="http://schemas.microsoft.com/office/word/2012/wordml" xmlns:w16cex="http://schemas.microsoft.com/office/word/2018/wordml/cex" xmlns:w16cid="http://schemas.microsoft.com/office/word/2016/wordml/cid" xmlns:w16="http://schemas.microsoft.com/office/word/2018/wordml" xmlns:w16sdtdh="http://schemas.microsoft.com/office/word/2020/wordml/sdtdatahash" xmlns:w16se="http://schemas.microsoft.com/office/word/2015/wordml/symex" xmlns:wpg="http://schemas.microsoft.com/office/word/2010/wordprocessingGroup" xmlns:wpi="http://schemas.microsoft.com/office/word/2010/wordprocessingInk" xmlns:wne="http://schemas.microsoft.com/office/word/2006/wordml" xmlns:wps="http://schemas.microsoft.com/office/word/2010/wordprocessingShape" mc:Ignorable="w14 w15 w16se w16cid w16 w16cex w16sdtdh wp14">
+<w:document xmlns:wpc="http://schemas.microsoft.com/office/word/2010/wordprocessingCanvas" xmlns:cx="http://schemas.microsoft.com/office/drawing/2014/chartex" xmlns:cx1="http://schemas.microsoft.com/office/drawing/2015/9/8/chartex" xmlns:cx2="http://schemas.microsoft.com/office/drawing/2015/10/21/chartex" xmlns:cx3="http://schemas.microsoft.com/office/drawing/2016/5/9/chartex" xmlns:cx4="http://schemas.microsoft.com/office/drawing/2016/5/10/chartex" xmlns:cx5="http://schemas.microsoft.com/office/drawing/2016/5/11/chartex" xmlns:cx6="http://schemas.microsoft.com/office/drawing/2016/5/12/chartex" xmlns:cx7="http://schemas.microsoft.com/office/drawing/2016/5/13/chartex" xmlns:cx8="http://schemas.microsoft.com/office/drawing/2016/5/14/chartex" xmlns:mc="http://schemas.openxmlformats.org/markup-compatibility/2006" xmlns:aink="http://schemas.microsoft.com/office/drawing/2016/ink" xmlns:am3d="http://schemas.microsoft.com/office/drawing/2017/model3d" xmlns:o="urn:schemas-microsoft-com:office:office" xmlns:oel="http://schemas.microsoft.com/office/2019/extlst" xmlns:r="http://schemas.openxmlformats.org/officeDocument/2006/relationships" xmlns:m="http://schemas.openxmlformats.org/officeDocument/2006/math" xmlns:v="urn:schemas-microsoft-com:vml" xmlns:wp14="http://schemas.microsoft.com/office/word/2010/wordprocessingDrawing" xmlns:wp="http://schemas.openxmlformats.org/drawingml/2006/wordprocessingDrawing" xmlns:w10="urn:schemas-microsoft-com:office:word" xmlns:w="http://schemas.openxmlformats.org/wordprocessingml/2006/main" xmlns:w14="http://schemas.microsoft.com/office/word/2010/wordml" xmlns:w15="http://schemas.microsoft.com/office/word/2012/wordml" xmlns:w16cex="http://schemas.microsoft.com/office/word/2018/wordml/cex" xmlns:w16cid="http://schemas.microsoft.com/office/word/2016/wordml/cid" xmlns:w16="http://schemas.microsoft.com/office/word/2018/wordml" xmlns:w16du="http://schemas.microsoft.com/office/word/2023/wordml/word16du" xmlns:w16sdtdh="http://schemas.microsoft.com/office/word/2020/wordml/sdtdatahash" xmlns:w16sdtfl="http://schemas.microsoft.com/office/word/2024/wordml/sdtformatlock" xmlns:w16se="http://schemas.microsoft.com/office/word/2015/wordml/symex" xmlns:wpg="http://schemas.microsoft.com/office/word/2010/wordprocessingGroup" xmlns:wpi="http://schemas.microsoft.com/office/word/2010/wordprocessingInk" xmlns:wne="http://schemas.microsoft.com/office/word/2006/wordml" xmlns:wps="http://schemas.microsoft.com/office/word/2010/wordprocessingShape" mc:Ignorable="w14 w15 w16se w16cid w16 w16cex w16sdtdh w16sdtfl w16du wp14">
   <w:body>
     <w:p>
       <w:pPr>
@@ -69,6 +69,8 @@
         <w:rPr>
           <w:rFonts w:eastAsia="Calibri" w:cs="Times New Roman"/>
           <w:b/>
+          <w:sz w:val="56"/>
+          <w:szCs w:val="56"/>
         </w:rPr>
         <w:t>Assignment Cover Sheet</w:t>
       </w:r>
@@ -728,8 +730,22 @@
               <w:rPr>
                 <w:rFonts w:eastAsia="Calibri"/>
               </w:rPr>
-              <w:t>Seetha Letchumi</w:t>
-            </w:r>
+              <w:t>S</w:t>
+            </w:r>
+            <w:r>
+              <w:rPr>
+                <w:rFonts w:eastAsia="Calibri"/>
+              </w:rPr>
+              <w:t xml:space="preserve">udeep Lal </w:t>
+            </w:r>
+            <w:proofErr w:type="spellStart"/>
+            <w:r>
+              <w:rPr>
+                <w:rFonts w:eastAsia="Calibri"/>
+              </w:rPr>
+              <w:t>Bajimaya</w:t>
+            </w:r>
+            <w:proofErr w:type="spellEnd"/>
           </w:p>
         </w:tc>
         <w:tc>
@@ -1303,15 +1319,6 @@
         </w:tc>
       </w:tr>
     </w:tbl>
-    <w:p>
-      <w:pPr>
-        <w:pStyle w:val="Body"/>
-        <w:spacing w:after="0" w:line="240" w:lineRule="auto"/>
-        <w:rPr>
-          <w:rFonts w:ascii="Times New Roman" w:hAnsi="Times New Roman" w:cs="Times New Roman"/>
-        </w:rPr>
-      </w:pPr>
-    </w:p>
     <w:p>
       <w:pPr>
         <w:rPr>
@@ -7906,14 +7913,12 @@
         </w:rPr>
         <w:t xml:space="preserve">s, from their inventory. Each item </w:t>
       </w:r>
-      <w:proofErr w:type="gramStart"/>
-      <w:r>
-        <w:rPr>
-          <w:rFonts w:cs="Times New Roman"/>
-        </w:rPr>
-        <w:t>include</w:t>
-      </w:r>
-      <w:proofErr w:type="gramEnd"/>
+      <w:r>
+        <w:rPr>
+          <w:rFonts w:cs="Times New Roman"/>
+        </w:rPr>
+        <w:t>includes</w:t>
+      </w:r>
       <w:r>
         <w:rPr>
           <w:rFonts w:cs="Times New Roman"/>
@@ -8606,7 +8611,7 @@
           <w:rFonts w:cs="Times New Roman"/>
           <w:lang w:val="en-US"/>
         </w:rPr>
-        <w:t>: Use Case Diagram:</w:t>
+        <w:t>: Use Case Diagram</w:t>
       </w:r>
       <w:bookmarkEnd w:id="14"/>
     </w:p>
@@ -10151,9 +10156,9 @@
           <w:noProof/>
         </w:rPr>
         <w:drawing>
-          <wp:inline distT="0" distB="0" distL="0" distR="0" wp14:anchorId="3603C2C2" wp14:editId="1F17EF7C">
-            <wp:extent cx="5731510" cy="1924050"/>
-            <wp:effectExtent l="0" t="0" r="2540" b="0"/>
+          <wp:inline distT="0" distB="0" distL="0" distR="0" wp14:anchorId="3603C2C2" wp14:editId="6D51693B">
+            <wp:extent cx="5731510" cy="1923863"/>
+            <wp:effectExtent l="0" t="0" r="2540" b="635"/>
             <wp:docPr id="480914327" name="Picture 5"/>
             <wp:cNvGraphicFramePr>
               <a:graphicFrameLocks xmlns:a="http://schemas.openxmlformats.org/drawingml/2006/main" noChangeAspect="1"/>
@@ -10162,7 +10167,7 @@
               <a:graphicData uri="http://schemas.openxmlformats.org/drawingml/2006/picture">
                 <pic:pic xmlns:pic="http://schemas.openxmlformats.org/drawingml/2006/picture">
                   <pic:nvPicPr>
-                    <pic:cNvPr id="0" name="Picture 1"/>
+                    <pic:cNvPr id="480914327" name="Picture 5"/>
                     <pic:cNvPicPr>
                       <a:picLocks noChangeAspect="1" noChangeArrowheads="1"/>
                     </pic:cNvPicPr>
@@ -10175,7 +10180,6 @@
                         </a:ext>
                       </a:extLst>
                     </a:blip>
-                    <a:srcRect/>
                     <a:stretch>
                       <a:fillRect/>
                     </a:stretch>
@@ -10183,7 +10187,7 @@
                   <pic:spPr bwMode="auto">
                     <a:xfrm>
                       <a:off x="0" y="0"/>
-                      <a:ext cx="5731510" cy="1924050"/>
+                      <a:ext cx="5731510" cy="1923863"/>
                     </a:xfrm>
                     <a:prstGeom prst="rect">
                       <a:avLst/>
@@ -10336,15 +10340,6 @@
     </w:p>
     <w:p>
       <w:pPr>
-        <w:spacing w:line="360" w:lineRule="auto"/>
-        <w:jc w:val="both"/>
-        <w:rPr>
-          <w:rFonts w:cs="Times New Roman"/>
-        </w:rPr>
-      </w:pPr>
-    </w:p>
-    <w:p>
-      <w:pPr>
         <w:pStyle w:val="Style1"/>
         <w:rPr>
           <w:rFonts w:cs="Times New Roman"/>
@@ -10405,7 +10400,6 @@
           <w:sz w:val="20"/>
           <w:szCs w:val="20"/>
         </w:rPr>
-        <w:lastRenderedPageBreak/>
         <w:t xml:space="preserve">Note: The chart was created using GanttProject, and </w:t>
       </w:r>
       <w:r>
@@ -10461,6 +10455,7 @@
         <w:rPr>
           <w:rFonts w:cs="Times New Roman"/>
         </w:rPr>
+        <w:lastRenderedPageBreak/>
         <w:t>Technical Description</w:t>
       </w:r>
       <w:bookmarkEnd w:id="30"/>
@@ -11144,7 +11139,6 @@
                 <w:b/>
                 <w:bCs/>
               </w:rPr>
-              <w:lastRenderedPageBreak/>
               <w:t>Project Management and Collaboration</w:t>
             </w:r>
           </w:p>
@@ -11166,6 +11160,7 @@
               <w:rPr>
                 <w:rFonts w:cs="Times New Roman"/>
               </w:rPr>
+              <w:lastRenderedPageBreak/>
               <w:t>Version Control</w:t>
             </w:r>
           </w:p>
@@ -13068,6 +13063,7 @@
     <w:p>
       <w:pPr>
         <w:spacing w:line="360" w:lineRule="auto"/>
+        <w:jc w:val="both"/>
         <w:rPr>
           <w:rFonts w:cs="Times New Roman"/>
         </w:rPr>
@@ -14208,7 +14204,7 @@
 </file>
 
 <file path=word/endnotes.xml><?xml version="1.0" encoding="utf-8"?>
-<w:endnotes xmlns:wpc="http://schemas.microsoft.com/office/word/2010/wordprocessingCanvas" xmlns:cx="http://schemas.microsoft.com/office/drawing/2014/chartex" xmlns:cx1="http://schemas.microsoft.com/office/drawing/2015/9/8/chartex" xmlns:cx2="http://schemas.microsoft.com/office/drawing/2015/10/21/chartex" xmlns:cx3="http://schemas.microsoft.com/office/drawing/2016/5/9/chartex" xmlns:cx4="http://schemas.microsoft.com/office/drawing/2016/5/10/chartex" xmlns:cx5="http://schemas.microsoft.com/office/drawing/2016/5/11/chartex" xmlns:cx6="http://schemas.microsoft.com/office/drawing/2016/5/12/chartex" xmlns:cx7="http://schemas.microsoft.com/office/drawing/2016/5/13/chartex" xmlns:cx8="http://schemas.microsoft.com/office/drawing/2016/5/14/chartex" xmlns:mc="http://schemas.openxmlformats.org/markup-compatibility/2006" xmlns:aink="http://schemas.microsoft.com/office/drawing/2016/ink" xmlns:am3d="http://schemas.microsoft.com/office/drawing/2017/model3d" xmlns:o="urn:schemas-microsoft-com:office:office" xmlns:oel="http://schemas.microsoft.com/office/2019/extlst" xmlns:r="http://schemas.openxmlformats.org/officeDocument/2006/relationships" xmlns:m="http://schemas.openxmlformats.org/officeDocument/2006/math" xmlns:v="urn:schemas-microsoft-com:vml" xmlns:wp14="http://schemas.microsoft.com/office/word/2010/wordprocessingDrawing" xmlns:wp="http://schemas.openxmlformats.org/drawingml/2006/wordprocessingDrawing" xmlns:w10="urn:schemas-microsoft-com:office:word" xmlns:w="http://schemas.openxmlformats.org/wordprocessingml/2006/main" xmlns:w14="http://schemas.microsoft.com/office/word/2010/wordml" xmlns:w15="http://schemas.microsoft.com/office/word/2012/wordml" xmlns:w16cex="http://schemas.microsoft.com/office/word/2018/wordml/cex" xmlns:w16cid="http://schemas.microsoft.com/office/word/2016/wordml/cid" xmlns:w16="http://schemas.microsoft.com/office/word/2018/wordml" xmlns:w16sdtdh="http://schemas.microsoft.com/office/word/2020/wordml/sdtdatahash" xmlns:w16se="http://schemas.microsoft.com/office/word/2015/wordml/symex" xmlns:wpg="http://schemas.microsoft.com/office/word/2010/wordprocessingGroup" xmlns:wpi="http://schemas.microsoft.com/office/word/2010/wordprocessingInk" xmlns:wne="http://schemas.microsoft.com/office/word/2006/wordml" xmlns:wps="http://schemas.microsoft.com/office/word/2010/wordprocessingShape" mc:Ignorable="w14 w15 w16se w16cid w16 w16cex w16sdtdh wp14">
+<w:endnotes xmlns:wpc="http://schemas.microsoft.com/office/word/2010/wordprocessingCanvas" xmlns:cx="http://schemas.microsoft.com/office/drawing/2014/chartex" xmlns:cx1="http://schemas.microsoft.com/office/drawing/2015/9/8/chartex" xmlns:cx2="http://schemas.microsoft.com/office/drawing/2015/10/21/chartex" xmlns:cx3="http://schemas.microsoft.com/office/drawing/2016/5/9/chartex" xmlns:cx4="http://schemas.microsoft.com/office/drawing/2016/5/10/chartex" xmlns:cx5="http://schemas.microsoft.com/office/drawing/2016/5/11/chartex" xmlns:cx6="http://schemas.microsoft.com/office/drawing/2016/5/12/chartex" xmlns:cx7="http://schemas.microsoft.com/office/drawing/2016/5/13/chartex" xmlns:cx8="http://schemas.microsoft.com/office/drawing/2016/5/14/chartex" xmlns:mc="http://schemas.openxmlformats.org/markup-compatibility/2006" xmlns:aink="http://schemas.microsoft.com/office/drawing/2016/ink" xmlns:am3d="http://schemas.microsoft.com/office/drawing/2017/model3d" xmlns:o="urn:schemas-microsoft-com:office:office" xmlns:oel="http://schemas.microsoft.com/office/2019/extlst" xmlns:r="http://schemas.openxmlformats.org/officeDocument/2006/relationships" xmlns:m="http://schemas.openxmlformats.org/officeDocument/2006/math" xmlns:v="urn:schemas-microsoft-com:vml" xmlns:wp14="http://schemas.microsoft.com/office/word/2010/wordprocessingDrawing" xmlns:wp="http://schemas.openxmlformats.org/drawingml/2006/wordprocessingDrawing" xmlns:w10="urn:schemas-microsoft-com:office:word" xmlns:w="http://schemas.openxmlformats.org/wordprocessingml/2006/main" xmlns:w14="http://schemas.microsoft.com/office/word/2010/wordml" xmlns:w15="http://schemas.microsoft.com/office/word/2012/wordml" xmlns:w16cex="http://schemas.microsoft.com/office/word/2018/wordml/cex" xmlns:w16cid="http://schemas.microsoft.com/office/word/2016/wordml/cid" xmlns:w16="http://schemas.microsoft.com/office/word/2018/wordml" xmlns:w16du="http://schemas.microsoft.com/office/word/2023/wordml/word16du" xmlns:w16sdtdh="http://schemas.microsoft.com/office/word/2020/wordml/sdtdatahash" xmlns:w16sdtfl="http://schemas.microsoft.com/office/word/2024/wordml/sdtformatlock" xmlns:w16se="http://schemas.microsoft.com/office/word/2015/wordml/symex" xmlns:wpg="http://schemas.microsoft.com/office/word/2010/wordprocessingGroup" xmlns:wpi="http://schemas.microsoft.com/office/word/2010/wordprocessingInk" xmlns:wne="http://schemas.microsoft.com/office/word/2006/wordml" xmlns:wps="http://schemas.microsoft.com/office/word/2010/wordprocessingShape" mc:Ignorable="w14 w15 w16se w16cid w16 w16cex w16sdtdh w16sdtfl w16du wp14">
   <w:endnote w:type="separator" w:id="-1">
     <w:p>
       <w:pPr>
@@ -14233,7 +14229,7 @@
 </file>
 
 <file path=word/footer1.xml><?xml version="1.0" encoding="utf-8"?>
-<w:ftr xmlns:wpc="http://schemas.microsoft.com/office/word/2010/wordprocessingCanvas" xmlns:cx="http://schemas.microsoft.com/office/drawing/2014/chartex" xmlns:cx1="http://schemas.microsoft.com/office/drawing/2015/9/8/chartex" xmlns:cx2="http://schemas.microsoft.com/office/drawing/2015/10/21/chartex" xmlns:cx3="http://schemas.microsoft.com/office/drawing/2016/5/9/chartex" xmlns:cx4="http://schemas.microsoft.com/office/drawing/2016/5/10/chartex" xmlns:cx5="http://schemas.microsoft.com/office/drawing/2016/5/11/chartex" xmlns:cx6="http://schemas.microsoft.com/office/drawing/2016/5/12/chartex" xmlns:cx7="http://schemas.microsoft.com/office/drawing/2016/5/13/chartex" xmlns:cx8="http://schemas.microsoft.com/office/drawing/2016/5/14/chartex" xmlns:mc="http://schemas.openxmlformats.org/markup-compatibility/2006" xmlns:aink="http://schemas.microsoft.com/office/drawing/2016/ink" xmlns:am3d="http://schemas.microsoft.com/office/drawing/2017/model3d" xmlns:o="urn:schemas-microsoft-com:office:office" xmlns:oel="http://schemas.microsoft.com/office/2019/extlst" xmlns:r="http://schemas.openxmlformats.org/officeDocument/2006/relationships" xmlns:m="http://schemas.openxmlformats.org/officeDocument/2006/math" xmlns:v="urn:schemas-microsoft-com:vml" xmlns:wp14="http://schemas.microsoft.com/office/word/2010/wordprocessingDrawing" xmlns:wp="http://schemas.openxmlformats.org/drawingml/2006/wordprocessingDrawing" xmlns:w10="urn:schemas-microsoft-com:office:word" xmlns:w="http://schemas.openxmlformats.org/wordprocessingml/2006/main" xmlns:w14="http://schemas.microsoft.com/office/word/2010/wordml" xmlns:w15="http://schemas.microsoft.com/office/word/2012/wordml" xmlns:w16cex="http://schemas.microsoft.com/office/word/2018/wordml/cex" xmlns:w16cid="http://schemas.microsoft.com/office/word/2016/wordml/cid" xmlns:w16="http://schemas.microsoft.com/office/word/2018/wordml" xmlns:w16sdtdh="http://schemas.microsoft.com/office/word/2020/wordml/sdtdatahash" xmlns:w16se="http://schemas.microsoft.com/office/word/2015/wordml/symex" xmlns:wpg="http://schemas.microsoft.com/office/word/2010/wordprocessingGroup" xmlns:wpi="http://schemas.microsoft.com/office/word/2010/wordprocessingInk" xmlns:wne="http://schemas.microsoft.com/office/word/2006/wordml" xmlns:wps="http://schemas.microsoft.com/office/word/2010/wordprocessingShape" mc:Ignorable="w14 w15 w16se w16cid w16 w16cex w16sdtdh wp14">
+<w:ftr xmlns:wpc="http://schemas.microsoft.com/office/word/2010/wordprocessingCanvas" xmlns:cx="http://schemas.microsoft.com/office/drawing/2014/chartex" xmlns:cx1="http://schemas.microsoft.com/office/drawing/2015/9/8/chartex" xmlns:cx2="http://schemas.microsoft.com/office/drawing/2015/10/21/chartex" xmlns:cx3="http://schemas.microsoft.com/office/drawing/2016/5/9/chartex" xmlns:cx4="http://schemas.microsoft.com/office/drawing/2016/5/10/chartex" xmlns:cx5="http://schemas.microsoft.com/office/drawing/2016/5/11/chartex" xmlns:cx6="http://schemas.microsoft.com/office/drawing/2016/5/12/chartex" xmlns:cx7="http://schemas.microsoft.com/office/drawing/2016/5/13/chartex" xmlns:cx8="http://schemas.microsoft.com/office/drawing/2016/5/14/chartex" xmlns:mc="http://schemas.openxmlformats.org/markup-compatibility/2006" xmlns:aink="http://schemas.microsoft.com/office/drawing/2016/ink" xmlns:am3d="http://schemas.microsoft.com/office/drawing/2017/model3d" xmlns:o="urn:schemas-microsoft-com:office:office" xmlns:oel="http://schemas.microsoft.com/office/2019/extlst" xmlns:r="http://schemas.openxmlformats.org/officeDocument/2006/relationships" xmlns:m="http://schemas.openxmlformats.org/officeDocument/2006/math" xmlns:v="urn:schemas-microsoft-com:vml" xmlns:wp14="http://schemas.microsoft.com/office/word/2010/wordprocessingDrawing" xmlns:wp="http://schemas.openxmlformats.org/drawingml/2006/wordprocessingDrawing" xmlns:w10="urn:schemas-microsoft-com:office:word" xmlns:w="http://schemas.openxmlformats.org/wordprocessingml/2006/main" xmlns:w14="http://schemas.microsoft.com/office/word/2010/wordml" xmlns:w15="http://schemas.microsoft.com/office/word/2012/wordml" xmlns:w16cex="http://schemas.microsoft.com/office/word/2018/wordml/cex" xmlns:w16cid="http://schemas.microsoft.com/office/word/2016/wordml/cid" xmlns:w16="http://schemas.microsoft.com/office/word/2018/wordml" xmlns:w16du="http://schemas.microsoft.com/office/word/2023/wordml/word16du" xmlns:w16sdtdh="http://schemas.microsoft.com/office/word/2020/wordml/sdtdatahash" xmlns:w16sdtfl="http://schemas.microsoft.com/office/word/2024/wordml/sdtformatlock" xmlns:w16se="http://schemas.microsoft.com/office/word/2015/wordml/symex" xmlns:wpg="http://schemas.microsoft.com/office/word/2010/wordprocessingGroup" xmlns:wpi="http://schemas.microsoft.com/office/word/2010/wordprocessingInk" xmlns:wne="http://schemas.microsoft.com/office/word/2006/wordml" xmlns:wps="http://schemas.microsoft.com/office/word/2010/wordprocessingShape" mc:Ignorable="w14 w15 w16se w16cid w16 w16cex w16sdtdh w16sdtfl w16du wp14">
   <w:sdt>
     <w:sdtPr>
       <w:rPr>
@@ -14318,7 +14314,7 @@
 </file>
 
 <file path=word/footer2.xml><?xml version="1.0" encoding="utf-8"?>
-<w:ftr xmlns:wpc="http://schemas.microsoft.com/office/word/2010/wordprocessingCanvas" xmlns:cx="http://schemas.microsoft.com/office/drawing/2014/chartex" xmlns:cx1="http://schemas.microsoft.com/office/drawing/2015/9/8/chartex" xmlns:cx2="http://schemas.microsoft.com/office/drawing/2015/10/21/chartex" xmlns:cx3="http://schemas.microsoft.com/office/drawing/2016/5/9/chartex" xmlns:cx4="http://schemas.microsoft.com/office/drawing/2016/5/10/chartex" xmlns:cx5="http://schemas.microsoft.com/office/drawing/2016/5/11/chartex" xmlns:cx6="http://schemas.microsoft.com/office/drawing/2016/5/12/chartex" xmlns:cx7="http://schemas.microsoft.com/office/drawing/2016/5/13/chartex" xmlns:cx8="http://schemas.microsoft.com/office/drawing/2016/5/14/chartex" xmlns:mc="http://schemas.openxmlformats.org/markup-compatibility/2006" xmlns:aink="http://schemas.microsoft.com/office/drawing/2016/ink" xmlns:am3d="http://schemas.microsoft.com/office/drawing/2017/model3d" xmlns:o="urn:schemas-microsoft-com:office:office" xmlns:oel="http://schemas.microsoft.com/office/2019/extlst" xmlns:r="http://schemas.openxmlformats.org/officeDocument/2006/relationships" xmlns:m="http://schemas.openxmlformats.org/officeDocument/2006/math" xmlns:v="urn:schemas-microsoft-com:vml" xmlns:wp14="http://schemas.microsoft.com/office/word/2010/wordprocessingDrawing" xmlns:wp="http://schemas.openxmlformats.org/drawingml/2006/wordprocessingDrawing" xmlns:w10="urn:schemas-microsoft-com:office:word" xmlns:w="http://schemas.openxmlformats.org/wordprocessingml/2006/main" xmlns:w14="http://schemas.microsoft.com/office/word/2010/wordml" xmlns:w15="http://schemas.microsoft.com/office/word/2012/wordml" xmlns:w16cex="http://schemas.microsoft.com/office/word/2018/wordml/cex" xmlns:w16cid="http://schemas.microsoft.com/office/word/2016/wordml/cid" xmlns:w16="http://schemas.microsoft.com/office/word/2018/wordml" xmlns:w16sdtdh="http://schemas.microsoft.com/office/word/2020/wordml/sdtdatahash" xmlns:w16se="http://schemas.microsoft.com/office/word/2015/wordml/symex" xmlns:wpg="http://schemas.microsoft.com/office/word/2010/wordprocessingGroup" xmlns:wpi="http://schemas.microsoft.com/office/word/2010/wordprocessingInk" xmlns:wne="http://schemas.microsoft.com/office/word/2006/wordml" xmlns:wps="http://schemas.microsoft.com/office/word/2010/wordprocessingShape" mc:Ignorable="w14 w15 w16se w16cid w16 w16cex w16sdtdh wp14">
+<w:ftr xmlns:wpc="http://schemas.microsoft.com/office/word/2010/wordprocessingCanvas" xmlns:cx="http://schemas.microsoft.com/office/drawing/2014/chartex" xmlns:cx1="http://schemas.microsoft.com/office/drawing/2015/9/8/chartex" xmlns:cx2="http://schemas.microsoft.com/office/drawing/2015/10/21/chartex" xmlns:cx3="http://schemas.microsoft.com/office/drawing/2016/5/9/chartex" xmlns:cx4="http://schemas.microsoft.com/office/drawing/2016/5/10/chartex" xmlns:cx5="http://schemas.microsoft.com/office/drawing/2016/5/11/chartex" xmlns:cx6="http://schemas.microsoft.com/office/drawing/2016/5/12/chartex" xmlns:cx7="http://schemas.microsoft.com/office/drawing/2016/5/13/chartex" xmlns:cx8="http://schemas.microsoft.com/office/drawing/2016/5/14/chartex" xmlns:mc="http://schemas.openxmlformats.org/markup-compatibility/2006" xmlns:aink="http://schemas.microsoft.com/office/drawing/2016/ink" xmlns:am3d="http://schemas.microsoft.com/office/drawing/2017/model3d" xmlns:o="urn:schemas-microsoft-com:office:office" xmlns:oel="http://schemas.microsoft.com/office/2019/extlst" xmlns:r="http://schemas.openxmlformats.org/officeDocument/2006/relationships" xmlns:m="http://schemas.openxmlformats.org/officeDocument/2006/math" xmlns:v="urn:schemas-microsoft-com:vml" xmlns:wp14="http://schemas.microsoft.com/office/word/2010/wordprocessingDrawing" xmlns:wp="http://schemas.openxmlformats.org/drawingml/2006/wordprocessingDrawing" xmlns:w10="urn:schemas-microsoft-com:office:word" xmlns:w="http://schemas.openxmlformats.org/wordprocessingml/2006/main" xmlns:w14="http://schemas.microsoft.com/office/word/2010/wordml" xmlns:w15="http://schemas.microsoft.com/office/word/2012/wordml" xmlns:w16cex="http://schemas.microsoft.com/office/word/2018/wordml/cex" xmlns:w16cid="http://schemas.microsoft.com/office/word/2016/wordml/cid" xmlns:w16="http://schemas.microsoft.com/office/word/2018/wordml" xmlns:w16du="http://schemas.microsoft.com/office/word/2023/wordml/word16du" xmlns:w16sdtdh="http://schemas.microsoft.com/office/word/2020/wordml/sdtdatahash" xmlns:w16sdtfl="http://schemas.microsoft.com/office/word/2024/wordml/sdtformatlock" xmlns:w16se="http://schemas.microsoft.com/office/word/2015/wordml/symex" xmlns:wpg="http://schemas.microsoft.com/office/word/2010/wordprocessingGroup" xmlns:wpi="http://schemas.microsoft.com/office/word/2010/wordprocessingInk" xmlns:wne="http://schemas.microsoft.com/office/word/2006/wordml" xmlns:wps="http://schemas.microsoft.com/office/word/2010/wordprocessingShape" mc:Ignorable="w14 w15 w16se w16cid w16 w16cex w16sdtdh w16sdtfl w16du wp14">
   <w:sdt>
     <w:sdtPr>
       <w:rPr>
@@ -14403,7 +14399,7 @@
 </file>
 
 <file path=word/footer3.xml><?xml version="1.0" encoding="utf-8"?>
-<w:ftr xmlns:wpc="http://schemas.microsoft.com/office/word/2010/wordprocessingCanvas" xmlns:cx="http://schemas.microsoft.com/office/drawing/2014/chartex" xmlns:cx1="http://schemas.microsoft.com/office/drawing/2015/9/8/chartex" xmlns:cx2="http://schemas.microsoft.com/office/drawing/2015/10/21/chartex" xmlns:cx3="http://schemas.microsoft.com/office/drawing/2016/5/9/chartex" xmlns:cx4="http://schemas.microsoft.com/office/drawing/2016/5/10/chartex" xmlns:cx5="http://schemas.microsoft.com/office/drawing/2016/5/11/chartex" xmlns:cx6="http://schemas.microsoft.com/office/drawing/2016/5/12/chartex" xmlns:cx7="http://schemas.microsoft.com/office/drawing/2016/5/13/chartex" xmlns:cx8="http://schemas.microsoft.com/office/drawing/2016/5/14/chartex" xmlns:mc="http://schemas.openxmlformats.org/markup-compatibility/2006" xmlns:aink="http://schemas.microsoft.com/office/drawing/2016/ink" xmlns:am3d="http://schemas.microsoft.com/office/drawing/2017/model3d" xmlns:o="urn:schemas-microsoft-com:office:office" xmlns:oel="http://schemas.microsoft.com/office/2019/extlst" xmlns:r="http://schemas.openxmlformats.org/officeDocument/2006/relationships" xmlns:m="http://schemas.openxmlformats.org/officeDocument/2006/math" xmlns:v="urn:schemas-microsoft-com:vml" xmlns:wp14="http://schemas.microsoft.com/office/word/2010/wordprocessingDrawing" xmlns:wp="http://schemas.openxmlformats.org/drawingml/2006/wordprocessingDrawing" xmlns:w10="urn:schemas-microsoft-com:office:word" xmlns:w="http://schemas.openxmlformats.org/wordprocessingml/2006/main" xmlns:w14="http://schemas.microsoft.com/office/word/2010/wordml" xmlns:w15="http://schemas.microsoft.com/office/word/2012/wordml" xmlns:w16cex="http://schemas.microsoft.com/office/word/2018/wordml/cex" xmlns:w16cid="http://schemas.microsoft.com/office/word/2016/wordml/cid" xmlns:w16="http://schemas.microsoft.com/office/word/2018/wordml" xmlns:w16sdtdh="http://schemas.microsoft.com/office/word/2020/wordml/sdtdatahash" xmlns:w16se="http://schemas.microsoft.com/office/word/2015/wordml/symex" xmlns:wpg="http://schemas.microsoft.com/office/word/2010/wordprocessingGroup" xmlns:wpi="http://schemas.microsoft.com/office/word/2010/wordprocessingInk" xmlns:wne="http://schemas.microsoft.com/office/word/2006/wordml" xmlns:wps="http://schemas.microsoft.com/office/word/2010/wordprocessingShape" mc:Ignorable="w14 w15 w16se w16cid w16 w16cex w16sdtdh wp14">
+<w:ftr xmlns:wpc="http://schemas.microsoft.com/office/word/2010/wordprocessingCanvas" xmlns:cx="http://schemas.microsoft.com/office/drawing/2014/chartex" xmlns:cx1="http://schemas.microsoft.com/office/drawing/2015/9/8/chartex" xmlns:cx2="http://schemas.microsoft.com/office/drawing/2015/10/21/chartex" xmlns:cx3="http://schemas.microsoft.com/office/drawing/2016/5/9/chartex" xmlns:cx4="http://schemas.microsoft.com/office/drawing/2016/5/10/chartex" xmlns:cx5="http://schemas.microsoft.com/office/drawing/2016/5/11/chartex" xmlns:cx6="http://schemas.microsoft.com/office/drawing/2016/5/12/chartex" xmlns:cx7="http://schemas.microsoft.com/office/drawing/2016/5/13/chartex" xmlns:cx8="http://schemas.microsoft.com/office/drawing/2016/5/14/chartex" xmlns:mc="http://schemas.openxmlformats.org/markup-compatibility/2006" xmlns:aink="http://schemas.microsoft.com/office/drawing/2016/ink" xmlns:am3d="http://schemas.microsoft.com/office/drawing/2017/model3d" xmlns:o="urn:schemas-microsoft-com:office:office" xmlns:oel="http://schemas.microsoft.com/office/2019/extlst" xmlns:r="http://schemas.openxmlformats.org/officeDocument/2006/relationships" xmlns:m="http://schemas.openxmlformats.org/officeDocument/2006/math" xmlns:v="urn:schemas-microsoft-com:vml" xmlns:wp14="http://schemas.microsoft.com/office/word/2010/wordprocessingDrawing" xmlns:wp="http://schemas.openxmlformats.org/drawingml/2006/wordprocessingDrawing" xmlns:w10="urn:schemas-microsoft-com:office:word" xmlns:w="http://schemas.openxmlformats.org/wordprocessingml/2006/main" xmlns:w14="http://schemas.microsoft.com/office/word/2010/wordml" xmlns:w15="http://schemas.microsoft.com/office/word/2012/wordml" xmlns:w16cex="http://schemas.microsoft.com/office/word/2018/wordml/cex" xmlns:w16cid="http://schemas.microsoft.com/office/word/2016/wordml/cid" xmlns:w16="http://schemas.microsoft.com/office/word/2018/wordml" xmlns:w16du="http://schemas.microsoft.com/office/word/2023/wordml/word16du" xmlns:w16sdtdh="http://schemas.microsoft.com/office/word/2020/wordml/sdtdatahash" xmlns:w16sdtfl="http://schemas.microsoft.com/office/word/2024/wordml/sdtformatlock" xmlns:w16se="http://schemas.microsoft.com/office/word/2015/wordml/symex" xmlns:wpg="http://schemas.microsoft.com/office/word/2010/wordprocessingGroup" xmlns:wpi="http://schemas.microsoft.com/office/word/2010/wordprocessingInk" xmlns:wne="http://schemas.microsoft.com/office/word/2006/wordml" xmlns:wps="http://schemas.microsoft.com/office/word/2010/wordprocessingShape" mc:Ignorable="w14 w15 w16se w16cid w16 w16cex w16sdtdh w16sdtfl w16du wp14">
   <w:p>
     <w:pPr>
       <w:pStyle w:val="Footer"/>
@@ -14419,7 +14415,7 @@
 </file>
 
 <file path=word/footer4.xml><?xml version="1.0" encoding="utf-8"?>
-<w:ftr xmlns:wpc="http://schemas.microsoft.com/office/word/2010/wordprocessingCanvas" xmlns:cx="http://schemas.microsoft.com/office/drawing/2014/chartex" xmlns:cx1="http://schemas.microsoft.com/office/drawing/2015/9/8/chartex" xmlns:cx2="http://schemas.microsoft.com/office/drawing/2015/10/21/chartex" xmlns:cx3="http://schemas.microsoft.com/office/drawing/2016/5/9/chartex" xmlns:cx4="http://schemas.microsoft.com/office/drawing/2016/5/10/chartex" xmlns:cx5="http://schemas.microsoft.com/office/drawing/2016/5/11/chartex" xmlns:cx6="http://schemas.microsoft.com/office/drawing/2016/5/12/chartex" xmlns:cx7="http://schemas.microsoft.com/office/drawing/2016/5/13/chartex" xmlns:cx8="http://schemas.microsoft.com/office/drawing/2016/5/14/chartex" xmlns:mc="http://schemas.openxmlformats.org/markup-compatibility/2006" xmlns:aink="http://schemas.microsoft.com/office/drawing/2016/ink" xmlns:am3d="http://schemas.microsoft.com/office/drawing/2017/model3d" xmlns:o="urn:schemas-microsoft-com:office:office" xmlns:oel="http://schemas.microsoft.com/office/2019/extlst" xmlns:r="http://schemas.openxmlformats.org/officeDocument/2006/relationships" xmlns:m="http://schemas.openxmlformats.org/officeDocument/2006/math" xmlns:v="urn:schemas-microsoft-com:vml" xmlns:wp14="http://schemas.microsoft.com/office/word/2010/wordprocessingDrawing" xmlns:wp="http://schemas.openxmlformats.org/drawingml/2006/wordprocessingDrawing" xmlns:w10="urn:schemas-microsoft-com:office:word" xmlns:w="http://schemas.openxmlformats.org/wordprocessingml/2006/main" xmlns:w14="http://schemas.microsoft.com/office/word/2010/wordml" xmlns:w15="http://schemas.microsoft.com/office/word/2012/wordml" xmlns:w16cex="http://schemas.microsoft.com/office/word/2018/wordml/cex" xmlns:w16cid="http://schemas.microsoft.com/office/word/2016/wordml/cid" xmlns:w16="http://schemas.microsoft.com/office/word/2018/wordml" xmlns:w16sdtdh="http://schemas.microsoft.com/office/word/2020/wordml/sdtdatahash" xmlns:w16se="http://schemas.microsoft.com/office/word/2015/wordml/symex" xmlns:wpg="http://schemas.microsoft.com/office/word/2010/wordprocessingGroup" xmlns:wpi="http://schemas.microsoft.com/office/word/2010/wordprocessingInk" xmlns:wne="http://schemas.microsoft.com/office/word/2006/wordml" xmlns:wps="http://schemas.microsoft.com/office/word/2010/wordprocessingShape" mc:Ignorable="w14 w15 w16se w16cid w16 w16cex w16sdtdh wp14">
+<w:ftr xmlns:wpc="http://schemas.microsoft.com/office/word/2010/wordprocessingCanvas" xmlns:cx="http://schemas.microsoft.com/office/drawing/2014/chartex" xmlns:cx1="http://schemas.microsoft.com/office/drawing/2015/9/8/chartex" xmlns:cx2="http://schemas.microsoft.com/office/drawing/2015/10/21/chartex" xmlns:cx3="http://schemas.microsoft.com/office/drawing/2016/5/9/chartex" xmlns:cx4="http://schemas.microsoft.com/office/drawing/2016/5/10/chartex" xmlns:cx5="http://schemas.microsoft.com/office/drawing/2016/5/11/chartex" xmlns:cx6="http://schemas.microsoft.com/office/drawing/2016/5/12/chartex" xmlns:cx7="http://schemas.microsoft.com/office/drawing/2016/5/13/chartex" xmlns:cx8="http://schemas.microsoft.com/office/drawing/2016/5/14/chartex" xmlns:mc="http://schemas.openxmlformats.org/markup-compatibility/2006" xmlns:aink="http://schemas.microsoft.com/office/drawing/2016/ink" xmlns:am3d="http://schemas.microsoft.com/office/drawing/2017/model3d" xmlns:o="urn:schemas-microsoft-com:office:office" xmlns:oel="http://schemas.microsoft.com/office/2019/extlst" xmlns:r="http://schemas.openxmlformats.org/officeDocument/2006/relationships" xmlns:m="http://schemas.openxmlformats.org/officeDocument/2006/math" xmlns:v="urn:schemas-microsoft-com:vml" xmlns:wp14="http://schemas.microsoft.com/office/word/2010/wordprocessingDrawing" xmlns:wp="http://schemas.openxmlformats.org/drawingml/2006/wordprocessingDrawing" xmlns:w10="urn:schemas-microsoft-com:office:word" xmlns:w="http://schemas.openxmlformats.org/wordprocessingml/2006/main" xmlns:w14="http://schemas.microsoft.com/office/word/2010/wordml" xmlns:w15="http://schemas.microsoft.com/office/word/2012/wordml" xmlns:w16cex="http://schemas.microsoft.com/office/word/2018/wordml/cex" xmlns:w16cid="http://schemas.microsoft.com/office/word/2016/wordml/cid" xmlns:w16="http://schemas.microsoft.com/office/word/2018/wordml" xmlns:w16du="http://schemas.microsoft.com/office/word/2023/wordml/word16du" xmlns:w16sdtdh="http://schemas.microsoft.com/office/word/2020/wordml/sdtdatahash" xmlns:w16sdtfl="http://schemas.microsoft.com/office/word/2024/wordml/sdtformatlock" xmlns:w16se="http://schemas.microsoft.com/office/word/2015/wordml/symex" xmlns:wpg="http://schemas.microsoft.com/office/word/2010/wordprocessingGroup" xmlns:wpi="http://schemas.microsoft.com/office/word/2010/wordprocessingInk" xmlns:wne="http://schemas.microsoft.com/office/word/2006/wordml" xmlns:wps="http://schemas.microsoft.com/office/word/2010/wordprocessingShape" mc:Ignorable="w14 w15 w16se w16cid w16 w16cex w16sdtdh w16sdtfl w16du wp14">
   <w:sdt>
     <w:sdtPr>
       <w:id w:val="665674313"/>
@@ -14472,7 +14468,7 @@
 </file>
 
 <file path=word/footer5.xml><?xml version="1.0" encoding="utf-8"?>
-<w:ftr xmlns:wpc="http://schemas.microsoft.com/office/word/2010/wordprocessingCanvas" xmlns:cx="http://schemas.microsoft.com/office/drawing/2014/chartex" xmlns:cx1="http://schemas.microsoft.com/office/drawing/2015/9/8/chartex" xmlns:cx2="http://schemas.microsoft.com/office/drawing/2015/10/21/chartex" xmlns:cx3="http://schemas.microsoft.com/office/drawing/2016/5/9/chartex" xmlns:cx4="http://schemas.microsoft.com/office/drawing/2016/5/10/chartex" xmlns:cx5="http://schemas.microsoft.com/office/drawing/2016/5/11/chartex" xmlns:cx6="http://schemas.microsoft.com/office/drawing/2016/5/12/chartex" xmlns:cx7="http://schemas.microsoft.com/office/drawing/2016/5/13/chartex" xmlns:cx8="http://schemas.microsoft.com/office/drawing/2016/5/14/chartex" xmlns:mc="http://schemas.openxmlformats.org/markup-compatibility/2006" xmlns:aink="http://schemas.microsoft.com/office/drawing/2016/ink" xmlns:am3d="http://schemas.microsoft.com/office/drawing/2017/model3d" xmlns:o="urn:schemas-microsoft-com:office:office" xmlns:oel="http://schemas.microsoft.com/office/2019/extlst" xmlns:r="http://schemas.openxmlformats.org/officeDocument/2006/relationships" xmlns:m="http://schemas.openxmlformats.org/officeDocument/2006/math" xmlns:v="urn:schemas-microsoft-com:vml" xmlns:wp14="http://schemas.microsoft.com/office/word/2010/wordprocessingDrawing" xmlns:wp="http://schemas.openxmlformats.org/drawingml/2006/wordprocessingDrawing" xmlns:w10="urn:schemas-microsoft-com:office:word" xmlns:w="http://schemas.openxmlformats.org/wordprocessingml/2006/main" xmlns:w14="http://schemas.microsoft.com/office/word/2010/wordml" xmlns:w15="http://schemas.microsoft.com/office/word/2012/wordml" xmlns:w16cex="http://schemas.microsoft.com/office/word/2018/wordml/cex" xmlns:w16cid="http://schemas.microsoft.com/office/word/2016/wordml/cid" xmlns:w16="http://schemas.microsoft.com/office/word/2018/wordml" xmlns:w16sdtdh="http://schemas.microsoft.com/office/word/2020/wordml/sdtdatahash" xmlns:w16se="http://schemas.microsoft.com/office/word/2015/wordml/symex" xmlns:wpg="http://schemas.microsoft.com/office/word/2010/wordprocessingGroup" xmlns:wpi="http://schemas.microsoft.com/office/word/2010/wordprocessingInk" xmlns:wne="http://schemas.microsoft.com/office/word/2006/wordml" xmlns:wps="http://schemas.microsoft.com/office/word/2010/wordprocessingShape" mc:Ignorable="w14 w15 w16se w16cid w16 w16cex w16sdtdh wp14">
+<w:ftr xmlns:wpc="http://schemas.microsoft.com/office/word/2010/wordprocessingCanvas" xmlns:cx="http://schemas.microsoft.com/office/drawing/2014/chartex" xmlns:cx1="http://schemas.microsoft.com/office/drawing/2015/9/8/chartex" xmlns:cx2="http://schemas.microsoft.com/office/drawing/2015/10/21/chartex" xmlns:cx3="http://schemas.microsoft.com/office/drawing/2016/5/9/chartex" xmlns:cx4="http://schemas.microsoft.com/office/drawing/2016/5/10/chartex" xmlns:cx5="http://schemas.microsoft.com/office/drawing/2016/5/11/chartex" xmlns:cx6="http://schemas.microsoft.com/office/drawing/2016/5/12/chartex" xmlns:cx7="http://schemas.microsoft.com/office/drawing/2016/5/13/chartex" xmlns:cx8="http://schemas.microsoft.com/office/drawing/2016/5/14/chartex" xmlns:mc="http://schemas.openxmlformats.org/markup-compatibility/2006" xmlns:aink="http://schemas.microsoft.com/office/drawing/2016/ink" xmlns:am3d="http://schemas.microsoft.com/office/drawing/2017/model3d" xmlns:o="urn:schemas-microsoft-com:office:office" xmlns:oel="http://schemas.microsoft.com/office/2019/extlst" xmlns:r="http://schemas.openxmlformats.org/officeDocument/2006/relationships" xmlns:m="http://schemas.openxmlformats.org/officeDocument/2006/math" xmlns:v="urn:schemas-microsoft-com:vml" xmlns:wp14="http://schemas.microsoft.com/office/word/2010/wordprocessingDrawing" xmlns:wp="http://schemas.openxmlformats.org/drawingml/2006/wordprocessingDrawing" xmlns:w10="urn:schemas-microsoft-com:office:word" xmlns:w="http://schemas.openxmlformats.org/wordprocessingml/2006/main" xmlns:w14="http://schemas.microsoft.com/office/word/2010/wordml" xmlns:w15="http://schemas.microsoft.com/office/word/2012/wordml" xmlns:w16cex="http://schemas.microsoft.com/office/word/2018/wordml/cex" xmlns:w16cid="http://schemas.microsoft.com/office/word/2016/wordml/cid" xmlns:w16="http://schemas.microsoft.com/office/word/2018/wordml" xmlns:w16du="http://schemas.microsoft.com/office/word/2023/wordml/word16du" xmlns:w16sdtdh="http://schemas.microsoft.com/office/word/2020/wordml/sdtdatahash" xmlns:w16sdtfl="http://schemas.microsoft.com/office/word/2024/wordml/sdtformatlock" xmlns:w16se="http://schemas.microsoft.com/office/word/2015/wordml/symex" xmlns:wpg="http://schemas.microsoft.com/office/word/2010/wordprocessingGroup" xmlns:wpi="http://schemas.microsoft.com/office/word/2010/wordprocessingInk" xmlns:wne="http://schemas.microsoft.com/office/word/2006/wordml" xmlns:wps="http://schemas.microsoft.com/office/word/2010/wordprocessingShape" mc:Ignorable="w14 w15 w16se w16cid w16 w16cex w16sdtdh w16sdtfl w16du wp14">
   <w:sdt>
     <w:sdtPr>
       <w:id w:val="1739596823"/>
@@ -14525,7 +14521,7 @@
 </file>
 
 <file path=word/footnotes.xml><?xml version="1.0" encoding="utf-8"?>
-<w:footnotes xmlns:wpc="http://schemas.microsoft.com/office/word/2010/wordprocessingCanvas" xmlns:cx="http://schemas.microsoft.com/office/drawing/2014/chartex" xmlns:cx1="http://schemas.microsoft.com/office/drawing/2015/9/8/chartex" xmlns:cx2="http://schemas.microsoft.com/office/drawing/2015/10/21/chartex" xmlns:cx3="http://schemas.microsoft.com/office/drawing/2016/5/9/chartex" xmlns:cx4="http://schemas.microsoft.com/office/drawing/2016/5/10/chartex" xmlns:cx5="http://schemas.microsoft.com/office/drawing/2016/5/11/chartex" xmlns:cx6="http://schemas.microsoft.com/office/drawing/2016/5/12/chartex" xmlns:cx7="http://schemas.microsoft.com/office/drawing/2016/5/13/chartex" xmlns:cx8="http://schemas.microsoft.com/office/drawing/2016/5/14/chartex" xmlns:mc="http://schemas.openxmlformats.org/markup-compatibility/2006" xmlns:aink="http://schemas.microsoft.com/office/drawing/2016/ink" xmlns:am3d="http://schemas.microsoft.com/office/drawing/2017/model3d" xmlns:o="urn:schemas-microsoft-com:office:office" xmlns:oel="http://schemas.microsoft.com/office/2019/extlst" xmlns:r="http://schemas.openxmlformats.org/officeDocument/2006/relationships" xmlns:m="http://schemas.openxmlformats.org/officeDocument/2006/math" xmlns:v="urn:schemas-microsoft-com:vml" xmlns:wp14="http://schemas.microsoft.com/office/word/2010/wordprocessingDrawing" xmlns:wp="http://schemas.openxmlformats.org/drawingml/2006/wordprocessingDrawing" xmlns:w10="urn:schemas-microsoft-com:office:word" xmlns:w="http://schemas.openxmlformats.org/wordprocessingml/2006/main" xmlns:w14="http://schemas.microsoft.com/office/word/2010/wordml" xmlns:w15="http://schemas.microsoft.com/office/word/2012/wordml" xmlns:w16cex="http://schemas.microsoft.com/office/word/2018/wordml/cex" xmlns:w16cid="http://schemas.microsoft.com/office/word/2016/wordml/cid" xmlns:w16="http://schemas.microsoft.com/office/word/2018/wordml" xmlns:w16sdtdh="http://schemas.microsoft.com/office/word/2020/wordml/sdtdatahash" xmlns:w16se="http://schemas.microsoft.com/office/word/2015/wordml/symex" xmlns:wpg="http://schemas.microsoft.com/office/word/2010/wordprocessingGroup" xmlns:wpi="http://schemas.microsoft.com/office/word/2010/wordprocessingInk" xmlns:wne="http://schemas.microsoft.com/office/word/2006/wordml" xmlns:wps="http://schemas.microsoft.com/office/word/2010/wordprocessingShape" mc:Ignorable="w14 w15 w16se w16cid w16 w16cex w16sdtdh wp14">
+<w:footnotes xmlns:wpc="http://schemas.microsoft.com/office/word/2010/wordprocessingCanvas" xmlns:cx="http://schemas.microsoft.com/office/drawing/2014/chartex" xmlns:cx1="http://schemas.microsoft.com/office/drawing/2015/9/8/chartex" xmlns:cx2="http://schemas.microsoft.com/office/drawing/2015/10/21/chartex" xmlns:cx3="http://schemas.microsoft.com/office/drawing/2016/5/9/chartex" xmlns:cx4="http://schemas.microsoft.com/office/drawing/2016/5/10/chartex" xmlns:cx5="http://schemas.microsoft.com/office/drawing/2016/5/11/chartex" xmlns:cx6="http://schemas.microsoft.com/office/drawing/2016/5/12/chartex" xmlns:cx7="http://schemas.microsoft.com/office/drawing/2016/5/13/chartex" xmlns:cx8="http://schemas.microsoft.com/office/drawing/2016/5/14/chartex" xmlns:mc="http://schemas.openxmlformats.org/markup-compatibility/2006" xmlns:aink="http://schemas.microsoft.com/office/drawing/2016/ink" xmlns:am3d="http://schemas.microsoft.com/office/drawing/2017/model3d" xmlns:o="urn:schemas-microsoft-com:office:office" xmlns:oel="http://schemas.microsoft.com/office/2019/extlst" xmlns:r="http://schemas.openxmlformats.org/officeDocument/2006/relationships" xmlns:m="http://schemas.openxmlformats.org/officeDocument/2006/math" xmlns:v="urn:schemas-microsoft-com:vml" xmlns:wp14="http://schemas.microsoft.com/office/word/2010/wordprocessingDrawing" xmlns:wp="http://schemas.openxmlformats.org/drawingml/2006/wordprocessingDrawing" xmlns:w10="urn:schemas-microsoft-com:office:word" xmlns:w="http://schemas.openxmlformats.org/wordprocessingml/2006/main" xmlns:w14="http://schemas.microsoft.com/office/word/2010/wordml" xmlns:w15="http://schemas.microsoft.com/office/word/2012/wordml" xmlns:w16cex="http://schemas.microsoft.com/office/word/2018/wordml/cex" xmlns:w16cid="http://schemas.microsoft.com/office/word/2016/wordml/cid" xmlns:w16="http://schemas.microsoft.com/office/word/2018/wordml" xmlns:w16du="http://schemas.microsoft.com/office/word/2023/wordml/word16du" xmlns:w16sdtdh="http://schemas.microsoft.com/office/word/2020/wordml/sdtdatahash" xmlns:w16sdtfl="http://schemas.microsoft.com/office/word/2024/wordml/sdtformatlock" xmlns:w16se="http://schemas.microsoft.com/office/word/2015/wordml/symex" xmlns:wpg="http://schemas.microsoft.com/office/word/2010/wordprocessingGroup" xmlns:wpi="http://schemas.microsoft.com/office/word/2010/wordprocessingInk" xmlns:wne="http://schemas.microsoft.com/office/word/2006/wordml" xmlns:wps="http://schemas.microsoft.com/office/word/2010/wordprocessingShape" mc:Ignorable="w14 w15 w16se w16cid w16 w16cex w16sdtdh w16sdtfl w16du wp14">
   <w:footnote w:type="separator" w:id="-1">
     <w:p>
       <w:pPr>
@@ -14550,7 +14546,7 @@
 </file>
 
 <file path=word/header1.xml><?xml version="1.0" encoding="utf-8"?>
-<w:hdr xmlns:wpc="http://schemas.microsoft.com/office/word/2010/wordprocessingCanvas" xmlns:cx="http://schemas.microsoft.com/office/drawing/2014/chartex" xmlns:cx1="http://schemas.microsoft.com/office/drawing/2015/9/8/chartex" xmlns:cx2="http://schemas.microsoft.com/office/drawing/2015/10/21/chartex" xmlns:cx3="http://schemas.microsoft.com/office/drawing/2016/5/9/chartex" xmlns:cx4="http://schemas.microsoft.com/office/drawing/2016/5/10/chartex" xmlns:cx5="http://schemas.microsoft.com/office/drawing/2016/5/11/chartex" xmlns:cx6="http://schemas.microsoft.com/office/drawing/2016/5/12/chartex" xmlns:cx7="http://schemas.microsoft.com/office/drawing/2016/5/13/chartex" xmlns:cx8="http://schemas.microsoft.com/office/drawing/2016/5/14/chartex" xmlns:mc="http://schemas.openxmlformats.org/markup-compatibility/2006" xmlns:aink="http://schemas.microsoft.com/office/drawing/2016/ink" xmlns:am3d="http://schemas.microsoft.com/office/drawing/2017/model3d" xmlns:o="urn:schemas-microsoft-com:office:office" xmlns:oel="http://schemas.microsoft.com/office/2019/extlst" xmlns:r="http://schemas.openxmlformats.org/officeDocument/2006/relationships" xmlns:m="http://schemas.openxmlformats.org/officeDocument/2006/math" xmlns:v="urn:schemas-microsoft-com:vml" xmlns:wp14="http://schemas.microsoft.com/office/word/2010/wordprocessingDrawing" xmlns:wp="http://schemas.openxmlformats.org/drawingml/2006/wordprocessingDrawing" xmlns:w10="urn:schemas-microsoft-com:office:word" xmlns:w="http://schemas.openxmlformats.org/wordprocessingml/2006/main" xmlns:w14="http://schemas.microsoft.com/office/word/2010/wordml" xmlns:w15="http://schemas.microsoft.com/office/word/2012/wordml" xmlns:w16cex="http://schemas.microsoft.com/office/word/2018/wordml/cex" xmlns:w16cid="http://schemas.microsoft.com/office/word/2016/wordml/cid" xmlns:w16="http://schemas.microsoft.com/office/word/2018/wordml" xmlns:w16sdtdh="http://schemas.microsoft.com/office/word/2020/wordml/sdtdatahash" xmlns:w16se="http://schemas.microsoft.com/office/word/2015/wordml/symex" xmlns:wpg="http://schemas.microsoft.com/office/word/2010/wordprocessingGroup" xmlns:wpi="http://schemas.microsoft.com/office/word/2010/wordprocessingInk" xmlns:wne="http://schemas.microsoft.com/office/word/2006/wordml" xmlns:wps="http://schemas.microsoft.com/office/word/2010/wordprocessingShape" mc:Ignorable="w14 w15 w16se w16cid w16 w16cex w16sdtdh wp14">
+<w:hdr xmlns:wpc="http://schemas.microsoft.com/office/word/2010/wordprocessingCanvas" xmlns:cx="http://schemas.microsoft.com/office/drawing/2014/chartex" xmlns:cx1="http://schemas.microsoft.com/office/drawing/2015/9/8/chartex" xmlns:cx2="http://schemas.microsoft.com/office/drawing/2015/10/21/chartex" xmlns:cx3="http://schemas.microsoft.com/office/drawing/2016/5/9/chartex" xmlns:cx4="http://schemas.microsoft.com/office/drawing/2016/5/10/chartex" xmlns:cx5="http://schemas.microsoft.com/office/drawing/2016/5/11/chartex" xmlns:cx6="http://schemas.microsoft.com/office/drawing/2016/5/12/chartex" xmlns:cx7="http://schemas.microsoft.com/office/drawing/2016/5/13/chartex" xmlns:cx8="http://schemas.microsoft.com/office/drawing/2016/5/14/chartex" xmlns:mc="http://schemas.openxmlformats.org/markup-compatibility/2006" xmlns:aink="http://schemas.microsoft.com/office/drawing/2016/ink" xmlns:am3d="http://schemas.microsoft.com/office/drawing/2017/model3d" xmlns:o="urn:schemas-microsoft-com:office:office" xmlns:oel="http://schemas.microsoft.com/office/2019/extlst" xmlns:r="http://schemas.openxmlformats.org/officeDocument/2006/relationships" xmlns:m="http://schemas.openxmlformats.org/officeDocument/2006/math" xmlns:v="urn:schemas-microsoft-com:vml" xmlns:wp14="http://schemas.microsoft.com/office/word/2010/wordprocessingDrawing" xmlns:wp="http://schemas.openxmlformats.org/drawingml/2006/wordprocessingDrawing" xmlns:w10="urn:schemas-microsoft-com:office:word" xmlns:w="http://schemas.openxmlformats.org/wordprocessingml/2006/main" xmlns:w14="http://schemas.microsoft.com/office/word/2010/wordml" xmlns:w15="http://schemas.microsoft.com/office/word/2012/wordml" xmlns:w16cex="http://schemas.microsoft.com/office/word/2018/wordml/cex" xmlns:w16cid="http://schemas.microsoft.com/office/word/2016/wordml/cid" xmlns:w16="http://schemas.microsoft.com/office/word/2018/wordml" xmlns:w16du="http://schemas.microsoft.com/office/word/2023/wordml/word16du" xmlns:w16sdtdh="http://schemas.microsoft.com/office/word/2020/wordml/sdtdatahash" xmlns:w16sdtfl="http://schemas.microsoft.com/office/word/2024/wordml/sdtformatlock" xmlns:w16se="http://schemas.microsoft.com/office/word/2015/wordml/symex" xmlns:wpg="http://schemas.microsoft.com/office/word/2010/wordprocessingGroup" xmlns:wpi="http://schemas.microsoft.com/office/word/2010/wordprocessingInk" xmlns:wne="http://schemas.microsoft.com/office/word/2006/wordml" xmlns:wps="http://schemas.microsoft.com/office/word/2010/wordprocessingShape" mc:Ignorable="w14 w15 w16se w16cid w16 w16cex w16sdtdh w16sdtfl w16du wp14">
   <w:p>
     <w:pPr>
       <w:pStyle w:val="Header"/>
@@ -14580,7 +14576,7 @@
 </file>
 
 <file path=word/numbering.xml><?xml version="1.0" encoding="utf-8"?>
-<w:numbering xmlns:wpc="http://schemas.microsoft.com/office/word/2010/wordprocessingCanvas" xmlns:cx="http://schemas.microsoft.com/office/drawing/2014/chartex" xmlns:cx1="http://schemas.microsoft.com/office/drawing/2015/9/8/chartex" xmlns:cx2="http://schemas.microsoft.com/office/drawing/2015/10/21/chartex" xmlns:cx3="http://schemas.microsoft.com/office/drawing/2016/5/9/chartex" xmlns:cx4="http://schemas.microsoft.com/office/drawing/2016/5/10/chartex" xmlns:cx5="http://schemas.microsoft.com/office/drawing/2016/5/11/chartex" xmlns:cx6="http://schemas.microsoft.com/office/drawing/2016/5/12/chartex" xmlns:cx7="http://schemas.microsoft.com/office/drawing/2016/5/13/chartex" xmlns:cx8="http://schemas.microsoft.com/office/drawing/2016/5/14/chartex" xmlns:mc="http://schemas.openxmlformats.org/markup-compatibility/2006" xmlns:aink="http://schemas.microsoft.com/office/drawing/2016/ink" xmlns:am3d="http://schemas.microsoft.com/office/drawing/2017/model3d" xmlns:o="urn:schemas-microsoft-com:office:office" xmlns:oel="http://schemas.microsoft.com/office/2019/extlst" xmlns:r="http://schemas.openxmlformats.org/officeDocument/2006/relationships" xmlns:m="http://schemas.openxmlformats.org/officeDocument/2006/math" xmlns:v="urn:schemas-microsoft-com:vml" xmlns:wp14="http://schemas.microsoft.com/office/word/2010/wordprocessingDrawing" xmlns:wp="http://schemas.openxmlformats.org/drawingml/2006/wordprocessingDrawing" xmlns:w10="urn:schemas-microsoft-com:office:word" xmlns:w="http://schemas.openxmlformats.org/wordprocessingml/2006/main" xmlns:w14="http://schemas.microsoft.com/office/word/2010/wordml" xmlns:w15="http://schemas.microsoft.com/office/word/2012/wordml" xmlns:w16cex="http://schemas.microsoft.com/office/word/2018/wordml/cex" xmlns:w16cid="http://schemas.microsoft.com/office/word/2016/wordml/cid" xmlns:w16="http://schemas.microsoft.com/office/word/2018/wordml" xmlns:w16sdtdh="http://schemas.microsoft.com/office/word/2020/wordml/sdtdatahash" xmlns:w16se="http://schemas.microsoft.com/office/word/2015/wordml/symex" xmlns:wpg="http://schemas.microsoft.com/office/word/2010/wordprocessingGroup" xmlns:wpi="http://schemas.microsoft.com/office/word/2010/wordprocessingInk" xmlns:wne="http://schemas.microsoft.com/office/word/2006/wordml" xmlns:wps="http://schemas.microsoft.com/office/word/2010/wordprocessingShape" mc:Ignorable="w14 w15 w16se w16cid w16 w16cex w16sdtdh wp14">
+<w:numbering xmlns:wpc="http://schemas.microsoft.com/office/word/2010/wordprocessingCanvas" xmlns:cx="http://schemas.microsoft.com/office/drawing/2014/chartex" xmlns:cx1="http://schemas.microsoft.com/office/drawing/2015/9/8/chartex" xmlns:cx2="http://schemas.microsoft.com/office/drawing/2015/10/21/chartex" xmlns:cx3="http://schemas.microsoft.com/office/drawing/2016/5/9/chartex" xmlns:cx4="http://schemas.microsoft.com/office/drawing/2016/5/10/chartex" xmlns:cx5="http://schemas.microsoft.com/office/drawing/2016/5/11/chartex" xmlns:cx6="http://schemas.microsoft.com/office/drawing/2016/5/12/chartex" xmlns:cx7="http://schemas.microsoft.com/office/drawing/2016/5/13/chartex" xmlns:cx8="http://schemas.microsoft.com/office/drawing/2016/5/14/chartex" xmlns:mc="http://schemas.openxmlformats.org/markup-compatibility/2006" xmlns:aink="http://schemas.microsoft.com/office/drawing/2016/ink" xmlns:am3d="http://schemas.microsoft.com/office/drawing/2017/model3d" xmlns:o="urn:schemas-microsoft-com:office:office" xmlns:oel="http://schemas.microsoft.com/office/2019/extlst" xmlns:r="http://schemas.openxmlformats.org/officeDocument/2006/relationships" xmlns:m="http://schemas.openxmlformats.org/officeDocument/2006/math" xmlns:v="urn:schemas-microsoft-com:vml" xmlns:wp14="http://schemas.microsoft.com/office/word/2010/wordprocessingDrawing" xmlns:wp="http://schemas.openxmlformats.org/drawingml/2006/wordprocessingDrawing" xmlns:w10="urn:schemas-microsoft-com:office:word" xmlns:w="http://schemas.openxmlformats.org/wordprocessingml/2006/main" xmlns:w14="http://schemas.microsoft.com/office/word/2010/wordml" xmlns:w15="http://schemas.microsoft.com/office/word/2012/wordml" xmlns:w16cex="http://schemas.microsoft.com/office/word/2018/wordml/cex" xmlns:w16cid="http://schemas.microsoft.com/office/word/2016/wordml/cid" xmlns:w16="http://schemas.microsoft.com/office/word/2018/wordml" xmlns:w16du="http://schemas.microsoft.com/office/word/2023/wordml/word16du" xmlns:w16sdtdh="http://schemas.microsoft.com/office/word/2020/wordml/sdtdatahash" xmlns:w16sdtfl="http://schemas.microsoft.com/office/word/2024/wordml/sdtformatlock" xmlns:w16se="http://schemas.microsoft.com/office/word/2015/wordml/symex" xmlns:wpg="http://schemas.microsoft.com/office/word/2010/wordprocessingGroup" xmlns:wpi="http://schemas.microsoft.com/office/word/2010/wordprocessingInk" xmlns:wne="http://schemas.microsoft.com/office/word/2006/wordml" xmlns:wps="http://schemas.microsoft.com/office/word/2010/wordprocessingShape" mc:Ignorable="w14 w15 w16se w16cid w16 w16cex w16sdtdh w16sdtfl w16du wp14">
   <w:abstractNum w:abstractNumId="0" w15:restartNumberingAfterBreak="0">
     <w:nsid w:val="0D1A55F3"/>
     <w:multiLevelType w:val="hybridMultilevel"/>
@@ -17602,7 +17598,7 @@
 </file>
 
 <file path=word/styles.xml><?xml version="1.0" encoding="utf-8"?>
-<w:styles xmlns:mc="http://schemas.openxmlformats.org/markup-compatibility/2006" xmlns:r="http://schemas.openxmlformats.org/officeDocument/2006/relationships" xmlns:w="http://schemas.openxmlformats.org/wordprocessingml/2006/main" xmlns:w14="http://schemas.microsoft.com/office/word/2010/wordml" xmlns:w15="http://schemas.microsoft.com/office/word/2012/wordml" xmlns:w16cex="http://schemas.microsoft.com/office/word/2018/wordml/cex" xmlns:w16cid="http://schemas.microsoft.com/office/word/2016/wordml/cid" xmlns:w16="http://schemas.microsoft.com/office/word/2018/wordml" xmlns:w16sdtdh="http://schemas.microsoft.com/office/word/2020/wordml/sdtdatahash" xmlns:w16se="http://schemas.microsoft.com/office/word/2015/wordml/symex" mc:Ignorable="w14 w15 w16se w16cid w16 w16cex w16sdtdh">
+<w:styles xmlns:mc="http://schemas.openxmlformats.org/markup-compatibility/2006" xmlns:r="http://schemas.openxmlformats.org/officeDocument/2006/relationships" xmlns:w="http://schemas.openxmlformats.org/wordprocessingml/2006/main" xmlns:w14="http://schemas.microsoft.com/office/word/2010/wordml" xmlns:w15="http://schemas.microsoft.com/office/word/2012/wordml" xmlns:w16cex="http://schemas.microsoft.com/office/word/2018/wordml/cex" xmlns:w16cid="http://schemas.microsoft.com/office/word/2016/wordml/cid" xmlns:w16="http://schemas.microsoft.com/office/word/2018/wordml" xmlns:w16du="http://schemas.microsoft.com/office/word/2023/wordml/word16du" xmlns:w16sdtdh="http://schemas.microsoft.com/office/word/2020/wordml/sdtdatahash" xmlns:w16sdtfl="http://schemas.microsoft.com/office/word/2024/wordml/sdtformatlock" xmlns:w16se="http://schemas.microsoft.com/office/word/2015/wordml/symex" mc:Ignorable="w14 w15 w16se w16cid w16 w16cex w16sdtdh w16sdtfl w16du">
   <w:docDefaults>
     <w:rPrDefault>
       <w:rPr>

</xml_diff>

<commit_message>
reviewed and completed documentation and all neccesary changes to WBS and Gantt Chart files
</commit_message>
<xml_diff>
--- a/Report/zerowaste_business_plan.docx
+++ b/Report/zerowaste_business_plan.docx
@@ -728,8 +728,16 @@
               <w:rPr>
                 <w:rFonts w:eastAsia="Calibri"/>
               </w:rPr>
-              <w:t>Seetha Letchumi</w:t>
-            </w:r>
+              <w:t xml:space="preserve">Sudeep Lal </w:t>
+            </w:r>
+            <w:proofErr w:type="spellStart"/>
+            <w:r>
+              <w:rPr>
+                <w:rFonts w:eastAsia="Calibri"/>
+              </w:rPr>
+              <w:t>Bajimaya</w:t>
+            </w:r>
+            <w:proofErr w:type="spellEnd"/>
           </w:p>
         </w:tc>
         <w:tc>
@@ -4414,7 +4422,23 @@
                 <w:rFonts w:cs="Times New Roman"/>
                 <w:noProof/>
               </w:rPr>
-              <w:t>Appendices</w:t>
+              <w:t>Append</w:t>
+            </w:r>
+            <w:r>
+              <w:rPr>
+                <w:rStyle w:val="Hyperlink"/>
+                <w:rFonts w:cs="Times New Roman"/>
+                <w:noProof/>
+              </w:rPr>
+              <w:t>i</w:t>
+            </w:r>
+            <w:r>
+              <w:rPr>
+                <w:rStyle w:val="Hyperlink"/>
+                <w:rFonts w:cs="Times New Roman"/>
+                <w:noProof/>
+              </w:rPr>
+              <w:t>ces</w:t>
             </w:r>
             <w:r>
               <w:rPr>
@@ -9893,10 +9917,10 @@
           <w:noProof/>
         </w:rPr>
         <w:drawing>
-          <wp:inline distT="0" distB="0" distL="0" distR="0" wp14:anchorId="6E3268EB" wp14:editId="50B16005">
-            <wp:extent cx="5943600" cy="2604041"/>
-            <wp:effectExtent l="0" t="0" r="0" b="6350"/>
-            <wp:docPr id="8" name="Picture 8"/>
+          <wp:inline distT="0" distB="0" distL="0" distR="0" wp14:anchorId="0B94B771" wp14:editId="4CB7028B">
+            <wp:extent cx="5924974" cy="2721786"/>
+            <wp:effectExtent l="0" t="0" r="0" b="2540"/>
+            <wp:docPr id="9" name="Picture 9"/>
             <wp:cNvGraphicFramePr>
               <a:graphicFrameLocks xmlns:a="http://schemas.openxmlformats.org/drawingml/2006/main" noChangeAspect="1"/>
             </wp:cNvGraphicFramePr>
@@ -9904,7 +9928,7 @@
               <a:graphicData uri="http://schemas.openxmlformats.org/drawingml/2006/picture">
                 <pic:pic xmlns:pic="http://schemas.openxmlformats.org/drawingml/2006/picture">
                   <pic:nvPicPr>
-                    <pic:cNvPr id="0" name="Picture 4"/>
+                    <pic:cNvPr id="0" name="Picture 2"/>
                     <pic:cNvPicPr>
                       <a:picLocks noChangeAspect="1" noChangeArrowheads="1"/>
                     </pic:cNvPicPr>
@@ -9925,7 +9949,7 @@
                   <pic:spPr bwMode="auto">
                     <a:xfrm>
                       <a:off x="0" y="0"/>
-                      <a:ext cx="6023347" cy="2638980"/>
+                      <a:ext cx="5992023" cy="2752587"/>
                     </a:xfrm>
                     <a:prstGeom prst="rect">
                       <a:avLst/>
@@ -10111,10 +10135,10 @@
           <w:noProof/>
         </w:rPr>
         <w:drawing>
-          <wp:inline distT="0" distB="0" distL="0" distR="0" wp14:anchorId="3603C2C2" wp14:editId="1F17EF7C">
-            <wp:extent cx="5731510" cy="1924050"/>
-            <wp:effectExtent l="0" t="0" r="2540" b="0"/>
-            <wp:docPr id="480914327" name="Picture 5"/>
+          <wp:inline distT="0" distB="0" distL="0" distR="0" wp14:anchorId="3851B9BF" wp14:editId="4D04D047">
+            <wp:extent cx="5761352" cy="1933654"/>
+            <wp:effectExtent l="0" t="0" r="0" b="0"/>
+            <wp:docPr id="10" name="Picture 10"/>
             <wp:cNvGraphicFramePr>
               <a:graphicFrameLocks xmlns:a="http://schemas.openxmlformats.org/drawingml/2006/main" noChangeAspect="1"/>
             </wp:cNvGraphicFramePr>
@@ -10122,7 +10146,7 @@
               <a:graphicData uri="http://schemas.openxmlformats.org/drawingml/2006/picture">
                 <pic:pic xmlns:pic="http://schemas.openxmlformats.org/drawingml/2006/picture">
                   <pic:nvPicPr>
-                    <pic:cNvPr id="0" name="Picture 1"/>
+                    <pic:cNvPr id="0" name="Picture 3"/>
                     <pic:cNvPicPr>
                       <a:picLocks noChangeAspect="1" noChangeArrowheads="1"/>
                     </pic:cNvPicPr>
@@ -10143,7 +10167,814 @@
                   <pic:spPr bwMode="auto">
                     <a:xfrm>
                       <a:off x="0" y="0"/>
-                      <a:ext cx="5731510" cy="1924050"/>
+                      <a:ext cx="5838393" cy="1959511"/>
+                    </a:xfrm>
+                    <a:prstGeom prst="rect">
+                      <a:avLst/>
+                    </a:prstGeom>
+                    <a:noFill/>
+                  </pic:spPr>
+                </pic:pic>
+              </a:graphicData>
+            </a:graphic>
+          </wp:inline>
+        </w:drawing>
+      </w:r>
+    </w:p>
+    <w:p>
+      <w:pPr>
+        <w:pStyle w:val="Caption"/>
+        <w:jc w:val="center"/>
+        <w:rPr>
+          <w:rFonts w:cs="Times New Roman"/>
+          <w:lang w:val="en-US"/>
+        </w:rPr>
+      </w:pPr>
+      <w:bookmarkStart w:id="27" w:name="_Toc232106249"/>
+      <w:r>
+        <w:rPr>
+          <w:rFonts w:cs="Times New Roman"/>
+        </w:rPr>
+        <w:t xml:space="preserve">Figure </w:t>
+      </w:r>
+      <w:r>
+        <w:rPr>
+          <w:rFonts w:cs="Times New Roman"/>
+        </w:rPr>
+        <w:fldChar w:fldCharType="begin"/>
+      </w:r>
+      <w:r>
+        <w:rPr>
+          <w:rFonts w:cs="Times New Roman"/>
+        </w:rPr>
+        <w:instrText xml:space="preserve"> SEQ Figure \* ARABIC </w:instrText>
+      </w:r>
+      <w:r>
+        <w:rPr>
+          <w:rFonts w:cs="Times New Roman"/>
+        </w:rPr>
+        <w:fldChar w:fldCharType="separate"/>
+      </w:r>
+      <w:r>
+        <w:rPr>
+          <w:rFonts w:cs="Times New Roman"/>
+          <w:noProof/>
+        </w:rPr>
+        <w:t>6</w:t>
+      </w:r>
+      <w:r>
+        <w:rPr>
+          <w:rFonts w:cs="Times New Roman"/>
+        </w:rPr>
+        <w:fldChar w:fldCharType="end"/>
+      </w:r>
+      <w:r>
+        <w:rPr>
+          <w:rFonts w:cs="Times New Roman"/>
+        </w:rPr>
+        <w:t>: Overall WBS Hierarchy</w:t>
+      </w:r>
+      <w:bookmarkEnd w:id="27"/>
+    </w:p>
+    <w:p>
+      <w:pPr>
+        <w:pStyle w:val="Style1"/>
+        <w:rPr>
+          <w:rFonts w:cs="Times New Roman"/>
+        </w:rPr>
+      </w:pPr>
+      <w:bookmarkStart w:id="28" w:name="_Toc232106226"/>
+      <w:r>
+        <w:rPr>
+          <w:rFonts w:cs="Times New Roman"/>
+        </w:rPr>
+        <w:t>5.2 Milestone and Deliverables</w:t>
+      </w:r>
+      <w:bookmarkEnd w:id="28"/>
+    </w:p>
+    <w:p>
+      <w:pPr>
+        <w:spacing w:line="360" w:lineRule="auto"/>
+        <w:jc w:val="both"/>
+        <w:rPr>
+          <w:rFonts w:cs="Times New Roman"/>
+        </w:rPr>
+      </w:pPr>
+      <w:r>
+        <w:rPr>
+          <w:rFonts w:cs="Times New Roman"/>
+        </w:rPr>
+        <w:t>The milestone and deliverables, provides th</w:t>
+      </w:r>
+      <w:r>
+        <w:rPr>
+          <w:rFonts w:cs="Times New Roman"/>
+        </w:rPr>
+        <w:t xml:space="preserve">e fixed </w:t>
+      </w:r>
+      <w:r>
+        <w:rPr>
+          <w:rFonts w:cs="Times New Roman"/>
+        </w:rPr>
+        <w:t>date</w:t>
+      </w:r>
+      <w:r>
+        <w:rPr>
+          <w:rFonts w:cs="Times New Roman"/>
+        </w:rPr>
+        <w:t xml:space="preserve"> for the task to be complete</w:t>
+      </w:r>
+      <w:r>
+        <w:rPr>
+          <w:rFonts w:cs="Times New Roman"/>
+        </w:rPr>
+        <w:t xml:space="preserve">, this </w:t>
+      </w:r>
+      <w:r>
+        <w:rPr>
+          <w:rFonts w:cs="Times New Roman"/>
+        </w:rPr>
+        <w:t xml:space="preserve">helps to determine the </w:t>
+      </w:r>
+      <w:r>
+        <w:rPr>
+          <w:rFonts w:cs="Times New Roman"/>
+        </w:rPr>
+        <w:t>work,</w:t>
+      </w:r>
+      <w:r>
+        <w:rPr>
+          <w:rFonts w:cs="Times New Roman"/>
+        </w:rPr>
+        <w:t xml:space="preserve"> and deliverables are being completed on time</w:t>
+      </w:r>
+      <w:r>
+        <w:rPr>
+          <w:rFonts w:cs="Times New Roman"/>
+        </w:rPr>
+        <w:t>.</w:t>
+      </w:r>
+    </w:p>
+    <w:tbl>
+      <w:tblPr>
+        <w:tblStyle w:val="TableGrid"/>
+        <w:tblW w:w="0" w:type="auto"/>
+        <w:tblLook w:val="04A0" w:firstRow="1" w:lastRow="0" w:firstColumn="1" w:lastColumn="0" w:noHBand="0" w:noVBand="1"/>
+      </w:tblPr>
+      <w:tblGrid>
+        <w:gridCol w:w="715"/>
+        <w:gridCol w:w="3793"/>
+        <w:gridCol w:w="2057"/>
+        <w:gridCol w:w="2451"/>
+      </w:tblGrid>
+      <w:tr>
+        <w:tc>
+          <w:tcPr>
+            <w:tcW w:w="715" w:type="dxa"/>
+          </w:tcPr>
+          <w:p>
+            <w:pPr>
+              <w:spacing w:line="360" w:lineRule="auto"/>
+              <w:jc w:val="both"/>
+              <w:rPr>
+                <w:rFonts w:cs="Times New Roman"/>
+              </w:rPr>
+            </w:pPr>
+            <w:r>
+              <w:rPr>
+                <w:rFonts w:cs="Times New Roman"/>
+              </w:rPr>
+              <w:t>S.no</w:t>
+            </w:r>
+          </w:p>
+        </w:tc>
+        <w:tc>
+          <w:tcPr>
+            <w:tcW w:w="3793" w:type="dxa"/>
+          </w:tcPr>
+          <w:p>
+            <w:pPr>
+              <w:spacing w:line="360" w:lineRule="auto"/>
+              <w:jc w:val="both"/>
+              <w:rPr>
+                <w:rFonts w:cs="Times New Roman"/>
+              </w:rPr>
+            </w:pPr>
+            <w:r>
+              <w:rPr>
+                <w:rFonts w:cs="Times New Roman"/>
+              </w:rPr>
+              <w:t>Milestones</w:t>
+            </w:r>
+          </w:p>
+        </w:tc>
+        <w:tc>
+          <w:tcPr>
+            <w:tcW w:w="2057" w:type="dxa"/>
+          </w:tcPr>
+          <w:p>
+            <w:pPr>
+              <w:spacing w:line="360" w:lineRule="auto"/>
+              <w:jc w:val="both"/>
+              <w:rPr>
+                <w:rFonts w:cs="Times New Roman"/>
+              </w:rPr>
+            </w:pPr>
+            <w:r>
+              <w:rPr>
+                <w:rFonts w:cs="Times New Roman"/>
+              </w:rPr>
+              <w:t>Target Date</w:t>
+            </w:r>
+          </w:p>
+        </w:tc>
+        <w:tc>
+          <w:tcPr>
+            <w:tcW w:w="2451" w:type="dxa"/>
+          </w:tcPr>
+          <w:p>
+            <w:pPr>
+              <w:spacing w:line="360" w:lineRule="auto"/>
+              <w:jc w:val="both"/>
+              <w:rPr>
+                <w:rFonts w:cs="Times New Roman"/>
+              </w:rPr>
+            </w:pPr>
+            <w:r>
+              <w:rPr>
+                <w:rFonts w:cs="Times New Roman"/>
+              </w:rPr>
+              <w:t>Criteria for Completion</w:t>
+            </w:r>
+          </w:p>
+        </w:tc>
+      </w:tr>
+      <w:tr>
+        <w:tc>
+          <w:tcPr>
+            <w:tcW w:w="715" w:type="dxa"/>
+          </w:tcPr>
+          <w:p>
+            <w:pPr>
+              <w:spacing w:line="360" w:lineRule="auto"/>
+              <w:jc w:val="both"/>
+              <w:rPr>
+                <w:rFonts w:cs="Times New Roman"/>
+              </w:rPr>
+            </w:pPr>
+            <w:r>
+              <w:rPr>
+                <w:rFonts w:cs="Times New Roman"/>
+              </w:rPr>
+              <w:t>M1</w:t>
+            </w:r>
+          </w:p>
+        </w:tc>
+        <w:tc>
+          <w:tcPr>
+            <w:tcW w:w="3793" w:type="dxa"/>
+          </w:tcPr>
+          <w:p>
+            <w:pPr>
+              <w:spacing w:line="360" w:lineRule="auto"/>
+              <w:jc w:val="both"/>
+              <w:rPr>
+                <w:rFonts w:cs="Times New Roman"/>
+              </w:rPr>
+            </w:pPr>
+            <w:r>
+              <w:rPr>
+                <w:rFonts w:cs="Times New Roman"/>
+              </w:rPr>
+              <w:t>Project Proposal Submission (Task 1)</w:t>
+            </w:r>
+          </w:p>
+        </w:tc>
+        <w:tc>
+          <w:tcPr>
+            <w:tcW w:w="2057" w:type="dxa"/>
+          </w:tcPr>
+          <w:p>
+            <w:pPr>
+              <w:spacing w:line="360" w:lineRule="auto"/>
+              <w:jc w:val="both"/>
+              <w:rPr>
+                <w:rFonts w:cs="Times New Roman"/>
+              </w:rPr>
+            </w:pPr>
+            <w:r>
+              <w:rPr>
+                <w:rFonts w:cs="Times New Roman"/>
+              </w:rPr>
+              <w:t>12</w:t>
+            </w:r>
+            <w:r>
+              <w:rPr>
+                <w:rFonts w:cs="Times New Roman"/>
+                <w:vertAlign w:val="superscript"/>
+              </w:rPr>
+              <w:t>th</w:t>
+            </w:r>
+            <w:r>
+              <w:rPr>
+                <w:rFonts w:cs="Times New Roman"/>
+              </w:rPr>
+              <w:t xml:space="preserve"> June, 2026</w:t>
+            </w:r>
+          </w:p>
+        </w:tc>
+        <w:tc>
+          <w:tcPr>
+            <w:tcW w:w="2451" w:type="dxa"/>
+          </w:tcPr>
+          <w:p>
+            <w:pPr>
+              <w:spacing w:line="360" w:lineRule="auto"/>
+              <w:jc w:val="both"/>
+              <w:rPr>
+                <w:rFonts w:cs="Times New Roman"/>
+              </w:rPr>
+            </w:pPr>
+            <w:r>
+              <w:rPr>
+                <w:rFonts w:cs="Times New Roman"/>
+              </w:rPr>
+              <w:t xml:space="preserve">Task 1 document submitted on HLMS </w:t>
+            </w:r>
+            <w:r>
+              <w:rPr>
+                <w:rFonts w:cs="Times New Roman"/>
+              </w:rPr>
+              <w:lastRenderedPageBreak/>
+              <w:t>with all required sections completed.</w:t>
+            </w:r>
+          </w:p>
+        </w:tc>
+      </w:tr>
+      <w:tr>
+        <w:tc>
+          <w:tcPr>
+            <w:tcW w:w="715" w:type="dxa"/>
+          </w:tcPr>
+          <w:p>
+            <w:pPr>
+              <w:spacing w:line="360" w:lineRule="auto"/>
+              <w:jc w:val="both"/>
+              <w:rPr>
+                <w:rFonts w:cs="Times New Roman"/>
+              </w:rPr>
+            </w:pPr>
+            <w:r>
+              <w:rPr>
+                <w:rFonts w:cs="Times New Roman"/>
+              </w:rPr>
+              <w:lastRenderedPageBreak/>
+              <w:t>M2</w:t>
+            </w:r>
+          </w:p>
+        </w:tc>
+        <w:tc>
+          <w:tcPr>
+            <w:tcW w:w="3793" w:type="dxa"/>
+          </w:tcPr>
+          <w:p>
+            <w:pPr>
+              <w:spacing w:line="360" w:lineRule="auto"/>
+              <w:jc w:val="both"/>
+              <w:rPr>
+                <w:rFonts w:cs="Times New Roman"/>
+              </w:rPr>
+            </w:pPr>
+            <w:r>
+              <w:rPr>
+                <w:rFonts w:cs="Times New Roman"/>
+              </w:rPr>
+              <w:t xml:space="preserve">Requirement Specification and Design </w:t>
+            </w:r>
+            <w:proofErr w:type="gramStart"/>
+            <w:r>
+              <w:rPr>
+                <w:rFonts w:cs="Times New Roman"/>
+              </w:rPr>
+              <w:t>Submission</w:t>
+            </w:r>
+            <w:r>
+              <w:rPr>
+                <w:rFonts w:cs="Times New Roman"/>
+              </w:rPr>
+              <w:t>(</w:t>
+            </w:r>
+            <w:proofErr w:type="gramEnd"/>
+            <w:r>
+              <w:rPr>
+                <w:rFonts w:cs="Times New Roman"/>
+              </w:rPr>
+              <w:t>Task 2)</w:t>
+            </w:r>
+          </w:p>
+        </w:tc>
+        <w:tc>
+          <w:tcPr>
+            <w:tcW w:w="2057" w:type="dxa"/>
+          </w:tcPr>
+          <w:p>
+            <w:pPr>
+              <w:spacing w:line="360" w:lineRule="auto"/>
+              <w:jc w:val="both"/>
+              <w:rPr>
+                <w:rFonts w:cs="Times New Roman"/>
+              </w:rPr>
+            </w:pPr>
+            <w:r>
+              <w:rPr>
+                <w:rFonts w:cs="Times New Roman"/>
+              </w:rPr>
+              <w:t>25</w:t>
+            </w:r>
+            <w:r>
+              <w:rPr>
+                <w:rFonts w:cs="Times New Roman"/>
+                <w:vertAlign w:val="superscript"/>
+              </w:rPr>
+              <w:t>th</w:t>
+            </w:r>
+            <w:r>
+              <w:rPr>
+                <w:rFonts w:cs="Times New Roman"/>
+              </w:rPr>
+              <w:t xml:space="preserve"> June, 2026</w:t>
+            </w:r>
+          </w:p>
+        </w:tc>
+        <w:tc>
+          <w:tcPr>
+            <w:tcW w:w="2451" w:type="dxa"/>
+          </w:tcPr>
+          <w:p>
+            <w:pPr>
+              <w:spacing w:line="360" w:lineRule="auto"/>
+              <w:jc w:val="both"/>
+              <w:rPr>
+                <w:rFonts w:cs="Times New Roman"/>
+              </w:rPr>
+            </w:pPr>
+            <w:r>
+              <w:rPr>
+                <w:rFonts w:cs="Times New Roman"/>
+              </w:rPr>
+              <w:t xml:space="preserve">Both functional and Non function requirements are met alongside user </w:t>
+            </w:r>
+            <w:proofErr w:type="gramStart"/>
+            <w:r>
+              <w:rPr>
+                <w:rFonts w:cs="Times New Roman"/>
+              </w:rPr>
+              <w:t>stories  &amp;</w:t>
+            </w:r>
+            <w:proofErr w:type="gramEnd"/>
+            <w:r>
+              <w:rPr>
+                <w:rFonts w:cs="Times New Roman"/>
+              </w:rPr>
+              <w:t xml:space="preserve"> Acceptance Criteria and System Designs.</w:t>
+            </w:r>
+          </w:p>
+        </w:tc>
+      </w:tr>
+      <w:tr>
+        <w:tc>
+          <w:tcPr>
+            <w:tcW w:w="715" w:type="dxa"/>
+          </w:tcPr>
+          <w:p>
+            <w:pPr>
+              <w:spacing w:line="360" w:lineRule="auto"/>
+              <w:jc w:val="both"/>
+              <w:rPr>
+                <w:rFonts w:cs="Times New Roman"/>
+              </w:rPr>
+            </w:pPr>
+            <w:r>
+              <w:rPr>
+                <w:rFonts w:cs="Times New Roman"/>
+              </w:rPr>
+              <w:t>M3</w:t>
+            </w:r>
+          </w:p>
+        </w:tc>
+        <w:tc>
+          <w:tcPr>
+            <w:tcW w:w="3793" w:type="dxa"/>
+          </w:tcPr>
+          <w:p>
+            <w:pPr>
+              <w:spacing w:line="360" w:lineRule="auto"/>
+              <w:jc w:val="both"/>
+              <w:rPr>
+                <w:rFonts w:cs="Times New Roman"/>
+              </w:rPr>
+            </w:pPr>
+            <w:r>
+              <w:rPr>
+                <w:rFonts w:cs="Times New Roman"/>
+              </w:rPr>
+              <w:t>Iteration 1 Submission and Presentation</w:t>
+            </w:r>
+          </w:p>
+        </w:tc>
+        <w:tc>
+          <w:tcPr>
+            <w:tcW w:w="2057" w:type="dxa"/>
+          </w:tcPr>
+          <w:p>
+            <w:pPr>
+              <w:spacing w:line="360" w:lineRule="auto"/>
+              <w:jc w:val="both"/>
+              <w:rPr>
+                <w:rFonts w:cs="Times New Roman"/>
+              </w:rPr>
+            </w:pPr>
+            <w:r>
+              <w:rPr>
+                <w:rFonts w:cs="Times New Roman"/>
+              </w:rPr>
+              <w:t>15</w:t>
+            </w:r>
+            <w:r>
+              <w:rPr>
+                <w:rFonts w:cs="Times New Roman"/>
+                <w:vertAlign w:val="superscript"/>
+              </w:rPr>
+              <w:t>th</w:t>
+            </w:r>
+            <w:r>
+              <w:rPr>
+                <w:rFonts w:cs="Times New Roman"/>
+              </w:rPr>
+              <w:t xml:space="preserve"> July</w:t>
+            </w:r>
+            <w:r>
+              <w:rPr>
+                <w:rFonts w:cs="Times New Roman"/>
+              </w:rPr>
+              <w:t>, 2026</w:t>
+            </w:r>
+          </w:p>
+        </w:tc>
+        <w:tc>
+          <w:tcPr>
+            <w:tcW w:w="2451" w:type="dxa"/>
+          </w:tcPr>
+          <w:p>
+            <w:pPr>
+              <w:spacing w:line="360" w:lineRule="auto"/>
+              <w:jc w:val="both"/>
+              <w:rPr>
+                <w:rFonts w:cs="Times New Roman"/>
+              </w:rPr>
+            </w:pPr>
+            <w:r>
+              <w:rPr>
+                <w:rFonts w:cs="Times New Roman"/>
+              </w:rPr>
+              <w:t xml:space="preserve">UC1, UC3, UC5 are completed and tested alongside </w:t>
+            </w:r>
+            <w:r>
+              <w:rPr>
+                <w:rFonts w:cs="Times New Roman"/>
+              </w:rPr>
+              <w:t>GitHub</w:t>
+            </w:r>
+            <w:r>
+              <w:rPr>
+                <w:rFonts w:cs="Times New Roman"/>
+              </w:rPr>
+              <w:t xml:space="preserve"> collaboration.</w:t>
+            </w:r>
+          </w:p>
+        </w:tc>
+      </w:tr>
+      <w:tr>
+        <w:tc>
+          <w:tcPr>
+            <w:tcW w:w="715" w:type="dxa"/>
+          </w:tcPr>
+          <w:p>
+            <w:pPr>
+              <w:spacing w:line="360" w:lineRule="auto"/>
+              <w:jc w:val="both"/>
+              <w:rPr>
+                <w:rFonts w:cs="Times New Roman"/>
+              </w:rPr>
+            </w:pPr>
+            <w:r>
+              <w:rPr>
+                <w:rFonts w:cs="Times New Roman"/>
+              </w:rPr>
+              <w:t>M4</w:t>
+            </w:r>
+          </w:p>
+        </w:tc>
+        <w:tc>
+          <w:tcPr>
+            <w:tcW w:w="3793" w:type="dxa"/>
+          </w:tcPr>
+          <w:p>
+            <w:pPr>
+              <w:spacing w:line="360" w:lineRule="auto"/>
+              <w:jc w:val="both"/>
+              <w:rPr>
+                <w:rFonts w:cs="Times New Roman"/>
+              </w:rPr>
+            </w:pPr>
+            <w:r>
+              <w:rPr>
+                <w:rFonts w:cs="Times New Roman"/>
+              </w:rPr>
+              <w:t xml:space="preserve">Iteration </w:t>
+            </w:r>
+            <w:r>
+              <w:rPr>
+                <w:rFonts w:cs="Times New Roman"/>
+              </w:rPr>
+              <w:t>2</w:t>
+            </w:r>
+            <w:r>
+              <w:rPr>
+                <w:rFonts w:cs="Times New Roman"/>
+              </w:rPr>
+              <w:t xml:space="preserve"> Submission and Presentation</w:t>
+            </w:r>
+          </w:p>
+        </w:tc>
+        <w:tc>
+          <w:tcPr>
+            <w:tcW w:w="2057" w:type="dxa"/>
+          </w:tcPr>
+          <w:p>
+            <w:pPr>
+              <w:spacing w:line="360" w:lineRule="auto"/>
+              <w:jc w:val="both"/>
+              <w:rPr>
+                <w:rFonts w:cs="Times New Roman"/>
+              </w:rPr>
+            </w:pPr>
+            <w:r>
+              <w:rPr>
+                <w:rFonts w:cs="Times New Roman"/>
+              </w:rPr>
+              <w:t>21</w:t>
+            </w:r>
+            <w:r>
+              <w:rPr>
+                <w:rFonts w:cs="Times New Roman"/>
+                <w:vertAlign w:val="superscript"/>
+              </w:rPr>
+              <w:t>st</w:t>
+            </w:r>
+            <w:r>
+              <w:rPr>
+                <w:rFonts w:cs="Times New Roman"/>
+              </w:rPr>
+              <w:t xml:space="preserve"> August, 2026</w:t>
+            </w:r>
+          </w:p>
+        </w:tc>
+        <w:tc>
+          <w:tcPr>
+            <w:tcW w:w="2451" w:type="dxa"/>
+          </w:tcPr>
+          <w:p>
+            <w:pPr>
+              <w:spacing w:line="360" w:lineRule="auto"/>
+              <w:jc w:val="both"/>
+              <w:rPr>
+                <w:rFonts w:cs="Times New Roman"/>
+              </w:rPr>
+            </w:pPr>
+            <w:r>
+              <w:rPr>
+                <w:rFonts w:cs="Times New Roman"/>
+              </w:rPr>
+              <w:t xml:space="preserve">UC2, UC4, UC6 are completed and tested alongside </w:t>
+            </w:r>
+            <w:r>
+              <w:rPr>
+                <w:rFonts w:cs="Times New Roman"/>
+              </w:rPr>
+              <w:t>GitHub</w:t>
+            </w:r>
+            <w:r>
+              <w:rPr>
+                <w:rFonts w:cs="Times New Roman"/>
+              </w:rPr>
+              <w:t xml:space="preserve"> collaboration.</w:t>
+            </w:r>
+          </w:p>
+        </w:tc>
+      </w:tr>
+    </w:tbl>
+    <w:p>
+      <w:pPr>
+        <w:spacing w:line="360" w:lineRule="auto"/>
+        <w:jc w:val="both"/>
+        <w:rPr>
+          <w:rFonts w:cs="Times New Roman"/>
+        </w:rPr>
+      </w:pPr>
+    </w:p>
+    <w:p>
+      <w:pPr>
+        <w:pStyle w:val="Style1"/>
+        <w:rPr>
+          <w:rFonts w:cs="Times New Roman"/>
+        </w:rPr>
+      </w:pPr>
+      <w:bookmarkStart w:id="29" w:name="_Toc232106227"/>
+      <w:r>
+        <w:rPr>
+          <w:rFonts w:cs="Times New Roman"/>
+        </w:rPr>
+        <w:t>5.3 Gantt Char</w:t>
+      </w:r>
+      <w:r>
+        <w:rPr>
+          <w:rFonts w:cs="Times New Roman"/>
+        </w:rPr>
+        <w:t>t</w:t>
+      </w:r>
+      <w:bookmarkEnd w:id="29"/>
+    </w:p>
+    <w:p>
+      <w:pPr>
+        <w:spacing w:line="360" w:lineRule="auto"/>
+        <w:jc w:val="both"/>
+        <w:rPr>
+          <w:rFonts w:cs="Times New Roman"/>
+        </w:rPr>
+      </w:pPr>
+      <w:r>
+        <w:rPr>
+          <w:rFonts w:cs="Times New Roman"/>
+        </w:rPr>
+        <w:t>The Gantt chart below provide a visual timeline of the ZeroWaste project for 12 weeks. It contains resource allocation across team members, and key milestones.</w:t>
+      </w:r>
+      <w:r>
+        <w:rPr>
+          <w:rFonts w:cs="Times New Roman"/>
+        </w:rPr>
+        <w:t xml:space="preserve"> </w:t>
+      </w:r>
+    </w:p>
+    <w:p>
+      <w:pPr>
+        <w:spacing w:line="360" w:lineRule="auto"/>
+        <w:jc w:val="both"/>
+        <w:rPr>
+          <w:rFonts w:cs="Times New Roman"/>
+          <w:lang w:val="en-US"/>
+        </w:rPr>
+      </w:pPr>
+      <w:r>
+        <w:rPr>
+          <w:rFonts w:cs="Times New Roman"/>
+          <w:lang w:val="en-US"/>
+        </w:rPr>
+        <w:lastRenderedPageBreak/>
+        <w:drawing>
+          <wp:inline distT="0" distB="0" distL="0" distR="0" wp14:anchorId="10C90BCA" wp14:editId="02FD8160">
+            <wp:extent cx="5731510" cy="3529965"/>
+            <wp:effectExtent l="0" t="0" r="2540" b="0"/>
+            <wp:docPr id="4" name="Picture 4"/>
+            <wp:cNvGraphicFramePr>
+              <a:graphicFrameLocks xmlns:a="http://schemas.openxmlformats.org/drawingml/2006/main" noChangeAspect="1"/>
+            </wp:cNvGraphicFramePr>
+            <a:graphic xmlns:a="http://schemas.openxmlformats.org/drawingml/2006/main">
+              <a:graphicData uri="http://schemas.openxmlformats.org/drawingml/2006/picture">
+                <pic:pic xmlns:pic="http://schemas.openxmlformats.org/drawingml/2006/picture">
+                  <pic:nvPicPr>
+                    <pic:cNvPr id="0" name="Picture 8"/>
+                    <pic:cNvPicPr>
+                      <a:picLocks noChangeAspect="1" noChangeArrowheads="1"/>
+                    </pic:cNvPicPr>
+                  </pic:nvPicPr>
+                  <pic:blipFill>
+                    <a:blip r:embed="rId22" cstate="print">
+                      <a:extLst>
+                        <a:ext uri="{28A0092B-C50C-407E-A947-70E740481C1C}">
+                          <a14:useLocalDpi xmlns:a14="http://schemas.microsoft.com/office/drawing/2010/main" val="0"/>
+                        </a:ext>
+                      </a:extLst>
+                    </a:blip>
+                    <a:srcRect/>
+                    <a:stretch>
+                      <a:fillRect/>
+                    </a:stretch>
+                  </pic:blipFill>
+                  <pic:spPr bwMode="auto">
+                    <a:xfrm>
+                      <a:off x="0" y="0"/>
+                      <a:ext cx="5731510" cy="3529965"/>
                     </a:xfrm>
                     <a:prstGeom prst="rect">
                       <a:avLst/>
@@ -10162,794 +10993,12 @@
     </w:p>
     <w:p>
       <w:pPr>
-        <w:pStyle w:val="Caption"/>
-        <w:jc w:val="center"/>
-        <w:rPr>
-          <w:rFonts w:cs="Times New Roman"/>
-          <w:lang w:val="en-US"/>
-        </w:rPr>
-      </w:pPr>
-      <w:bookmarkStart w:id="27" w:name="_Toc232106249"/>
-      <w:r>
-        <w:rPr>
-          <w:rFonts w:cs="Times New Roman"/>
-        </w:rPr>
-        <w:t xml:space="preserve">Figure </w:t>
-      </w:r>
-      <w:r>
-        <w:rPr>
-          <w:rFonts w:cs="Times New Roman"/>
-        </w:rPr>
-        <w:fldChar w:fldCharType="begin"/>
-      </w:r>
-      <w:r>
-        <w:rPr>
-          <w:rFonts w:cs="Times New Roman"/>
-        </w:rPr>
-        <w:instrText xml:space="preserve"> SEQ Figure \* ARABIC </w:instrText>
-      </w:r>
-      <w:r>
-        <w:rPr>
-          <w:rFonts w:cs="Times New Roman"/>
-        </w:rPr>
-        <w:fldChar w:fldCharType="separate"/>
-      </w:r>
-      <w:r>
-        <w:rPr>
-          <w:rFonts w:cs="Times New Roman"/>
-          <w:noProof/>
-        </w:rPr>
-        <w:t>6</w:t>
-      </w:r>
-      <w:r>
-        <w:rPr>
-          <w:rFonts w:cs="Times New Roman"/>
-        </w:rPr>
-        <w:fldChar w:fldCharType="end"/>
-      </w:r>
-      <w:r>
-        <w:rPr>
-          <w:rFonts w:cs="Times New Roman"/>
-        </w:rPr>
-        <w:t>: Overall WBS Hierarchy</w:t>
-      </w:r>
-      <w:bookmarkEnd w:id="27"/>
-    </w:p>
-    <w:p>
-      <w:pPr>
-        <w:pStyle w:val="Style1"/>
-        <w:rPr>
-          <w:rFonts w:cs="Times New Roman"/>
-        </w:rPr>
-      </w:pPr>
-      <w:bookmarkStart w:id="28" w:name="_Toc232106226"/>
-      <w:r>
-        <w:rPr>
-          <w:rFonts w:cs="Times New Roman"/>
-        </w:rPr>
-        <w:t>5.2 Milestone and Deliverables</w:t>
-      </w:r>
-      <w:bookmarkEnd w:id="28"/>
-    </w:p>
-    <w:p>
-      <w:pPr>
         <w:spacing w:line="360" w:lineRule="auto"/>
         <w:jc w:val="both"/>
         <w:rPr>
           <w:rFonts w:cs="Times New Roman"/>
         </w:rPr>
       </w:pPr>
-      <w:r>
-        <w:rPr>
-          <w:rFonts w:cs="Times New Roman"/>
-        </w:rPr>
-        <w:t>The milestone and deliverables, provides th</w:t>
-      </w:r>
-      <w:r>
-        <w:rPr>
-          <w:rFonts w:cs="Times New Roman"/>
-        </w:rPr>
-        <w:t xml:space="preserve">e fixed </w:t>
-      </w:r>
-      <w:r>
-        <w:rPr>
-          <w:rFonts w:cs="Times New Roman"/>
-        </w:rPr>
-        <w:t>date</w:t>
-      </w:r>
-      <w:r>
-        <w:rPr>
-          <w:rFonts w:cs="Times New Roman"/>
-        </w:rPr>
-        <w:t xml:space="preserve"> for the task to be complete</w:t>
-      </w:r>
-      <w:r>
-        <w:rPr>
-          <w:rFonts w:cs="Times New Roman"/>
-        </w:rPr>
-        <w:t xml:space="preserve">, this </w:t>
-      </w:r>
-      <w:r>
-        <w:rPr>
-          <w:rFonts w:cs="Times New Roman"/>
-        </w:rPr>
-        <w:t xml:space="preserve">helps to determine the </w:t>
-      </w:r>
-      <w:r>
-        <w:rPr>
-          <w:rFonts w:cs="Times New Roman"/>
-        </w:rPr>
-        <w:t>work,</w:t>
-      </w:r>
-      <w:r>
-        <w:rPr>
-          <w:rFonts w:cs="Times New Roman"/>
-        </w:rPr>
-        <w:t xml:space="preserve"> and deliverables are being completed on time</w:t>
-      </w:r>
-      <w:r>
-        <w:rPr>
-          <w:rFonts w:cs="Times New Roman"/>
-        </w:rPr>
-        <w:t>.</w:t>
-      </w:r>
-    </w:p>
-    <w:tbl>
-      <w:tblPr>
-        <w:tblStyle w:val="TableGrid"/>
-        <w:tblW w:w="0" w:type="auto"/>
-        <w:tblLook w:val="04A0" w:firstRow="1" w:lastRow="0" w:firstColumn="1" w:lastColumn="0" w:noHBand="0" w:noVBand="1"/>
-      </w:tblPr>
-      <w:tblGrid>
-        <w:gridCol w:w="715"/>
-        <w:gridCol w:w="3793"/>
-        <w:gridCol w:w="2057"/>
-        <w:gridCol w:w="2451"/>
-      </w:tblGrid>
-      <w:tr>
-        <w:tc>
-          <w:tcPr>
-            <w:tcW w:w="715" w:type="dxa"/>
-          </w:tcPr>
-          <w:p>
-            <w:pPr>
-              <w:spacing w:line="360" w:lineRule="auto"/>
-              <w:jc w:val="both"/>
-              <w:rPr>
-                <w:rFonts w:cs="Times New Roman"/>
-              </w:rPr>
-            </w:pPr>
-            <w:r>
-              <w:rPr>
-                <w:rFonts w:cs="Times New Roman"/>
-              </w:rPr>
-              <w:t>S.no</w:t>
-            </w:r>
-          </w:p>
-        </w:tc>
-        <w:tc>
-          <w:tcPr>
-            <w:tcW w:w="3793" w:type="dxa"/>
-          </w:tcPr>
-          <w:p>
-            <w:pPr>
-              <w:spacing w:line="360" w:lineRule="auto"/>
-              <w:jc w:val="both"/>
-              <w:rPr>
-                <w:rFonts w:cs="Times New Roman"/>
-              </w:rPr>
-            </w:pPr>
-            <w:r>
-              <w:rPr>
-                <w:rFonts w:cs="Times New Roman"/>
-              </w:rPr>
-              <w:t>Milestones</w:t>
-            </w:r>
-          </w:p>
-        </w:tc>
-        <w:tc>
-          <w:tcPr>
-            <w:tcW w:w="2057" w:type="dxa"/>
-          </w:tcPr>
-          <w:p>
-            <w:pPr>
-              <w:spacing w:line="360" w:lineRule="auto"/>
-              <w:jc w:val="both"/>
-              <w:rPr>
-                <w:rFonts w:cs="Times New Roman"/>
-              </w:rPr>
-            </w:pPr>
-            <w:r>
-              <w:rPr>
-                <w:rFonts w:cs="Times New Roman"/>
-              </w:rPr>
-              <w:t>Target Date</w:t>
-            </w:r>
-          </w:p>
-        </w:tc>
-        <w:tc>
-          <w:tcPr>
-            <w:tcW w:w="2451" w:type="dxa"/>
-          </w:tcPr>
-          <w:p>
-            <w:pPr>
-              <w:spacing w:line="360" w:lineRule="auto"/>
-              <w:jc w:val="both"/>
-              <w:rPr>
-                <w:rFonts w:cs="Times New Roman"/>
-              </w:rPr>
-            </w:pPr>
-            <w:r>
-              <w:rPr>
-                <w:rFonts w:cs="Times New Roman"/>
-              </w:rPr>
-              <w:t>Criteria for Completion</w:t>
-            </w:r>
-          </w:p>
-        </w:tc>
-      </w:tr>
-      <w:tr>
-        <w:tc>
-          <w:tcPr>
-            <w:tcW w:w="715" w:type="dxa"/>
-          </w:tcPr>
-          <w:p>
-            <w:pPr>
-              <w:spacing w:line="360" w:lineRule="auto"/>
-              <w:jc w:val="both"/>
-              <w:rPr>
-                <w:rFonts w:cs="Times New Roman"/>
-              </w:rPr>
-            </w:pPr>
-            <w:r>
-              <w:rPr>
-                <w:rFonts w:cs="Times New Roman"/>
-              </w:rPr>
-              <w:t>M1</w:t>
-            </w:r>
-          </w:p>
-        </w:tc>
-        <w:tc>
-          <w:tcPr>
-            <w:tcW w:w="3793" w:type="dxa"/>
-          </w:tcPr>
-          <w:p>
-            <w:pPr>
-              <w:spacing w:line="360" w:lineRule="auto"/>
-              <w:jc w:val="both"/>
-              <w:rPr>
-                <w:rFonts w:cs="Times New Roman"/>
-              </w:rPr>
-            </w:pPr>
-            <w:r>
-              <w:rPr>
-                <w:rFonts w:cs="Times New Roman"/>
-              </w:rPr>
-              <w:t>Project Proposal Submission (Task 1)</w:t>
-            </w:r>
-          </w:p>
-        </w:tc>
-        <w:tc>
-          <w:tcPr>
-            <w:tcW w:w="2057" w:type="dxa"/>
-          </w:tcPr>
-          <w:p>
-            <w:pPr>
-              <w:spacing w:line="360" w:lineRule="auto"/>
-              <w:jc w:val="both"/>
-              <w:rPr>
-                <w:rFonts w:cs="Times New Roman"/>
-              </w:rPr>
-            </w:pPr>
-            <w:r>
-              <w:rPr>
-                <w:rFonts w:cs="Times New Roman"/>
-              </w:rPr>
-              <w:t>12</w:t>
-            </w:r>
-            <w:r>
-              <w:rPr>
-                <w:rFonts w:cs="Times New Roman"/>
-                <w:vertAlign w:val="superscript"/>
-              </w:rPr>
-              <w:t>th</w:t>
-            </w:r>
-            <w:r>
-              <w:rPr>
-                <w:rFonts w:cs="Times New Roman"/>
-              </w:rPr>
-              <w:t xml:space="preserve"> June, 2026</w:t>
-            </w:r>
-          </w:p>
-        </w:tc>
-        <w:tc>
-          <w:tcPr>
-            <w:tcW w:w="2451" w:type="dxa"/>
-          </w:tcPr>
-          <w:p>
-            <w:pPr>
-              <w:spacing w:line="360" w:lineRule="auto"/>
-              <w:jc w:val="both"/>
-              <w:rPr>
-                <w:rFonts w:cs="Times New Roman"/>
-              </w:rPr>
-            </w:pPr>
-            <w:r>
-              <w:rPr>
-                <w:rFonts w:cs="Times New Roman"/>
-              </w:rPr>
-              <w:t xml:space="preserve">Task 1 document submitted on HLMS </w:t>
-            </w:r>
-            <w:r>
-              <w:rPr>
-                <w:rFonts w:cs="Times New Roman"/>
-              </w:rPr>
-              <w:lastRenderedPageBreak/>
-              <w:t>with all required sections completed.</w:t>
-            </w:r>
-          </w:p>
-        </w:tc>
-      </w:tr>
-      <w:tr>
-        <w:tc>
-          <w:tcPr>
-            <w:tcW w:w="715" w:type="dxa"/>
-          </w:tcPr>
-          <w:p>
-            <w:pPr>
-              <w:spacing w:line="360" w:lineRule="auto"/>
-              <w:jc w:val="both"/>
-              <w:rPr>
-                <w:rFonts w:cs="Times New Roman"/>
-              </w:rPr>
-            </w:pPr>
-            <w:r>
-              <w:rPr>
-                <w:rFonts w:cs="Times New Roman"/>
-              </w:rPr>
-              <w:lastRenderedPageBreak/>
-              <w:t>M2</w:t>
-            </w:r>
-          </w:p>
-        </w:tc>
-        <w:tc>
-          <w:tcPr>
-            <w:tcW w:w="3793" w:type="dxa"/>
-          </w:tcPr>
-          <w:p>
-            <w:pPr>
-              <w:spacing w:line="360" w:lineRule="auto"/>
-              <w:jc w:val="both"/>
-              <w:rPr>
-                <w:rFonts w:cs="Times New Roman"/>
-              </w:rPr>
-            </w:pPr>
-            <w:r>
-              <w:rPr>
-                <w:rFonts w:cs="Times New Roman"/>
-              </w:rPr>
-              <w:t xml:space="preserve">Requirement Specification and Design </w:t>
-            </w:r>
-            <w:proofErr w:type="gramStart"/>
-            <w:r>
-              <w:rPr>
-                <w:rFonts w:cs="Times New Roman"/>
-              </w:rPr>
-              <w:t>Submission</w:t>
-            </w:r>
-            <w:r>
-              <w:rPr>
-                <w:rFonts w:cs="Times New Roman"/>
-              </w:rPr>
-              <w:t>(</w:t>
-            </w:r>
-            <w:proofErr w:type="gramEnd"/>
-            <w:r>
-              <w:rPr>
-                <w:rFonts w:cs="Times New Roman"/>
-              </w:rPr>
-              <w:t>Task 2</w:t>
-            </w:r>
-            <w:r>
-              <w:rPr>
-                <w:rFonts w:cs="Times New Roman"/>
-              </w:rPr>
-              <w:t>)</w:t>
-            </w:r>
-          </w:p>
-        </w:tc>
-        <w:tc>
-          <w:tcPr>
-            <w:tcW w:w="2057" w:type="dxa"/>
-          </w:tcPr>
-          <w:p>
-            <w:pPr>
-              <w:spacing w:line="360" w:lineRule="auto"/>
-              <w:jc w:val="both"/>
-              <w:rPr>
-                <w:rFonts w:cs="Times New Roman"/>
-              </w:rPr>
-            </w:pPr>
-            <w:r>
-              <w:rPr>
-                <w:rFonts w:cs="Times New Roman"/>
-              </w:rPr>
-              <w:t>25</w:t>
-            </w:r>
-            <w:r>
-              <w:rPr>
-                <w:rFonts w:cs="Times New Roman"/>
-                <w:vertAlign w:val="superscript"/>
-              </w:rPr>
-              <w:t>th</w:t>
-            </w:r>
-            <w:r>
-              <w:rPr>
-                <w:rFonts w:cs="Times New Roman"/>
-              </w:rPr>
-              <w:t xml:space="preserve"> June, 2026</w:t>
-            </w:r>
-          </w:p>
-        </w:tc>
-        <w:tc>
-          <w:tcPr>
-            <w:tcW w:w="2451" w:type="dxa"/>
-          </w:tcPr>
-          <w:p>
-            <w:pPr>
-              <w:spacing w:line="360" w:lineRule="auto"/>
-              <w:jc w:val="both"/>
-              <w:rPr>
-                <w:rFonts w:cs="Times New Roman"/>
-              </w:rPr>
-            </w:pPr>
-            <w:r>
-              <w:rPr>
-                <w:rFonts w:cs="Times New Roman"/>
-              </w:rPr>
-              <w:t xml:space="preserve">Both functional and Non function requirements are met alongside user </w:t>
-            </w:r>
-            <w:proofErr w:type="gramStart"/>
-            <w:r>
-              <w:rPr>
-                <w:rFonts w:cs="Times New Roman"/>
-              </w:rPr>
-              <w:t>stories  &amp;</w:t>
-            </w:r>
-            <w:proofErr w:type="gramEnd"/>
-            <w:r>
-              <w:rPr>
-                <w:rFonts w:cs="Times New Roman"/>
-              </w:rPr>
-              <w:t xml:space="preserve"> Acceptance Criteria and System Designs.</w:t>
-            </w:r>
-          </w:p>
-        </w:tc>
-      </w:tr>
-      <w:tr>
-        <w:tc>
-          <w:tcPr>
-            <w:tcW w:w="715" w:type="dxa"/>
-          </w:tcPr>
-          <w:p>
-            <w:pPr>
-              <w:spacing w:line="360" w:lineRule="auto"/>
-              <w:jc w:val="both"/>
-              <w:rPr>
-                <w:rFonts w:cs="Times New Roman"/>
-              </w:rPr>
-            </w:pPr>
-            <w:r>
-              <w:rPr>
-                <w:rFonts w:cs="Times New Roman"/>
-              </w:rPr>
-              <w:t>M3</w:t>
-            </w:r>
-          </w:p>
-        </w:tc>
-        <w:tc>
-          <w:tcPr>
-            <w:tcW w:w="3793" w:type="dxa"/>
-          </w:tcPr>
-          <w:p>
-            <w:pPr>
-              <w:spacing w:line="360" w:lineRule="auto"/>
-              <w:jc w:val="both"/>
-              <w:rPr>
-                <w:rFonts w:cs="Times New Roman"/>
-              </w:rPr>
-            </w:pPr>
-            <w:r>
-              <w:rPr>
-                <w:rFonts w:cs="Times New Roman"/>
-              </w:rPr>
-              <w:t>Iteration 1 Submission and Presentation</w:t>
-            </w:r>
-          </w:p>
-        </w:tc>
-        <w:tc>
-          <w:tcPr>
-            <w:tcW w:w="2057" w:type="dxa"/>
-          </w:tcPr>
-          <w:p>
-            <w:pPr>
-              <w:spacing w:line="360" w:lineRule="auto"/>
-              <w:jc w:val="both"/>
-              <w:rPr>
-                <w:rFonts w:cs="Times New Roman"/>
-              </w:rPr>
-            </w:pPr>
-            <w:r>
-              <w:rPr>
-                <w:rFonts w:cs="Times New Roman"/>
-              </w:rPr>
-              <w:t>15</w:t>
-            </w:r>
-            <w:r>
-              <w:rPr>
-                <w:rFonts w:cs="Times New Roman"/>
-                <w:vertAlign w:val="superscript"/>
-              </w:rPr>
-              <w:t>th</w:t>
-            </w:r>
-            <w:r>
-              <w:rPr>
-                <w:rFonts w:cs="Times New Roman"/>
-              </w:rPr>
-              <w:t xml:space="preserve"> July</w:t>
-            </w:r>
-            <w:r>
-              <w:rPr>
-                <w:rFonts w:cs="Times New Roman"/>
-              </w:rPr>
-              <w:t>, 2026</w:t>
-            </w:r>
-          </w:p>
-        </w:tc>
-        <w:tc>
-          <w:tcPr>
-            <w:tcW w:w="2451" w:type="dxa"/>
-          </w:tcPr>
-          <w:p>
-            <w:pPr>
-              <w:spacing w:line="360" w:lineRule="auto"/>
-              <w:jc w:val="both"/>
-              <w:rPr>
-                <w:rFonts w:cs="Times New Roman"/>
-              </w:rPr>
-            </w:pPr>
-            <w:r>
-              <w:rPr>
-                <w:rFonts w:cs="Times New Roman"/>
-              </w:rPr>
-              <w:t xml:space="preserve">UC1, UC3, UC5 are completed and tested alongside </w:t>
-            </w:r>
-            <w:proofErr w:type="spellStart"/>
-            <w:r>
-              <w:rPr>
-                <w:rFonts w:cs="Times New Roman"/>
-              </w:rPr>
-              <w:t>github</w:t>
-            </w:r>
-            <w:proofErr w:type="spellEnd"/>
-            <w:r>
-              <w:rPr>
-                <w:rFonts w:cs="Times New Roman"/>
-              </w:rPr>
-              <w:t xml:space="preserve"> collaboration.</w:t>
-            </w:r>
-          </w:p>
-        </w:tc>
-      </w:tr>
-      <w:tr>
-        <w:tc>
-          <w:tcPr>
-            <w:tcW w:w="715" w:type="dxa"/>
-          </w:tcPr>
-          <w:p>
-            <w:pPr>
-              <w:spacing w:line="360" w:lineRule="auto"/>
-              <w:jc w:val="both"/>
-              <w:rPr>
-                <w:rFonts w:cs="Times New Roman"/>
-              </w:rPr>
-            </w:pPr>
-            <w:r>
-              <w:rPr>
-                <w:rFonts w:cs="Times New Roman"/>
-              </w:rPr>
-              <w:t>M4</w:t>
-            </w:r>
-          </w:p>
-        </w:tc>
-        <w:tc>
-          <w:tcPr>
-            <w:tcW w:w="3793" w:type="dxa"/>
-          </w:tcPr>
-          <w:p>
-            <w:pPr>
-              <w:spacing w:line="360" w:lineRule="auto"/>
-              <w:jc w:val="both"/>
-              <w:rPr>
-                <w:rFonts w:cs="Times New Roman"/>
-              </w:rPr>
-            </w:pPr>
-            <w:r>
-              <w:rPr>
-                <w:rFonts w:cs="Times New Roman"/>
-              </w:rPr>
-              <w:t xml:space="preserve">Iteration </w:t>
-            </w:r>
-            <w:r>
-              <w:rPr>
-                <w:rFonts w:cs="Times New Roman"/>
-              </w:rPr>
-              <w:t>2</w:t>
-            </w:r>
-            <w:r>
-              <w:rPr>
-                <w:rFonts w:cs="Times New Roman"/>
-              </w:rPr>
-              <w:t xml:space="preserve"> Submission and Presentation</w:t>
-            </w:r>
-          </w:p>
-        </w:tc>
-        <w:tc>
-          <w:tcPr>
-            <w:tcW w:w="2057" w:type="dxa"/>
-          </w:tcPr>
-          <w:p>
-            <w:pPr>
-              <w:spacing w:line="360" w:lineRule="auto"/>
-              <w:jc w:val="both"/>
-              <w:rPr>
-                <w:rFonts w:cs="Times New Roman"/>
-              </w:rPr>
-            </w:pPr>
-            <w:r>
-              <w:rPr>
-                <w:rFonts w:cs="Times New Roman"/>
-              </w:rPr>
-              <w:t>21</w:t>
-            </w:r>
-            <w:r>
-              <w:rPr>
-                <w:rFonts w:cs="Times New Roman"/>
-                <w:vertAlign w:val="superscript"/>
-              </w:rPr>
-              <w:t>st</w:t>
-            </w:r>
-            <w:r>
-              <w:rPr>
-                <w:rFonts w:cs="Times New Roman"/>
-              </w:rPr>
-              <w:t xml:space="preserve"> August, 2026</w:t>
-            </w:r>
-          </w:p>
-        </w:tc>
-        <w:tc>
-          <w:tcPr>
-            <w:tcW w:w="2451" w:type="dxa"/>
-          </w:tcPr>
-          <w:p>
-            <w:pPr>
-              <w:spacing w:line="360" w:lineRule="auto"/>
-              <w:jc w:val="both"/>
-              <w:rPr>
-                <w:rFonts w:cs="Times New Roman"/>
-              </w:rPr>
-            </w:pPr>
-            <w:r>
-              <w:rPr>
-                <w:rFonts w:cs="Times New Roman"/>
-              </w:rPr>
-              <w:t>UC</w:t>
-            </w:r>
-            <w:r>
-              <w:rPr>
-                <w:rFonts w:cs="Times New Roman"/>
-              </w:rPr>
-              <w:t>2</w:t>
-            </w:r>
-            <w:r>
-              <w:rPr>
-                <w:rFonts w:cs="Times New Roman"/>
-              </w:rPr>
-              <w:t>, UC</w:t>
-            </w:r>
-            <w:r>
-              <w:rPr>
-                <w:rFonts w:cs="Times New Roman"/>
-              </w:rPr>
-              <w:t>4</w:t>
-            </w:r>
-            <w:r>
-              <w:rPr>
-                <w:rFonts w:cs="Times New Roman"/>
-              </w:rPr>
-              <w:t>, UC</w:t>
-            </w:r>
-            <w:r>
-              <w:rPr>
-                <w:rFonts w:cs="Times New Roman"/>
-              </w:rPr>
-              <w:t>6</w:t>
-            </w:r>
-            <w:r>
-              <w:rPr>
-                <w:rFonts w:cs="Times New Roman"/>
-              </w:rPr>
-              <w:t xml:space="preserve"> are completed and tested alongside </w:t>
-            </w:r>
-            <w:proofErr w:type="spellStart"/>
-            <w:r>
-              <w:rPr>
-                <w:rFonts w:cs="Times New Roman"/>
-              </w:rPr>
-              <w:t>github</w:t>
-            </w:r>
-            <w:proofErr w:type="spellEnd"/>
-            <w:r>
-              <w:rPr>
-                <w:rFonts w:cs="Times New Roman"/>
-              </w:rPr>
-              <w:t xml:space="preserve"> collaboration.</w:t>
-            </w:r>
-          </w:p>
-        </w:tc>
-      </w:tr>
-    </w:tbl>
-    <w:p>
-      <w:pPr>
-        <w:spacing w:line="360" w:lineRule="auto"/>
-        <w:jc w:val="both"/>
-        <w:rPr>
-          <w:rFonts w:cs="Times New Roman"/>
-        </w:rPr>
-      </w:pPr>
-    </w:p>
-    <w:p>
-      <w:pPr>
-        <w:pStyle w:val="Style1"/>
-        <w:rPr>
-          <w:rFonts w:cs="Times New Roman"/>
-        </w:rPr>
-      </w:pPr>
-      <w:bookmarkStart w:id="29" w:name="_Toc232106227"/>
-      <w:r>
-        <w:rPr>
-          <w:rFonts w:cs="Times New Roman"/>
-        </w:rPr>
-        <w:t>5.3 Gantt Char</w:t>
-      </w:r>
-      <w:r>
-        <w:rPr>
-          <w:rFonts w:cs="Times New Roman"/>
-        </w:rPr>
-        <w:t>t</w:t>
-      </w:r>
-      <w:bookmarkEnd w:id="29"/>
-    </w:p>
-    <w:p>
-      <w:pPr>
-        <w:spacing w:line="360" w:lineRule="auto"/>
-        <w:jc w:val="both"/>
-        <w:rPr>
-          <w:rFonts w:cs="Times New Roman"/>
-        </w:rPr>
-      </w:pPr>
-      <w:r>
-        <w:rPr>
-          <w:rFonts w:cs="Times New Roman"/>
-        </w:rPr>
-        <w:t>The Gantt chart below provide a visual timeline of the ZeroWaste project for 12 weeks. It contains resource allocation across team members, and key milestones.</w:t>
-      </w:r>
-      <w:r>
-        <w:rPr>
-          <w:rFonts w:cs="Times New Roman"/>
-        </w:rPr>
-        <w:t xml:space="preserve"> </w:t>
-      </w:r>
     </w:p>
     <w:p>
       <w:pPr>
@@ -11271,7 +11320,6 @@
               <w:rPr>
                 <w:rFonts w:cs="Times New Roman"/>
               </w:rPr>
-              <w:lastRenderedPageBreak/>
               <w:t>Documentation</w:t>
             </w:r>
           </w:p>
@@ -11351,6 +11399,7 @@
               <w:rPr>
                 <w:rFonts w:cs="Times New Roman"/>
               </w:rPr>
+              <w:lastRenderedPageBreak/>
               <w:t>Modeling and Diagram</w:t>
             </w:r>
           </w:p>
@@ -11877,14 +11926,7 @@
               <w:rPr>
                 <w:rFonts w:cs="Times New Roman"/>
               </w:rPr>
-              <w:t xml:space="preserve">For Team communication, document and resource sharing. Conducting team </w:t>
-            </w:r>
-            <w:r>
-              <w:rPr>
-                <w:rFonts w:cs="Times New Roman"/>
-              </w:rPr>
-              <w:lastRenderedPageBreak/>
-              <w:t>meeting and discussion.</w:t>
+              <w:t>For Team communication, document and resource sharing. Conducting team meeting and discussion.</w:t>
             </w:r>
           </w:p>
         </w:tc>
@@ -11911,7 +11953,6 @@
                 <w:b/>
                 <w:bCs/>
               </w:rPr>
-              <w:lastRenderedPageBreak/>
               <w:t>Framework - Frontend</w:t>
             </w:r>
           </w:p>
@@ -11990,7 +12031,14 @@
               <w:rPr>
                 <w:rFonts w:cs="Times New Roman"/>
               </w:rPr>
-              <w:t xml:space="preserve">Basic building block of any website, Will be used to define every </w:t>
+              <w:t xml:space="preserve">Basic building block of any website, Will be used to define </w:t>
+            </w:r>
+            <w:r>
+              <w:rPr>
+                <w:rFonts w:cs="Times New Roman"/>
+              </w:rPr>
+              <w:lastRenderedPageBreak/>
+              <w:t xml:space="preserve">every </w:t>
             </w:r>
             <w:r>
               <w:rPr>
@@ -12035,6 +12083,7 @@
               <w:rPr>
                 <w:rFonts w:cs="Times New Roman"/>
               </w:rPr>
+              <w:lastRenderedPageBreak/>
               <w:t>Frontend Framework</w:t>
             </w:r>
           </w:p>
@@ -12484,7 +12533,6 @@
               <w:rPr>
                 <w:rFonts w:cs="Times New Roman"/>
               </w:rPr>
-              <w:lastRenderedPageBreak/>
               <w:t>All the images, and data and logins details are stored here in the relational database</w:t>
             </w:r>
           </w:p>
@@ -12512,7 +12560,6 @@
                 <w:b/>
                 <w:bCs/>
               </w:rPr>
-              <w:lastRenderedPageBreak/>
               <w:t xml:space="preserve">Hardware </w:t>
             </w:r>
             <w:r>
@@ -12550,6 +12597,7 @@
               <w:rPr>
                 <w:rFonts w:cs="Times New Roman"/>
               </w:rPr>
+              <w:lastRenderedPageBreak/>
               <w:t>Device 1 specs</w:t>
             </w:r>
             <w:r>
@@ -12696,14 +12744,6 @@
               </w:rPr>
               <w:t>512 SSD</w:t>
             </w:r>
-          </w:p>
-          <w:p>
-            <w:pPr>
-              <w:spacing w:line="360" w:lineRule="auto"/>
-              <w:rPr>
-                <w:rFonts w:cs="Times New Roman"/>
-              </w:rPr>
-            </w:pPr>
           </w:p>
         </w:tc>
       </w:tr>
@@ -14726,32 +14766,9 @@
           <w:szCs w:val="24"/>
         </w:rPr>
       </w:pPr>
-      <w:r>
-        <w:rPr>
-          <w:rFonts w:cs="Times New Roman"/>
-          <w:szCs w:val="24"/>
-        </w:rPr>
-        <w:br w:type="page"/>
-      </w:r>
-    </w:p>
-    <w:p>
-      <w:pPr>
-        <w:pStyle w:val="Main-Heading"/>
-        <w:numPr>
-          <w:ilvl w:val="0"/>
-          <w:numId w:val="0"/>
-        </w:numPr>
-        <w:ind w:left="360"/>
-      </w:pPr>
-      <w:bookmarkStart w:id="36" w:name="_Toc232106233"/>
-      <w:r>
-        <w:lastRenderedPageBreak/>
-        <w:t>Appendices</w:t>
-      </w:r>
-      <w:bookmarkEnd w:id="36"/>
     </w:p>
     <w:sectPr>
-      <w:footerReference w:type="default" r:id="rId22"/>
+      <w:footerReference w:type="default" r:id="rId23"/>
       <w:pgSz w:w="11906" w:h="16838"/>
       <w:pgMar w:top="1440" w:right="1440" w:bottom="1440" w:left="1440" w:header="708" w:footer="708" w:gutter="0"/>
       <w:pgNumType w:start="1"/>

</xml_diff>